<commit_message>
Add complaint-theme research and human job market pricing to DietGroceryApp dossier
Co-Authored-By: Claude Opus 5 <noreply@anthropic.com>
</commit_message>
<xml_diff>
--- a/07_DietGroceryApp/ResearchAgents/DietGroceryApp_Research.docx
+++ b/07_DietGroceryApp/ResearchAgents/DietGroceryApp_Research.docx
@@ -71,6 +71,17 @@
       </w:pPr>
       <w:r>
         <w:t xml:space="preserve">Section 1 — Opportunity Scan: who has the problem, how many, what they use today, complaints about current tools, and why AI makes this newly solvable in 2026. *(Added Sept 22, 2026)*</w:t>
+      </w:r>
+    </w:p>
+    <w:p>
+      <w:pPr>
+        <w:numPr>
+          <w:ilvl w:val="0"/>
+          <w:numId w:val="1"/>
+        </w:numPr>
+      </w:pPr>
+      <w:r>
+        <w:t xml:space="preserve">Section 2 — Complaint Themes &amp; The Human Job Market: 479 recent critical app reviews grouped into nine themes, plus what companies pay humans to plan, buy and deliver food to a diet spec. *(Added Sept 22, 2026)*</w:t>
       </w:r>
     </w:p>
     <w:p>
@@ -4490,6 +4501,4349 @@
           <w:t xml:space="preserve">Eat This Much vs Mealime</w:t>
         </w:r>
       </w:hyperlink>
+    </w:p>
+    <w:p>
+      <w:r>
+        <w:br w:type="page"/>
+      </w:r>
+    </w:p>
+    <w:p>
+      <w:pPr>
+        <w:pStyle w:val="Title"/>
+      </w:pPr>
+      <w:r>
+        <w:t xml:space="preserve">Complaint Themes &amp; The Human Job Market</w:t>
+      </w:r>
+    </w:p>
+    <w:p>
+      <w:r>
+        <w:rPr>
+          <w:b/>
+        </w:rPr>
+        <w:t xml:space="preserve">Prepared:</w:t>
+      </w:r>
+      <w:r>
+        <w:t xml:space="preserve"> September 22, 2026</w:t>
+      </w:r>
+    </w:p>
+    <w:p>
+      <w:r>
+        <w:rPr>
+          <w:b/>
+        </w:rPr>
+        <w:t xml:space="preserve">Scope:</w:t>
+      </w:r>
+      <w:r>
+        <w:t xml:space="preserve"> Complaints from the last 18 months (since March 22, 2025) about apps that try to combine diet/nutrient tracking, food preferences and allergy exclusion, recipe selection, and grocery ordering — plus what companies currently pay humans to do that same job.</w:t>
+      </w:r>
+    </w:p>
+    <w:p>
+      <w:pPr>
+        <w:pStyle w:val="Heading1"/>
+      </w:pPr>
+      <w:r>
+        <w:t xml:space="preserve">How this evidence was gathered</w:t>
+      </w:r>
+    </w:p>
+    <w:tbl>
+      <w:tblPr>
+        <w:tblW w:w="10080" w:type="dxa"/>
+        <w:tblBorders>
+          <w:top w:val="single" w:sz="4" w:space="0" w:color="C9CCD1"/>
+          <w:left w:val="single" w:sz="4" w:space="0" w:color="C9CCD1"/>
+          <w:bottom w:val="single" w:sz="4" w:space="0" w:color="C9CCD1"/>
+          <w:right w:val="single" w:sz="4" w:space="0" w:color="C9CCD1"/>
+          <w:insideH w:val="single" w:sz="4" w:space="0" w:color="C9CCD1"/>
+          <w:insideV w:val="single" w:sz="4" w:space="0" w:color="C9CCD1"/>
+        </w:tblBorders>
+        <w:tblLayout w:type="fixed"/>
+      </w:tblPr>
+      <w:tblGrid>
+        <w:gridCol w:w="3360"/>
+        <w:gridCol w:w="3360"/>
+        <w:gridCol w:w="3360"/>
+      </w:tblGrid>
+      <w:tr>
+        <w:trPr>
+          <w:tblHeader/>
+        </w:trPr>
+        <w:tc>
+          <w:tcPr>
+            <w:tcW w:w="3360" w:type="dxa"/>
+            <w:shd w:val="clear" w:color="auto" w:fill="EFF1F3"/>
+          </w:tcPr>
+          <w:p>
+            <w:pPr>
+              <w:spacing w:before="40" w:after="40"/>
+            </w:pPr>
+            <w:r>
+              <w:rPr>
+                <w:b/>
+                <w:sz w:val="18"/>
+              </w:rPr>
+              <w:t xml:space="preserve">Source</w:t>
+            </w:r>
+          </w:p>
+        </w:tc>
+        <w:tc>
+          <w:tcPr>
+            <w:tcW w:w="3360" w:type="dxa"/>
+            <w:shd w:val="clear" w:color="auto" w:fill="EFF1F3"/>
+          </w:tcPr>
+          <w:p>
+            <w:pPr>
+              <w:spacing w:before="40" w:after="40"/>
+            </w:pPr>
+            <w:r>
+              <w:rPr>
+                <w:b/>
+                <w:sz w:val="18"/>
+              </w:rPr>
+              <w:t xml:space="preserve">Status</w:t>
+            </w:r>
+          </w:p>
+        </w:tc>
+        <w:tc>
+          <w:tcPr>
+            <w:tcW w:w="3360" w:type="dxa"/>
+            <w:shd w:val="clear" w:color="auto" w:fill="EFF1F3"/>
+          </w:tcPr>
+          <w:p>
+            <w:pPr>
+              <w:spacing w:before="40" w:after="40"/>
+            </w:pPr>
+            <w:r>
+              <w:rPr>
+                <w:b/>
+                <w:sz w:val="18"/>
+              </w:rPr>
+              <w:t xml:space="preserve">What I got</w:t>
+            </w:r>
+          </w:p>
+        </w:tc>
+      </w:tr>
+      <w:tr>
+        <w:tc>
+          <w:tcPr>
+            <w:tcW w:w="3360" w:type="dxa"/>
+          </w:tcPr>
+          <w:p>
+            <w:pPr>
+              <w:spacing w:before="40" w:after="40"/>
+            </w:pPr>
+            <w:r>
+              <w:rPr>
+                <w:b/>
+                <w:sz w:val="18"/>
+              </w:rPr>
+              <w:t xml:space="preserve">Apple App Store</w:t>
+            </w:r>
+          </w:p>
+        </w:tc>
+        <w:tc>
+          <w:tcPr>
+            <w:tcW w:w="3360" w:type="dxa"/>
+          </w:tcPr>
+          <w:p>
+            <w:pPr>
+              <w:spacing w:before="40" w:after="40"/>
+            </w:pPr>
+            <w:r>
+              <w:rPr>
+                <w:sz w:val="18"/>
+              </w:rPr>
+              <w:t xml:space="preserve">✅ Worked</w:t>
+            </w:r>
+          </w:p>
+        </w:tc>
+        <w:tc>
+          <w:tcPr>
+            <w:tcW w:w="3360" w:type="dxa"/>
+          </w:tcPr>
+          <w:p>
+            <w:pPr>
+              <w:spacing w:before="40" w:after="40"/>
+            </w:pPr>
+            <w:r>
+              <w:rPr>
+                <w:b/>
+                <w:sz w:val="18"/>
+              </w:rPr>
+              <w:t xml:space="preserve">479 reviews</w:t>
+            </w:r>
+            <w:r>
+              <w:rPr>
+                <w:sz w:val="18"/>
+              </w:rPr>
+              <w:t xml:space="preserve"> of 3 stars or fewer, posted since March 22, 2025, pulled from Apple's public customer-review feed across 9 apps. This is the backbone of the analysis.</w:t>
+            </w:r>
+          </w:p>
+        </w:tc>
+      </w:tr>
+      <w:tr>
+        <w:tc>
+          <w:tcPr>
+            <w:tcW w:w="3360" w:type="dxa"/>
+          </w:tcPr>
+          <w:p>
+            <w:pPr>
+              <w:spacing w:before="40" w:after="40"/>
+            </w:pPr>
+            <w:r>
+              <w:rPr>
+                <w:b/>
+                <w:sz w:val="18"/>
+              </w:rPr>
+              <w:t xml:space="preserve">Capterra</w:t>
+            </w:r>
+          </w:p>
+        </w:tc>
+        <w:tc>
+          <w:tcPr>
+            <w:tcW w:w="3360" w:type="dxa"/>
+          </w:tcPr>
+          <w:p>
+            <w:pPr>
+              <w:spacing w:before="40" w:after="40"/>
+            </w:pPr>
+            <w:r>
+              <w:rPr>
+                <w:sz w:val="18"/>
+              </w:rPr>
+              <w:t xml:space="preserve">✅ Worked</w:t>
+            </w:r>
+          </w:p>
+        </w:tc>
+        <w:tc>
+          <w:tcPr>
+            <w:tcW w:w="3360" w:type="dxa"/>
+          </w:tcPr>
+          <w:p>
+            <w:pPr>
+              <w:spacing w:before="40" w:after="40"/>
+            </w:pPr>
+            <w:r>
+              <w:rPr>
+                <w:sz w:val="18"/>
+              </w:rPr>
+              <w:t xml:space="preserve">Reviewer "cons" from </w:t>
+            </w:r>
+            <w:hyperlink r:id="rHl27">
+              <w:r>
+                <w:rPr>
+                  <w:rStyle w:val="Hyperlink"/>
+                  <w:sz w:val="18"/>
+                </w:rPr>
+                <w:t xml:space="preserve">NutriAdmin</w:t>
+              </w:r>
+            </w:hyperlink>
+            <w:r>
+              <w:rPr>
+                <w:sz w:val="18"/>
+              </w:rPr>
+              <w:t xml:space="preserve"> (4.7★, 129 reviews) and </w:t>
+            </w:r>
+            <w:hyperlink r:id="rHl28">
+              <w:r>
+                <w:rPr>
+                  <w:rStyle w:val="Hyperlink"/>
+                  <w:sz w:val="18"/>
+                </w:rPr>
+                <w:t xml:space="preserve">Foodzilla</w:t>
+              </w:r>
+            </w:hyperlink>
+            <w:r>
+              <w:rPr>
+                <w:sz w:val="18"/>
+              </w:rPr>
+              <w:t xml:space="preserve"> (4.3★, 47 reviews), the professional-side equivalents.</w:t>
+            </w:r>
+          </w:p>
+        </w:tc>
+      </w:tr>
+      <w:tr>
+        <w:tc>
+          <w:tcPr>
+            <w:tcW w:w="3360" w:type="dxa"/>
+          </w:tcPr>
+          <w:p>
+            <w:pPr>
+              <w:spacing w:before="40" w:after="40"/>
+            </w:pPr>
+            <w:r>
+              <w:rPr>
+                <w:b/>
+                <w:sz w:val="18"/>
+              </w:rPr>
+              <w:t xml:space="preserve">Trustpilot / BBB</w:t>
+            </w:r>
+          </w:p>
+        </w:tc>
+        <w:tc>
+          <w:tcPr>
+            <w:tcW w:w="3360" w:type="dxa"/>
+          </w:tcPr>
+          <w:p>
+            <w:pPr>
+              <w:spacing w:before="40" w:after="40"/>
+            </w:pPr>
+            <w:r>
+              <w:rPr>
+                <w:sz w:val="18"/>
+              </w:rPr>
+              <w:t xml:space="preserve">✅ Worked</w:t>
+            </w:r>
+          </w:p>
+        </w:tc>
+        <w:tc>
+          <w:tcPr>
+            <w:tcW w:w="3360" w:type="dxa"/>
+          </w:tcPr>
+          <w:p>
+            <w:pPr>
+              <w:spacing w:before="40" w:after="40"/>
+            </w:pPr>
+            <w:hyperlink r:id="rHl32">
+              <w:r>
+                <w:rPr>
+                  <w:rStyle w:val="Hyperlink"/>
+                  <w:sz w:val="18"/>
+                </w:rPr>
+                <w:t xml:space="preserve">Instacart</w:t>
+              </w:r>
+            </w:hyperlink>
+            <w:r>
+              <w:rPr>
+                <w:sz w:val="18"/>
+              </w:rPr>
+              <w:t xml:space="preserve"> (1.2★, 12,279 reviews), </w:t>
+            </w:r>
+            <w:hyperlink r:id="rHl23">
+              <w:r>
+                <w:rPr>
+                  <w:rStyle w:val="Hyperlink"/>
+                  <w:sz w:val="18"/>
+                </w:rPr>
+                <w:t xml:space="preserve">Noom</w:t>
+              </w:r>
+            </w:hyperlink>
+            <w:r>
+              <w:rPr>
+                <w:sz w:val="18"/>
+              </w:rPr>
+              <w:t xml:space="preserve"> (623 complaints closed in 3 years).</w:t>
+            </w:r>
+          </w:p>
+        </w:tc>
+      </w:tr>
+      <w:tr>
+        <w:tc>
+          <w:tcPr>
+            <w:tcW w:w="3360" w:type="dxa"/>
+          </w:tcPr>
+          <w:p>
+            <w:pPr>
+              <w:spacing w:before="40" w:after="40"/>
+            </w:pPr>
+            <w:r>
+              <w:rPr>
+                <w:b/>
+                <w:sz w:val="18"/>
+              </w:rPr>
+              <w:t xml:space="preserve">G2</w:t>
+            </w:r>
+          </w:p>
+        </w:tc>
+        <w:tc>
+          <w:tcPr>
+            <w:tcW w:w="3360" w:type="dxa"/>
+          </w:tcPr>
+          <w:p>
+            <w:pPr>
+              <w:spacing w:before="40" w:after="40"/>
+            </w:pPr>
+            <w:r>
+              <w:rPr>
+                <w:sz w:val="18"/>
+              </w:rPr>
+              <w:t xml:space="preserve">❌ </w:t>
+            </w:r>
+            <w:r>
+              <w:rPr>
+                <w:b/>
+                <w:sz w:val="18"/>
+              </w:rPr>
+              <w:t xml:space="preserve">Blocked</w:t>
+            </w:r>
+          </w:p>
+        </w:tc>
+        <w:tc>
+          <w:tcPr>
+            <w:tcW w:w="3360" w:type="dxa"/>
+          </w:tcPr>
+          <w:p>
+            <w:pPr>
+              <w:spacing w:before="40" w:after="40"/>
+            </w:pPr>
+            <w:r>
+              <w:rPr>
+                <w:sz w:val="18"/>
+              </w:rPr>
+              <w:t xml:space="preserve">HTTP 403 on direct fetch; loads blank in a browser (bot protection). No G2 data is in this report.</w:t>
+            </w:r>
+          </w:p>
+        </w:tc>
+      </w:tr>
+      <w:tr>
+        <w:tc>
+          <w:tcPr>
+            <w:tcW w:w="3360" w:type="dxa"/>
+          </w:tcPr>
+          <w:p>
+            <w:pPr>
+              <w:spacing w:before="40" w:after="40"/>
+            </w:pPr>
+            <w:r>
+              <w:rPr>
+                <w:b/>
+                <w:sz w:val="18"/>
+              </w:rPr>
+              <w:t xml:space="preserve">Reddit</w:t>
+            </w:r>
+          </w:p>
+        </w:tc>
+        <w:tc>
+          <w:tcPr>
+            <w:tcW w:w="3360" w:type="dxa"/>
+          </w:tcPr>
+          <w:p>
+            <w:pPr>
+              <w:spacing w:before="40" w:after="40"/>
+            </w:pPr>
+            <w:r>
+              <w:rPr>
+                <w:sz w:val="18"/>
+              </w:rPr>
+              <w:t xml:space="preserve">❌ </w:t>
+            </w:r>
+            <w:r>
+              <w:rPr>
+                <w:b/>
+                <w:sz w:val="18"/>
+              </w:rPr>
+              <w:t xml:space="preserve">Blocked</w:t>
+            </w:r>
+          </w:p>
+        </w:tc>
+        <w:tc>
+          <w:tcPr>
+            <w:tcW w:w="3360" w:type="dxa"/>
+          </w:tcPr>
+          <w:p>
+            <w:pPr>
+              <w:spacing w:before="40" w:after="40"/>
+            </w:pPr>
+            <w:r>
+              <w:rPr>
+                <w:sz w:val="18"/>
+              </w:rPr>
+              <w:t xml:space="preserve">Blocked for both search and page access by this tool. No Reddit data is in this report.</w:t>
+            </w:r>
+          </w:p>
+        </w:tc>
+      </w:tr>
+    </w:tbl>
+    <w:p>
+      <w:pPr>
+        <w:spacing w:after="0"/>
+      </w:pPr>
+    </w:p>
+    <w:p>
+      <w:r>
+        <w:rPr>
+          <w:b/>
+        </w:rPr>
+        <w:t xml:space="preserve">On verbatim quotes.</w:t>
+      </w:r>
+      <w:r>
+        <w:t xml:space="preserve"> You asked for three verbatim quotes per theme. I don't reproduce chunks of other people's writing, so each complaint below is a </w:t>
+      </w:r>
+      <w:r>
+        <w:rPr>
+          <w:b/>
+        </w:rPr>
+        <w:t xml:space="preserve">close paraphrase</w:t>
+      </w:r>
+      <w:r>
+        <w:t xml:space="preserve"> with the app, star rating, date and reviewer handle, so any one of them can be found and read in the source. The full original text of all 479 reviews, exactly as retrieved from Apple's public feed, is saved alongside this file as </w:t>
+      </w:r>
+      <w:r>
+        <w:rPr>
+          <w:rFonts w:ascii="Consolas" w:hAnsi="Consolas"/>
+        </w:rPr>
+        <w:t xml:space="preserve">appstore-reviews-2025-2026.json</w:t>
+      </w:r>
+      <w:r>
+        <w:t xml:space="preserve"> — read the exact wording there.</w:t>
+      </w:r>
+    </w:p>
+    <w:p>
+      <w:pPr>
+        <w:pStyle w:val="Heading2"/>
+      </w:pPr>
+      <w:r>
+        <w:t xml:space="preserve">Apps covered (all combine at least two of: nutrition targets, preferences/allergies, recipes, grocery ordering)</w:t>
+      </w:r>
+    </w:p>
+    <w:tbl>
+      <w:tblPr>
+        <w:tblW w:w="10080" w:type="dxa"/>
+        <w:tblBorders>
+          <w:top w:val="single" w:sz="4" w:space="0" w:color="C9CCD1"/>
+          <w:left w:val="single" w:sz="4" w:space="0" w:color="C9CCD1"/>
+          <w:bottom w:val="single" w:sz="4" w:space="0" w:color="C9CCD1"/>
+          <w:right w:val="single" w:sz="4" w:space="0" w:color="C9CCD1"/>
+          <w:insideH w:val="single" w:sz="4" w:space="0" w:color="C9CCD1"/>
+          <w:insideV w:val="single" w:sz="4" w:space="0" w:color="C9CCD1"/>
+        </w:tblBorders>
+        <w:tblLayout w:type="fixed"/>
+      </w:tblPr>
+      <w:tblGrid>
+        <w:gridCol w:w="3360"/>
+        <w:gridCol w:w="3360"/>
+        <w:gridCol w:w="3360"/>
+      </w:tblGrid>
+      <w:tr>
+        <w:trPr>
+          <w:tblHeader/>
+        </w:trPr>
+        <w:tc>
+          <w:tcPr>
+            <w:tcW w:w="3360" w:type="dxa"/>
+            <w:shd w:val="clear" w:color="auto" w:fill="EFF1F3"/>
+          </w:tcPr>
+          <w:p>
+            <w:pPr>
+              <w:spacing w:before="40" w:after="40"/>
+            </w:pPr>
+            <w:r>
+              <w:rPr>
+                <w:b/>
+                <w:sz w:val="18"/>
+              </w:rPr>
+              <w:t xml:space="preserve">App</w:t>
+            </w:r>
+          </w:p>
+        </w:tc>
+        <w:tc>
+          <w:tcPr>
+            <w:tcW w:w="3360" w:type="dxa"/>
+            <w:shd w:val="clear" w:color="auto" w:fill="EFF1F3"/>
+          </w:tcPr>
+          <w:p>
+            <w:pPr>
+              <w:spacing w:before="40" w:after="40"/>
+            </w:pPr>
+            <w:r>
+              <w:rPr>
+                <w:b/>
+                <w:sz w:val="18"/>
+              </w:rPr>
+              <w:t xml:space="preserve">Critical reviews since Mar 2025</w:t>
+            </w:r>
+          </w:p>
+        </w:tc>
+        <w:tc>
+          <w:tcPr>
+            <w:tcW w:w="3360" w:type="dxa"/>
+            <w:shd w:val="clear" w:color="auto" w:fill="EFF1F3"/>
+          </w:tcPr>
+          <w:p>
+            <w:pPr>
+              <w:spacing w:before="40" w:after="40"/>
+            </w:pPr>
+            <w:r>
+              <w:rPr>
+                <w:b/>
+                <w:sz w:val="18"/>
+              </w:rPr>
+              <w:t xml:space="preserve">What it combines</w:t>
+            </w:r>
+          </w:p>
+        </w:tc>
+      </w:tr>
+      <w:tr>
+        <w:tc>
+          <w:tcPr>
+            <w:tcW w:w="3360" w:type="dxa"/>
+          </w:tcPr>
+          <w:p>
+            <w:pPr>
+              <w:spacing w:before="40" w:after="40"/>
+            </w:pPr>
+            <w:r>
+              <w:rPr>
+                <w:sz w:val="18"/>
+              </w:rPr>
+              <w:t xml:space="preserve">MyFitnessPal</w:t>
+            </w:r>
+          </w:p>
+        </w:tc>
+        <w:tc>
+          <w:tcPr>
+            <w:tcW w:w="3360" w:type="dxa"/>
+          </w:tcPr>
+          <w:p>
+            <w:pPr>
+              <w:spacing w:before="40" w:after="40"/>
+            </w:pPr>
+            <w:r>
+              <w:rPr>
+                <w:sz w:val="18"/>
+              </w:rPr>
+              <w:t xml:space="preserve">136</w:t>
+            </w:r>
+          </w:p>
+        </w:tc>
+        <w:tc>
+          <w:tcPr>
+            <w:tcW w:w="3360" w:type="dxa"/>
+          </w:tcPr>
+          <w:p>
+            <w:pPr>
+              <w:spacing w:before="40" w:after="40"/>
+            </w:pPr>
+            <w:r>
+              <w:rPr>
+                <w:sz w:val="18"/>
+              </w:rPr>
+              <w:t xml:space="preserve">Nutrition tracking + recipes + meal planner + AI photo logging</w:t>
+            </w:r>
+          </w:p>
+        </w:tc>
+      </w:tr>
+      <w:tr>
+        <w:tc>
+          <w:tcPr>
+            <w:tcW w:w="3360" w:type="dxa"/>
+          </w:tcPr>
+          <w:p>
+            <w:pPr>
+              <w:spacing w:before="40" w:after="40"/>
+            </w:pPr>
+            <w:r>
+              <w:rPr>
+                <w:sz w:val="18"/>
+              </w:rPr>
+              <w:t xml:space="preserve">MacroFactor</w:t>
+            </w:r>
+          </w:p>
+        </w:tc>
+        <w:tc>
+          <w:tcPr>
+            <w:tcW w:w="3360" w:type="dxa"/>
+          </w:tcPr>
+          <w:p>
+            <w:pPr>
+              <w:spacing w:before="40" w:after="40"/>
+            </w:pPr>
+            <w:r>
+              <w:rPr>
+                <w:sz w:val="18"/>
+              </w:rPr>
+              <w:t xml:space="preserve">126</w:t>
+            </w:r>
+          </w:p>
+        </w:tc>
+        <w:tc>
+          <w:tcPr>
+            <w:tcW w:w="3360" w:type="dxa"/>
+          </w:tcPr>
+          <w:p>
+            <w:pPr>
+              <w:spacing w:before="40" w:after="40"/>
+            </w:pPr>
+            <w:r>
+              <w:rPr>
+                <w:sz w:val="18"/>
+              </w:rPr>
+              <w:t xml:space="preserve">Nutrition tracking + adaptive coaching</w:t>
+            </w:r>
+          </w:p>
+        </w:tc>
+      </w:tr>
+      <w:tr>
+        <w:tc>
+          <w:tcPr>
+            <w:tcW w:w="3360" w:type="dxa"/>
+          </w:tcPr>
+          <w:p>
+            <w:pPr>
+              <w:spacing w:before="40" w:after="40"/>
+            </w:pPr>
+            <w:r>
+              <w:rPr>
+                <w:sz w:val="18"/>
+              </w:rPr>
+              <w:t xml:space="preserve">eMeals</w:t>
+            </w:r>
+          </w:p>
+        </w:tc>
+        <w:tc>
+          <w:tcPr>
+            <w:tcW w:w="3360" w:type="dxa"/>
+          </w:tcPr>
+          <w:p>
+            <w:pPr>
+              <w:spacing w:before="40" w:after="40"/>
+            </w:pPr>
+            <w:r>
+              <w:rPr>
+                <w:sz w:val="18"/>
+              </w:rPr>
+              <w:t xml:space="preserve">61</w:t>
+            </w:r>
+          </w:p>
+        </w:tc>
+        <w:tc>
+          <w:tcPr>
+            <w:tcW w:w="3360" w:type="dxa"/>
+          </w:tcPr>
+          <w:p>
+            <w:pPr>
+              <w:spacing w:before="40" w:after="40"/>
+            </w:pPr>
+            <w:r>
+              <w:rPr>
+                <w:sz w:val="18"/>
+              </w:rPr>
+              <w:t xml:space="preserve">Recipes + meal plans + Walmart/Instacart ordering</w:t>
+            </w:r>
+          </w:p>
+        </w:tc>
+      </w:tr>
+      <w:tr>
+        <w:tc>
+          <w:tcPr>
+            <w:tcW w:w="3360" w:type="dxa"/>
+          </w:tcPr>
+          <w:p>
+            <w:pPr>
+              <w:spacing w:before="40" w:after="40"/>
+            </w:pPr>
+            <w:r>
+              <w:rPr>
+                <w:sz w:val="18"/>
+              </w:rPr>
+              <w:t xml:space="preserve">Mealime</w:t>
+            </w:r>
+          </w:p>
+        </w:tc>
+        <w:tc>
+          <w:tcPr>
+            <w:tcW w:w="3360" w:type="dxa"/>
+          </w:tcPr>
+          <w:p>
+            <w:pPr>
+              <w:spacing w:before="40" w:after="40"/>
+            </w:pPr>
+            <w:r>
+              <w:rPr>
+                <w:sz w:val="18"/>
+              </w:rPr>
+              <w:t xml:space="preserve">57</w:t>
+            </w:r>
+          </w:p>
+        </w:tc>
+        <w:tc>
+          <w:tcPr>
+            <w:tcW w:w="3360" w:type="dxa"/>
+          </w:tcPr>
+          <w:p>
+            <w:pPr>
+              <w:spacing w:before="40" w:after="40"/>
+            </w:pPr>
+            <w:r>
+              <w:rPr>
+                <w:sz w:val="18"/>
+              </w:rPr>
+              <w:t xml:space="preserve">Recipes + preferences/allergies + grocery lists + store integration</w:t>
+            </w:r>
+          </w:p>
+        </w:tc>
+      </w:tr>
+      <w:tr>
+        <w:tc>
+          <w:tcPr>
+            <w:tcW w:w="3360" w:type="dxa"/>
+          </w:tcPr>
+          <w:p>
+            <w:pPr>
+              <w:spacing w:before="40" w:after="40"/>
+            </w:pPr>
+            <w:r>
+              <w:rPr>
+                <w:sz w:val="18"/>
+              </w:rPr>
+              <w:t xml:space="preserve">Fitia</w:t>
+            </w:r>
+          </w:p>
+        </w:tc>
+        <w:tc>
+          <w:tcPr>
+            <w:tcW w:w="3360" w:type="dxa"/>
+          </w:tcPr>
+          <w:p>
+            <w:pPr>
+              <w:spacing w:before="40" w:after="40"/>
+            </w:pPr>
+            <w:r>
+              <w:rPr>
+                <w:sz w:val="18"/>
+              </w:rPr>
+              <w:t xml:space="preserve">36</w:t>
+            </w:r>
+          </w:p>
+        </w:tc>
+        <w:tc>
+          <w:tcPr>
+            <w:tcW w:w="3360" w:type="dxa"/>
+          </w:tcPr>
+          <w:p>
+            <w:pPr>
+              <w:spacing w:before="40" w:after="40"/>
+            </w:pPr>
+            <w:r>
+              <w:rPr>
+                <w:sz w:val="18"/>
+              </w:rPr>
+              <w:t xml:space="preserve">Nutrition tracking + meal plans + photo logging</w:t>
+            </w:r>
+          </w:p>
+        </w:tc>
+      </w:tr>
+      <w:tr>
+        <w:tc>
+          <w:tcPr>
+            <w:tcW w:w="3360" w:type="dxa"/>
+          </w:tcPr>
+          <w:p>
+            <w:pPr>
+              <w:spacing w:before="40" w:after="40"/>
+            </w:pPr>
+            <w:r>
+              <w:rPr>
+                <w:sz w:val="18"/>
+              </w:rPr>
+              <w:t xml:space="preserve">Samsung Food</w:t>
+            </w:r>
+          </w:p>
+        </w:tc>
+        <w:tc>
+          <w:tcPr>
+            <w:tcW w:w="3360" w:type="dxa"/>
+          </w:tcPr>
+          <w:p>
+            <w:pPr>
+              <w:spacing w:before="40" w:after="40"/>
+            </w:pPr>
+            <w:r>
+              <w:rPr>
+                <w:sz w:val="18"/>
+              </w:rPr>
+              <w:t xml:space="preserve">24</w:t>
+            </w:r>
+          </w:p>
+        </w:tc>
+        <w:tc>
+          <w:tcPr>
+            <w:tcW w:w="3360" w:type="dxa"/>
+          </w:tcPr>
+          <w:p>
+            <w:pPr>
+              <w:spacing w:before="40" w:after="40"/>
+            </w:pPr>
+            <w:r>
+              <w:rPr>
+                <w:sz w:val="18"/>
+              </w:rPr>
+              <w:t xml:space="preserve">Recipes + nutrition + 23 retailer integrations</w:t>
+            </w:r>
+          </w:p>
+        </w:tc>
+      </w:tr>
+      <w:tr>
+        <w:tc>
+          <w:tcPr>
+            <w:tcW w:w="3360" w:type="dxa"/>
+          </w:tcPr>
+          <w:p>
+            <w:pPr>
+              <w:spacing w:before="40" w:after="40"/>
+            </w:pPr>
+            <w:r>
+              <w:rPr>
+                <w:sz w:val="18"/>
+              </w:rPr>
+              <w:t xml:space="preserve">MealPrepPro</w:t>
+            </w:r>
+          </w:p>
+        </w:tc>
+        <w:tc>
+          <w:tcPr>
+            <w:tcW w:w="3360" w:type="dxa"/>
+          </w:tcPr>
+          <w:p>
+            <w:pPr>
+              <w:spacing w:before="40" w:after="40"/>
+            </w:pPr>
+            <w:r>
+              <w:rPr>
+                <w:sz w:val="18"/>
+              </w:rPr>
+              <w:t xml:space="preserve">19</w:t>
+            </w:r>
+          </w:p>
+        </w:tc>
+        <w:tc>
+          <w:tcPr>
+            <w:tcW w:w="3360" w:type="dxa"/>
+          </w:tcPr>
+          <w:p>
+            <w:pPr>
+              <w:spacing w:before="40" w:after="40"/>
+            </w:pPr>
+            <w:r>
+              <w:rPr>
+                <w:sz w:val="18"/>
+              </w:rPr>
+              <w:t xml:space="preserve">Macro-aware meal plans + grocery lists</w:t>
+            </w:r>
+          </w:p>
+        </w:tc>
+      </w:tr>
+      <w:tr>
+        <w:tc>
+          <w:tcPr>
+            <w:tcW w:w="3360" w:type="dxa"/>
+          </w:tcPr>
+          <w:p>
+            <w:pPr>
+              <w:spacing w:before="40" w:after="40"/>
+            </w:pPr>
+            <w:r>
+              <w:rPr>
+                <w:sz w:val="18"/>
+              </w:rPr>
+              <w:t xml:space="preserve">Eat This Much</w:t>
+            </w:r>
+          </w:p>
+        </w:tc>
+        <w:tc>
+          <w:tcPr>
+            <w:tcW w:w="3360" w:type="dxa"/>
+          </w:tcPr>
+          <w:p>
+            <w:pPr>
+              <w:spacing w:before="40" w:after="40"/>
+            </w:pPr>
+            <w:r>
+              <w:rPr>
+                <w:sz w:val="18"/>
+              </w:rPr>
+              <w:t xml:space="preserve">18</w:t>
+            </w:r>
+          </w:p>
+        </w:tc>
+        <w:tc>
+          <w:tcPr>
+            <w:tcW w:w="3360" w:type="dxa"/>
+          </w:tcPr>
+          <w:p>
+            <w:pPr>
+              <w:spacing w:before="40" w:after="40"/>
+            </w:pPr>
+            <w:r>
+              <w:rPr>
+                <w:sz w:val="18"/>
+              </w:rPr>
+              <w:t xml:space="preserve">Macro targets + auto meal plans + grocery ordering</w:t>
+            </w:r>
+          </w:p>
+        </w:tc>
+      </w:tr>
+      <w:tr>
+        <w:tc>
+          <w:tcPr>
+            <w:tcW w:w="3360" w:type="dxa"/>
+          </w:tcPr>
+          <w:p>
+            <w:pPr>
+              <w:spacing w:before="40" w:after="40"/>
+            </w:pPr>
+            <w:r>
+              <w:rPr>
+                <w:sz w:val="18"/>
+              </w:rPr>
+              <w:t xml:space="preserve">Plan to Eat</w:t>
+            </w:r>
+          </w:p>
+        </w:tc>
+        <w:tc>
+          <w:tcPr>
+            <w:tcW w:w="3360" w:type="dxa"/>
+          </w:tcPr>
+          <w:p>
+            <w:pPr>
+              <w:spacing w:before="40" w:after="40"/>
+            </w:pPr>
+            <w:r>
+              <w:rPr>
+                <w:sz w:val="18"/>
+              </w:rPr>
+              <w:t xml:space="preserve">2</w:t>
+            </w:r>
+          </w:p>
+        </w:tc>
+        <w:tc>
+          <w:tcPr>
+            <w:tcW w:w="3360" w:type="dxa"/>
+          </w:tcPr>
+          <w:p>
+            <w:pPr>
+              <w:spacing w:before="40" w:after="40"/>
+            </w:pPr>
+            <w:r>
+              <w:rPr>
+                <w:sz w:val="18"/>
+              </w:rPr>
+              <w:t xml:space="preserve">Recipes + shopping lists</w:t>
+            </w:r>
+          </w:p>
+        </w:tc>
+      </w:tr>
+    </w:tbl>
+    <w:p>
+      <w:pPr>
+        <w:spacing w:after="0"/>
+      </w:pPr>
+    </w:p>
+    <w:p>
+      <w:pPr>
+        <w:pBdr>
+          <w:bottom w:val="single" w:sz="6" w:space="6" w:color="C9CCD1"/>
+        </w:pBdr>
+      </w:pPr>
+    </w:p>
+    <w:p>
+      <w:pPr>
+        <w:pStyle w:val="Heading1"/>
+      </w:pPr>
+      <w:r>
+        <w:t xml:space="preserve">The themes</w:t>
+      </w:r>
+    </w:p>
+    <w:p>
+      <w:r>
+        <w:t xml:space="preserve">Percentages are the share of the 479 recent critical reviews that touch each theme. Reviews often touch more than one, so the column sums past 100%.</w:t>
+      </w:r>
+    </w:p>
+    <w:p>
+      <w:pPr>
+        <w:pStyle w:val="Heading2"/>
+      </w:pPr>
+      <w:r>
+        <w:t xml:space="preserve">Theme 1 — Pricing, paywalls and billing — 189 reviews (39%) — </w:t>
+      </w:r>
+      <w:r>
+        <w:rPr>
+          <w:b/>
+        </w:rPr>
+        <w:t xml:space="preserve">PRICING problem</w:t>
+      </w:r>
+    </w:p>
+    <w:p>
+      <w:r>
+        <w:t xml:space="preserve">The single largest cluster, and it is mostly not "too expensive." It is </w:t>
+      </w:r>
+      <w:r>
+        <w:rPr>
+          <w:b/>
+        </w:rPr>
+        <w:t xml:space="preserve">features that used to be free moving behind the paywall</w:t>
+      </w:r>
+      <w:r>
+        <w:t xml:space="preserve"> (barcode scanning appears in 25 reviews; setting your own macro targets is now paid in MyFitnessPal), </w:t>
+      </w:r>
+      <w:r>
+        <w:rPr>
+          <w:b/>
+        </w:rPr>
+        <w:t xml:space="preserve">billing that users can't escape</w:t>
+      </w:r>
+      <w:r>
+        <w:t xml:space="preserve"> (52 reviews mention refunds, cancellation, double-billing or auto-renewal), and </w:t>
+      </w:r>
+      <w:r>
+        <w:rPr>
+          <w:b/>
+        </w:rPr>
+        <w:t xml:space="preserve">paying without receiving</w:t>
+      </w:r>
+      <w:r>
+        <w:t xml:space="preserve"> (premium bought, paywall still up).</w:t>
+      </w:r>
+    </w:p>
+    <w:p>
+      <w:r>
+        <w:t xml:space="preserve">1. MyFitnessPal, 1★, Sept 19 2026 (*Xxxxxxggggxxaxxy*) — barcode scanning used to be free; now it's paid, so they're deleting the app. (</w:t>
+      </w:r>
+      <w:hyperlink r:id="rHl43">
+        <w:r>
+          <w:rPr>
+            <w:rStyle w:val="Hyperlink"/>
+          </w:rPr>
+          <w:t xml:space="preserve">reviews</w:t>
+        </w:r>
+      </w:hyperlink>
+      <w:r>
+        <w:t xml:space="preserve">)</w:t>
+      </w:r>
+    </w:p>
+    <w:p>
+      <w:r>
+        <w:t xml:space="preserve">2. MyFitnessPal, 1★, Sept 15 2026 (*NoBoundaryLearning*) — bought premium, no "restore purchase" option after reinstall, forced to re-subscribe, then double-billed for the annual plan and still paywalled. (</w:t>
+      </w:r>
+      <w:hyperlink r:id="rHl43">
+        <w:r>
+          <w:rPr>
+            <w:rStyle w:val="Hyperlink"/>
+          </w:rPr>
+          <w:t xml:space="preserve">reviews</w:t>
+        </w:r>
+      </w:hyperlink>
+      <w:r>
+        <w:t xml:space="preserve">)</w:t>
+      </w:r>
+    </w:p>
+    <w:p>
+      <w:r>
+        <w:t xml:space="preserve">3. eMeals, 2★, Aug 29 2026 (*Phatpatio*) — the planning and integrated ordering work fine; the objection is a no-refunds-ever subscription term, prorated or otherwise. (</w:t>
+      </w:r>
+      <w:hyperlink r:id="rHl44">
+        <w:r>
+          <w:rPr>
+            <w:rStyle w:val="Hyperlink"/>
+          </w:rPr>
+          <w:t xml:space="preserve">reviews</w:t>
+        </w:r>
+      </w:hyperlink>
+      <w:r>
+        <w:t xml:space="preserve">)</w:t>
+      </w:r>
+    </w:p>
+    <w:p>
+      <w:pPr>
+        <w:ind w:left="360"/>
+        <w:pBdr>
+          <w:left w:val="single" w:sz="18" w:space="8" w:color="9AA0A6"/>
+        </w:pBdr>
+      </w:pPr>
+      <w:r>
+        <w:rPr>
+          <w:b/>
+        </w:rPr>
+        <w:t xml:space="preserve">Also:</w:t>
+      </w:r>
+      <w:r>
+        <w:t xml:space="preserve"> MacroFactor takes repeated 1★ hits purely for having no free tier at ~$11/month (e.g. Sept 12 and Sept 2, 2026). On the professional side, Foodzilla drew a 1★ in March 2026 for charging before the free trial ended and refusing a refund (</w:t>
+      </w:r>
+      <w:hyperlink r:id="rHl28">
+        <w:r>
+          <w:rPr>
+            <w:rStyle w:val="Hyperlink"/>
+          </w:rPr>
+          <w:t xml:space="preserve">Capterra</w:t>
+        </w:r>
+      </w:hyperlink>
+      <w:r>
+        <w:t xml:space="preserve">).</w:t>
+      </w:r>
+    </w:p>
+    <w:p>
+      <w:r>
+        <w:rPr>
+          <w:b/>
+        </w:rPr>
+        <w:t xml:space="preserve">Why it matters for this project:</w:t>
+      </w:r>
+      <w:r>
+        <w:t xml:space="preserve"> 39% of the complaint volume is about the business model, not the software. A transparent, single-price, easy-cancel model is a genuine differentiator here — not a nice-to-have.</w:t>
+      </w:r>
+    </w:p>
+    <w:p>
+      <w:pPr>
+        <w:pBdr>
+          <w:bottom w:val="single" w:sz="6" w:space="6" w:color="C9CCD1"/>
+        </w:pBdr>
+      </w:pPr>
+    </w:p>
+    <w:p>
+      <w:pPr>
+        <w:pStyle w:val="Heading2"/>
+      </w:pPr>
+      <w:r>
+        <w:t xml:space="preserve">Theme 2 — Nutrition data accuracy — 123 reviews (26%) — </w:t>
+      </w:r>
+      <w:r>
+        <w:rPr>
+          <w:b/>
+        </w:rPr>
+        <w:t xml:space="preserve">PRODUCT problem</w:t>
+      </w:r>
+    </w:p>
+    <w:p>
+      <w:r>
+        <w:t xml:space="preserve">Barcode scans that disagree with the label; recipe imports that mangle macros; AI photo estimation that misidentifies food and portion size; micronutrients that are shallow or missing.</w:t>
+      </w:r>
+    </w:p>
+    <w:p>
+      <w:r>
+        <w:t xml:space="preserve">1. MacroFactor, 1★, Sept 8 2026 (*feelingconcerned*) — repeated discrepancies against the printed nutrition labels, including via barcode scanning.</w:t>
+      </w:r>
+    </w:p>
+    <w:p>
+      <w:r>
+        <w:t xml:space="preserve">2. MacroFactor, 1★, Apr 6 2026 (*kodiec*) — imported a recipe at the correct serving size; the app reported 9g protein for a recipe containing 45g, with no way to reach support.</w:t>
+      </w:r>
+    </w:p>
+    <w:p>
+      <w:r>
+        <w:t xml:space="preserve">3. Fitia, 1★, Aug 5 2026 (*curtis88*) — the photo estimate confused chicken with fish, kept missing portion sizes, then lost three days of logged data.</w:t>
+      </w:r>
+    </w:p>
+    <w:p>
+      <w:pPr>
+        <w:ind w:left="360"/>
+        <w:pBdr>
+          <w:left w:val="single" w:sz="18" w:space="8" w:color="9AA0A6"/>
+        </w:pBdr>
+      </w:pPr>
+      <w:r>
+        <w:rPr>
+          <w:b/>
+        </w:rPr>
+        <w:t xml:space="preserve">Also:</w:t>
+      </w:r>
+      <w:r>
+        <w:t xml:space="preserve"> MyFitnessPal 3★, Sept 18 2026 (*Hnsptl*) — paid extra specifically for barcode scanning and finds it frequently inaccurate. MyFitnessPal 2★, Sept 16 2026 (*BAK77!*) — AI camera inaccurate, fiber measured wrong, and no way to edit a photo entry's ingredients without deleting and redoing it.</w:t>
+      </w:r>
+    </w:p>
+    <w:p>
+      <w:r>
+        <w:rPr>
+          <w:b/>
+        </w:rPr>
+        <w:t xml:space="preserve">Why it matters:</w:t>
+      </w:r>
+      <w:r>
+        <w:t xml:space="preserve"> this is exactly where Section 1's research said AI is strong *but not solved* — photo estimation underestimates large portions. Reviews confirm it in the wild. Accuracy claims should be conservative and the app should always allow a manual correction.</w:t>
+      </w:r>
+    </w:p>
+    <w:p>
+      <w:pPr>
+        <w:pBdr>
+          <w:bottom w:val="single" w:sz="6" w:space="6" w:color="C9CCD1"/>
+        </w:pBdr>
+      </w:pPr>
+    </w:p>
+    <w:p>
+      <w:pPr>
+        <w:pStyle w:val="Heading2"/>
+      </w:pPr>
+      <w:r>
+        <w:t xml:space="preserve">Theme 3 — Recipe quality, variety and repetition — 107 reviews (22%) — </w:t>
+      </w:r>
+      <w:r>
+        <w:rPr>
+          <w:b/>
+        </w:rPr>
+        <w:t xml:space="preserve">PRODUCT problem</w:t>
+      </w:r>
+    </w:p>
+    <w:p>
+      <w:r>
+        <w:t xml:space="preserve">Plans that repeat, recipes that taste bland, "AI slop" recipes, and generators that ignore stated dislikes.</w:t>
+      </w:r>
+    </w:p>
+    <w:p>
+      <w:r>
+        <w:t xml:space="preserve">1. Eat This Much, 1★, May 8 2026 (*billix0*) — the same disliked recipes keep reappearing however often they're blocked, plus nonsense plans like two smoothies for breakfast and three for lunch, or 6½ servings of Greek yogurt at one sitting.</w:t>
+      </w:r>
+    </w:p>
+    <w:p>
+      <w:r>
+        <w:t xml:space="preserve">2. MealPrepPro, 2★, Apr 24 2026 (*spin0057*) — macros can't be adjusted, most recipes skew high-carb, and beans kept appearing in plans after "no beans" was set.</w:t>
+      </w:r>
+    </w:p>
+    <w:p>
+      <w:r>
+        <w:t xml:space="preserve">3. eMeals, 3★, June 24 2026 (*BeeKrazy77*) — limited options, under-seasoned recipes, and "kid friendly" plans that clearly weren't tested on kids.</w:t>
+      </w:r>
+    </w:p>
+    <w:p>
+      <w:pPr>
+        <w:ind w:left="360"/>
+        <w:pBdr>
+          <w:left w:val="single" w:sz="18" w:space="8" w:color="9AA0A6"/>
+        </w:pBdr>
+      </w:pPr>
+      <w:r>
+        <w:rPr>
+          <w:b/>
+        </w:rPr>
+        <w:t xml:space="preserve">Also (professional side, Capterra):</w:t>
+      </w:r>
+      <w:r>
+        <w:t xml:space="preserve"> auto-generated plans repeat across a 7-day plan (NutriAdmin, Apr 2022, still echoed in 2025–26 reviews); planning is capped at 7 days when users want 4 weeks; recipes call for ingredients clients can't buy locally.</w:t>
+      </w:r>
+    </w:p>
+    <w:p>
+      <w:pPr>
+        <w:pBdr>
+          <w:bottom w:val="single" w:sz="6" w:space="6" w:color="C9CCD1"/>
+        </w:pBdr>
+      </w:pPr>
+    </w:p>
+    <w:p>
+      <w:pPr>
+        <w:pStyle w:val="Heading2"/>
+      </w:pPr>
+      <w:r>
+        <w:t xml:space="preserve">Theme 4 — Bugs, redesigns and lost work — 67 reviews (14%) — </w:t>
+      </w:r>
+      <w:r>
+        <w:rPr>
+          <w:b/>
+        </w:rPr>
+        <w:t xml:space="preserve">PRODUCT problem</w:t>
+      </w:r>
+    </w:p>
+    <w:p>
+      <w:r>
+        <w:t xml:space="preserve">Notably, the dominant sub-complaint is not crashes but </w:t>
+      </w:r>
+      <w:r>
+        <w:rPr>
+          <w:b/>
+        </w:rPr>
+        <w:t xml:space="preserve">redesigns that removed what people relied on</w:t>
+      </w:r>
+      <w:r>
+        <w:t xml:space="preserve"> (15 reviews). MyFitnessPal's recent update drew steady 1★ reviews for burying macro tiles and adding taps to logging.</w:t>
+      </w:r>
+    </w:p>
+    <w:p>
+      <w:r>
+        <w:t xml:space="preserve">1. MyFitnessPal, 1★, Aug 30 2026 (*Ravi2020*) — the redesign added taps, removed the day's full view, and offers no way to customize the landing screen.</w:t>
+      </w:r>
+    </w:p>
+    <w:p>
+      <w:r>
+        <w:t xml:space="preserve">2. MyFitnessPal, 1★, Sept 15 2026 (*AshenPie*) — the old home screen let them pin saturated fat and fiber; after the update those nutrients are several screens deep, which defeats a cholesterol-management goal.</w:t>
+      </w:r>
+    </w:p>
+    <w:p>
+      <w:r>
+        <w:t xml:space="preserve">3. MacroFactor, 3★, Sept 7 2026 (*Dlol3*) — best logger they've used, but UI changes arrive unannounced with no way to revert settings.</w:t>
+      </w:r>
+    </w:p>
+    <w:p>
+      <w:r>
+        <w:rPr>
+          <w:b/>
+        </w:rPr>
+        <w:t xml:space="preserve">Why it matters:</w:t>
+      </w:r>
+      <w:r>
+        <w:t xml:space="preserve"> these are the app's *most engaged* users. Dashboard configurability is cheap to build and directly protects retention.</w:t>
+      </w:r>
+    </w:p>
+    <w:p>
+      <w:pPr>
+        <w:pBdr>
+          <w:bottom w:val="single" w:sz="6" w:space="6" w:color="C9CCD1"/>
+        </w:pBdr>
+      </w:pPr>
+    </w:p>
+    <w:p>
+      <w:pPr>
+        <w:pStyle w:val="Heading2"/>
+      </w:pPr>
+      <w:r>
+        <w:t xml:space="preserve">Theme 5 — Grocery integration and platform lock-in — 59 reviews (12%) — </w:t>
+      </w:r>
+      <w:r>
+        <w:rPr>
+          <w:b/>
+        </w:rPr>
+        <w:t xml:space="preserve">PRODUCT problem</w:t>
+      </w:r>
+      <w:r>
+        <w:t xml:space="preserve"> (and a strategic warning)</w:t>
+      </w:r>
+    </w:p>
+    <w:p>
+      <w:r>
+        <w:t xml:space="preserve">This theme is dominated by one event: </w:t>
+      </w:r>
+      <w:r>
+        <w:rPr>
+          <w:b/>
+        </w:rPr>
+        <w:t xml:space="preserve">Mealime — the closest thing to the all-in-one app you're describing — is being shut down on October 21, 2026.</w:t>
+      </w:r>
+      <w:r>
+        <w:t xml:space="preserve"> Albertsons bought it in 2021 and is folding it into "Meals Hub," which lives *inside* the Albertsons/Safeway/Vons/Jewel-Osco grocery apps. There is </w:t>
+      </w:r>
+      <w:r>
+        <w:rPr>
+          <w:b/>
+        </w:rPr>
+        <w:t xml:space="preserve">no export button</w:t>
+      </w:r>
+      <w:r>
+        <w:t xml:space="preserve">: saved recipes, meal plans and grocery lists are deleted. (</w:t>
+      </w:r>
+      <w:hyperlink r:id="rHl45">
+        <w:r>
+          <w:rPr>
+            <w:rStyle w:val="Hyperlink"/>
+          </w:rPr>
+          <w:t xml:space="preserve">Plan to Eat's write-up</w:t>
+        </w:r>
+      </w:hyperlink>
+      <w:r>
+        <w:t xml:space="preserve">; </w:t>
+      </w:r>
+      <w:hyperlink r:id="rHl46">
+        <w:r>
+          <w:rPr>
+            <w:rStyle w:val="Hyperlink"/>
+          </w:rPr>
+          <w:t xml:space="preserve">shutdown summary</w:t>
+        </w:r>
+      </w:hyperlink>
+      <w:r>
+        <w:t xml:space="preserve">)</w:t>
+      </w:r>
+    </w:p>
+    <w:p>
+      <w:r>
+        <w:t xml:space="preserve">1. Mealime, 1★, Sept 5 2026 (*99Grumps*) — they wanted a meal planner, not a grocery app that tracks purchases; Meals Hub requires picking one chain, and they shop local and small.</w:t>
+      </w:r>
+    </w:p>
+    <w:p>
+      <w:r>
+        <w:t xml:space="preserve">2. Mealime, 1★, Sept 3 2026 (*Csquaredbrady*) — a years-long Pro subscriber with no Albertsons banner nearby; would happily have paid *more* to keep the app standalone.</w:t>
+      </w:r>
+    </w:p>
+    <w:p>
+      <w:r>
+        <w:t xml:space="preserve">3. Mealime, 1★, Sept 17 2026 (*Lady Wynter*) — the replacement's stores are unaffordable or absent locally, and saved recipes have to be hand-copied into a document before deletion.</w:t>
+      </w:r>
+    </w:p>
+    <w:p>
+      <w:pPr>
+        <w:ind w:left="360"/>
+        <w:pBdr>
+          <w:left w:val="single" w:sz="18" w:space="8" w:color="9AA0A6"/>
+        </w:pBdr>
+      </w:pPr>
+      <w:r>
+        <w:rPr>
+          <w:b/>
+        </w:rPr>
+        <w:t xml:space="preserve">Also:</w:t>
+      </w:r>
+      <w:r>
+        <w:t xml:space="preserve"> eMeals 2★, Sept 13 2026 (*cleanmydesk*) — the hand-off to the Walmart app failed and the entire list vanished. Mealime 3★, Aug 9 2026 (*Shopper55$*) — online cart crashes after a few items. Instacart itself sits at 1.2★ on Trustpilot for substitutions, missing items and refused refunds.</w:t>
+      </w:r>
+    </w:p>
+    <w:p>
+      <w:r>
+        <w:rPr>
+          <w:b/>
+        </w:rPr>
+        <w:t xml:space="preserve">Why it matters most:</w:t>
+      </w:r>
+      <w:r>
+        <w:t xml:space="preserve"> this is the clearest opening in the whole scan. A well-liked combined app is being killed, its users are actively angry, they're being pushed into a single grocery chain's walled garden, and they cannot take their data with them. </w:t>
+      </w:r>
+      <w:r>
+        <w:rPr>
+          <w:b/>
+        </w:rPr>
+        <w:t xml:space="preserve">Retailer-neutral + data export is a positioning, not a feature.</w:t>
+      </w:r>
+    </w:p>
+    <w:p>
+      <w:pPr>
+        <w:pBdr>
+          <w:bottom w:val="single" w:sz="6" w:space="6" w:color="C9CCD1"/>
+        </w:pBdr>
+      </w:pPr>
+    </w:p>
+    <w:p>
+      <w:pPr>
+        <w:pStyle w:val="Heading2"/>
+      </w:pPr>
+      <w:r>
+        <w:t xml:space="preserve">Theme 6 — Rigidity and lack of customization — 53 reviews (11%) — </w:t>
+      </w:r>
+      <w:r>
+        <w:rPr>
+          <w:b/>
+        </w:rPr>
+        <w:t xml:space="preserve">PRODUCT problem</w:t>
+      </w:r>
+    </w:p>
+    <w:p>
+      <w:r>
+        <w:t xml:space="preserve">Can't set macros without paying, can't adjust servings for a family, can't export or copy a recipe out, can't make the plan bend to real life.</w:t>
+      </w:r>
+    </w:p>
+    <w:p>
+      <w:r>
+        <w:t xml:space="preserve">1. MyFitnessPal, 1★, Sept 19 2026 (*Luke5t*) — setting your own macro and calorie targets is now a paid feature, so they're leaving. *(Also a pricing problem — this one sits in both.)*</w:t>
+      </w:r>
+    </w:p>
+    <w:p>
+      <w:r>
+        <w:t xml:space="preserve">2. Plan to Eat, 3★, Sept 19 2026 (*123Dana456*) — every recipe ingredient is force-added to the shopping list with no way to turn it off, and the list can't be exported to iOS Reminders/Lists.</w:t>
+      </w:r>
+    </w:p>
+    <w:p>
+      <w:r>
+        <w:t xml:space="preserve">3. MyFitnessPal, 3★, Sept 12 2026 (*BetterThanNothing_*) — a paying subscriber asking for meaningfully more micronutrients than the handful shown.</w:t>
+      </w:r>
+    </w:p>
+    <w:p>
+      <w:pPr>
+        <w:pBdr>
+          <w:bottom w:val="single" w:sz="6" w:space="6" w:color="C9CCD1"/>
+        </w:pBdr>
+      </w:pPr>
+    </w:p>
+    <w:p>
+      <w:pPr>
+        <w:pStyle w:val="Heading2"/>
+      </w:pPr>
+      <w:r>
+        <w:t xml:space="preserve">Theme 7 — AI features that under-deliver — 33 reviews (7%) — </w:t>
+      </w:r>
+      <w:r>
+        <w:rPr>
+          <w:b/>
+        </w:rPr>
+        <w:t xml:space="preserve">PRODUCT problem</w:t>
+      </w:r>
+    </w:p>
+    <w:p>
+      <w:r>
+        <w:t xml:space="preserve">Worth separating out because it is the newest theme and directly relevant to an AI-built product.</w:t>
+      </w:r>
+    </w:p>
+    <w:p>
+      <w:r>
+        <w:t xml:space="preserve">1. MealPrepPro, 1★, Sept 16 2026 (*Suz-spark*) — headline complaint is that the app is trying to do too much and the AI meal planner is bad.</w:t>
+      </w:r>
+    </w:p>
+    <w:p>
+      <w:r>
+        <w:t xml:space="preserve">2. MealPrepPro, 2★, Sept 5 2026 (*SamLLLR23*) — recipes taste bland and read as AI-generated; won't pay until that improves.</w:t>
+      </w:r>
+    </w:p>
+    <w:p>
+      <w:r>
+        <w:t xml:space="preserve">3. eMeals, 1★, Sept 8 2026 (*BarbaraWeider*) — says a free AI chatbot produces a more personalized, more useful meal plan than the paid subscription. </w:t>
+      </w:r>
+      <w:r>
+        <w:rPr>
+          <w:b/>
+        </w:rPr>
+        <w:t xml:space="preserve">This is the competitive threat to the entire category.</w:t>
+      </w:r>
+    </w:p>
+    <w:p>
+      <w:pPr>
+        <w:ind w:left="360"/>
+        <w:pBdr>
+          <w:left w:val="single" w:sz="18" w:space="8" w:color="9AA0A6"/>
+        </w:pBdr>
+      </w:pPr>
+      <w:r>
+        <w:rPr>
+          <w:b/>
+        </w:rPr>
+        <w:t xml:space="preserve">Also:</w:t>
+      </w:r>
+      <w:r>
+        <w:t xml:space="preserve"> MyFitnessPal 2★, Sept 5 2026 (*RunBing*) — the AI "coach" gave 2,100 / 2,500 / 2,850 calorie targets on consecutive days that contradicted actual workout days.</w:t>
+      </w:r>
+    </w:p>
+    <w:p>
+      <w:pPr>
+        <w:pBdr>
+          <w:bottom w:val="single" w:sz="6" w:space="6" w:color="C9CCD1"/>
+        </w:pBdr>
+      </w:pPr>
+    </w:p>
+    <w:p>
+      <w:pPr>
+        <w:pStyle w:val="Heading2"/>
+      </w:pPr>
+      <w:r>
+        <w:t xml:space="preserve">Theme 8 — Ads and upsell interruptions — 25 reviews (5%) — </w:t>
+      </w:r>
+      <w:r>
+        <w:rPr>
+          <w:b/>
+        </w:rPr>
+        <w:t xml:space="preserve">PRICING problem</w:t>
+      </w:r>
+    </w:p>
+    <w:p>
+      <w:r>
+        <w:t xml:space="preserve">Pop-ups mid-logging, brand placements inside recipes, ads that freeze the screen.</w:t>
+      </w:r>
+    </w:p>
+    <w:p>
+      <w:r>
+        <w:t xml:space="preserve">1. MyFitnessPal, 1★, Sept 19 2026 (*Honest, not rude*) — ads on open, on logging and on lookup, to the point of freezing the screen.</w:t>
+      </w:r>
+    </w:p>
+    <w:p>
+      <w:r>
+        <w:t xml:space="preserve">2. MyFitnessPal, 2★, Sept 7 2026 (*dragontower22*) — motivational pop-ups interrupt logging with no way to disable them.</w:t>
+      </w:r>
+    </w:p>
+    <w:p>
+      <w:r>
+        <w:t xml:space="preserve">3. eMeals, 1★, Sept 19 2026 (*Brilliant.girl*) — no way to turn off wine-pairing suggestions (they don't drink), plus branded placements that feel like advertising.</w:t>
+      </w:r>
+    </w:p>
+    <w:p>
+      <w:pPr>
+        <w:pBdr>
+          <w:bottom w:val="single" w:sz="6" w:space="6" w:color="C9CCD1"/>
+        </w:pBdr>
+      </w:pPr>
+    </w:p>
+    <w:p>
+      <w:pPr>
+        <w:pStyle w:val="Heading2"/>
+      </w:pPr>
+      <w:r>
+        <w:t xml:space="preserve">Theme 9 — Allergies and preference exclusion — 7 reviews (1%) — </w:t>
+      </w:r>
+      <w:r>
+        <w:rPr>
+          <w:b/>
+        </w:rPr>
+        <w:t xml:space="preserve">PRODUCT problem</w:t>
+      </w:r>
+    </w:p>
+    <w:p>
+      <w:r>
+        <w:t xml:space="preserve">Low count, but read it carefully: </w:t>
+      </w:r>
+      <w:r>
+        <w:rPr>
+          <w:b/>
+        </w:rPr>
+        <w:t xml:space="preserve">it's low because most apps don't offer the feature at all</w:t>
+      </w:r>
+      <w:r>
+        <w:t xml:space="preserve">, so users rarely complain about it in an app-store review — they just leave. Where users do raise it, it's severe and specific.</w:t>
+      </w:r>
+    </w:p>
+    <w:p>
+      <w:r>
+        <w:t xml:space="preserve">1. Mealime, 3★, May 1 2025 (*Gonebaby77*) — could only pick from preset allergen groups; a cilantro allergy had no slot, and recipes still contained ingredients marked as disliked.</w:t>
+      </w:r>
+    </w:p>
+    <w:p>
+      <w:r>
+        <w:t xml:space="preserve">2. Mealime, 2★, Jan 16 2026 (*aria.na_blonde*) — has MCAS and a highly restrictive diet; accepts that low-histamine isn't a preset, but wants to enter their own excluded ingredients.</w:t>
+      </w:r>
+    </w:p>
+    <w:p>
+      <w:r>
+        <w:t xml:space="preserve">3. Eat This Much, 2★, July 20 2025 (*erin29479*) — many customization options but hard to configure, and the vegetarian recipes amount to a block of tofu with sauce.</w:t>
+      </w:r>
+    </w:p>
+    <w:p>
+      <w:r>
+        <w:rPr>
+          <w:b/>
+        </w:rPr>
+        <w:t xml:space="preserve">Why it matters:</w:t>
+      </w:r>
+      <w:r>
+        <w:t xml:space="preserve"> "disliked ingredients still appeared in my plan" shows up in both Mealime and MealPrepPro reviews. </w:t>
+      </w:r>
+      <w:r>
+        <w:rPr>
+          <w:b/>
+        </w:rPr>
+        <w:t xml:space="preserve">A hard exclusion filter that actually holds is a small feature with outsized trust value</w:t>
+      </w:r>
+      <w:r>
+        <w:t xml:space="preserve"> — and a safety issue for real allergies.</w:t>
+      </w:r>
+    </w:p>
+    <w:p>
+      <w:pPr>
+        <w:pBdr>
+          <w:bottom w:val="single" w:sz="6" w:space="6" w:color="C9CCD1"/>
+        </w:pBdr>
+      </w:pPr>
+    </w:p>
+    <w:p>
+      <w:pPr>
+        <w:pStyle w:val="Heading1"/>
+      </w:pPr>
+      <w:r>
+        <w:t xml:space="preserve">Theme summary</w:t>
+      </w:r>
+    </w:p>
+    <w:tbl>
+      <w:tblPr>
+        <w:tblW w:w="10080" w:type="dxa"/>
+        <w:tblBorders>
+          <w:top w:val="single" w:sz="4" w:space="0" w:color="C9CCD1"/>
+          <w:left w:val="single" w:sz="4" w:space="0" w:color="C9CCD1"/>
+          <w:bottom w:val="single" w:sz="4" w:space="0" w:color="C9CCD1"/>
+          <w:right w:val="single" w:sz="4" w:space="0" w:color="C9CCD1"/>
+          <w:insideH w:val="single" w:sz="4" w:space="0" w:color="C9CCD1"/>
+          <w:insideV w:val="single" w:sz="4" w:space="0" w:color="C9CCD1"/>
+        </w:tblBorders>
+        <w:tblLayout w:type="fixed"/>
+      </w:tblPr>
+      <w:tblGrid>
+        <w:gridCol w:w="2016"/>
+        <w:gridCol w:w="2016"/>
+        <w:gridCol w:w="2016"/>
+        <w:gridCol w:w="2016"/>
+        <w:gridCol w:w="2016"/>
+      </w:tblGrid>
+      <w:tr>
+        <w:trPr>
+          <w:tblHeader/>
+        </w:trPr>
+        <w:tc>
+          <w:tcPr>
+            <w:tcW w:w="2016" w:type="dxa"/>
+            <w:shd w:val="clear" w:color="auto" w:fill="EFF1F3"/>
+          </w:tcPr>
+          <w:p>
+            <w:pPr>
+              <w:spacing w:before="40" w:after="40"/>
+            </w:pPr>
+            <w:r>
+              <w:rPr>
+                <w:b/>
+                <w:sz w:val="18"/>
+              </w:rPr>
+              <w:t xml:space="preserve">#</w:t>
+            </w:r>
+          </w:p>
+        </w:tc>
+        <w:tc>
+          <w:tcPr>
+            <w:tcW w:w="2016" w:type="dxa"/>
+            <w:shd w:val="clear" w:color="auto" w:fill="EFF1F3"/>
+          </w:tcPr>
+          <w:p>
+            <w:pPr>
+              <w:spacing w:before="40" w:after="40"/>
+            </w:pPr>
+            <w:r>
+              <w:rPr>
+                <w:b/>
+                <w:sz w:val="18"/>
+              </w:rPr>
+              <w:t xml:space="preserve">Theme</w:t>
+            </w:r>
+          </w:p>
+        </w:tc>
+        <w:tc>
+          <w:tcPr>
+            <w:tcW w:w="2016" w:type="dxa"/>
+            <w:shd w:val="clear" w:color="auto" w:fill="EFF1F3"/>
+          </w:tcPr>
+          <w:p>
+            <w:pPr>
+              <w:spacing w:before="40" w:after="40"/>
+            </w:pPr>
+            <w:r>
+              <w:rPr>
+                <w:b/>
+                <w:sz w:val="18"/>
+              </w:rPr>
+              <w:t xml:space="preserve">Reviews</w:t>
+            </w:r>
+          </w:p>
+        </w:tc>
+        <w:tc>
+          <w:tcPr>
+            <w:tcW w:w="2016" w:type="dxa"/>
+            <w:shd w:val="clear" w:color="auto" w:fill="EFF1F3"/>
+          </w:tcPr>
+          <w:p>
+            <w:pPr>
+              <w:spacing w:before="40" w:after="40"/>
+            </w:pPr>
+            <w:r>
+              <w:rPr>
+                <w:b/>
+                <w:sz w:val="18"/>
+              </w:rPr>
+              <w:t xml:space="preserve">Share</w:t>
+            </w:r>
+          </w:p>
+        </w:tc>
+        <w:tc>
+          <w:tcPr>
+            <w:tcW w:w="2016" w:type="dxa"/>
+            <w:shd w:val="clear" w:color="auto" w:fill="EFF1F3"/>
+          </w:tcPr>
+          <w:p>
+            <w:pPr>
+              <w:spacing w:before="40" w:after="40"/>
+            </w:pPr>
+            <w:r>
+              <w:rPr>
+                <w:b/>
+                <w:sz w:val="18"/>
+              </w:rPr>
+              <w:t xml:space="preserve">Type</w:t>
+            </w:r>
+          </w:p>
+        </w:tc>
+      </w:tr>
+      <w:tr>
+        <w:tc>
+          <w:tcPr>
+            <w:tcW w:w="2016" w:type="dxa"/>
+          </w:tcPr>
+          <w:p>
+            <w:pPr>
+              <w:spacing w:before="40" w:after="40"/>
+            </w:pPr>
+            <w:r>
+              <w:rPr>
+                <w:sz w:val="18"/>
+              </w:rPr>
+              <w:t xml:space="preserve">1</w:t>
+            </w:r>
+          </w:p>
+        </w:tc>
+        <w:tc>
+          <w:tcPr>
+            <w:tcW w:w="2016" w:type="dxa"/>
+          </w:tcPr>
+          <w:p>
+            <w:pPr>
+              <w:spacing w:before="40" w:after="40"/>
+            </w:pPr>
+            <w:r>
+              <w:rPr>
+                <w:sz w:val="18"/>
+              </w:rPr>
+              <w:t xml:space="preserve">Pricing, paywalls, billing</w:t>
+            </w:r>
+          </w:p>
+        </w:tc>
+        <w:tc>
+          <w:tcPr>
+            <w:tcW w:w="2016" w:type="dxa"/>
+          </w:tcPr>
+          <w:p>
+            <w:pPr>
+              <w:spacing w:before="40" w:after="40"/>
+            </w:pPr>
+            <w:r>
+              <w:rPr>
+                <w:sz w:val="18"/>
+              </w:rPr>
+              <w:t xml:space="preserve">189</w:t>
+            </w:r>
+          </w:p>
+        </w:tc>
+        <w:tc>
+          <w:tcPr>
+            <w:tcW w:w="2016" w:type="dxa"/>
+          </w:tcPr>
+          <w:p>
+            <w:pPr>
+              <w:spacing w:before="40" w:after="40"/>
+            </w:pPr>
+            <w:r>
+              <w:rPr>
+                <w:sz w:val="18"/>
+              </w:rPr>
+              <w:t xml:space="preserve">39%</w:t>
+            </w:r>
+          </w:p>
+        </w:tc>
+        <w:tc>
+          <w:tcPr>
+            <w:tcW w:w="2016" w:type="dxa"/>
+          </w:tcPr>
+          <w:p>
+            <w:pPr>
+              <w:spacing w:before="40" w:after="40"/>
+            </w:pPr>
+            <w:r>
+              <w:rPr>
+                <w:b/>
+                <w:sz w:val="18"/>
+              </w:rPr>
+              <w:t xml:space="preserve">Pricing</w:t>
+            </w:r>
+          </w:p>
+        </w:tc>
+      </w:tr>
+      <w:tr>
+        <w:tc>
+          <w:tcPr>
+            <w:tcW w:w="2016" w:type="dxa"/>
+          </w:tcPr>
+          <w:p>
+            <w:pPr>
+              <w:spacing w:before="40" w:after="40"/>
+            </w:pPr>
+            <w:r>
+              <w:rPr>
+                <w:sz w:val="18"/>
+              </w:rPr>
+              <w:t xml:space="preserve">2</w:t>
+            </w:r>
+          </w:p>
+        </w:tc>
+        <w:tc>
+          <w:tcPr>
+            <w:tcW w:w="2016" w:type="dxa"/>
+          </w:tcPr>
+          <w:p>
+            <w:pPr>
+              <w:spacing w:before="40" w:after="40"/>
+            </w:pPr>
+            <w:r>
+              <w:rPr>
+                <w:sz w:val="18"/>
+              </w:rPr>
+              <w:t xml:space="preserve">Nutrition data accuracy</w:t>
+            </w:r>
+          </w:p>
+        </w:tc>
+        <w:tc>
+          <w:tcPr>
+            <w:tcW w:w="2016" w:type="dxa"/>
+          </w:tcPr>
+          <w:p>
+            <w:pPr>
+              <w:spacing w:before="40" w:after="40"/>
+            </w:pPr>
+            <w:r>
+              <w:rPr>
+                <w:sz w:val="18"/>
+              </w:rPr>
+              <w:t xml:space="preserve">123</w:t>
+            </w:r>
+          </w:p>
+        </w:tc>
+        <w:tc>
+          <w:tcPr>
+            <w:tcW w:w="2016" w:type="dxa"/>
+          </w:tcPr>
+          <w:p>
+            <w:pPr>
+              <w:spacing w:before="40" w:after="40"/>
+            </w:pPr>
+            <w:r>
+              <w:rPr>
+                <w:sz w:val="18"/>
+              </w:rPr>
+              <w:t xml:space="preserve">26%</w:t>
+            </w:r>
+          </w:p>
+        </w:tc>
+        <w:tc>
+          <w:tcPr>
+            <w:tcW w:w="2016" w:type="dxa"/>
+          </w:tcPr>
+          <w:p>
+            <w:pPr>
+              <w:spacing w:before="40" w:after="40"/>
+            </w:pPr>
+            <w:r>
+              <w:rPr>
+                <w:sz w:val="18"/>
+              </w:rPr>
+              <w:t xml:space="preserve">Product</w:t>
+            </w:r>
+          </w:p>
+        </w:tc>
+      </w:tr>
+      <w:tr>
+        <w:tc>
+          <w:tcPr>
+            <w:tcW w:w="2016" w:type="dxa"/>
+          </w:tcPr>
+          <w:p>
+            <w:pPr>
+              <w:spacing w:before="40" w:after="40"/>
+            </w:pPr>
+            <w:r>
+              <w:rPr>
+                <w:sz w:val="18"/>
+              </w:rPr>
+              <w:t xml:space="preserve">3</w:t>
+            </w:r>
+          </w:p>
+        </w:tc>
+        <w:tc>
+          <w:tcPr>
+            <w:tcW w:w="2016" w:type="dxa"/>
+          </w:tcPr>
+          <w:p>
+            <w:pPr>
+              <w:spacing w:before="40" w:after="40"/>
+            </w:pPr>
+            <w:r>
+              <w:rPr>
+                <w:sz w:val="18"/>
+              </w:rPr>
+              <w:t xml:space="preserve">Recipe quality / repetition</w:t>
+            </w:r>
+          </w:p>
+        </w:tc>
+        <w:tc>
+          <w:tcPr>
+            <w:tcW w:w="2016" w:type="dxa"/>
+          </w:tcPr>
+          <w:p>
+            <w:pPr>
+              <w:spacing w:before="40" w:after="40"/>
+            </w:pPr>
+            <w:r>
+              <w:rPr>
+                <w:sz w:val="18"/>
+              </w:rPr>
+              <w:t xml:space="preserve">107</w:t>
+            </w:r>
+          </w:p>
+        </w:tc>
+        <w:tc>
+          <w:tcPr>
+            <w:tcW w:w="2016" w:type="dxa"/>
+          </w:tcPr>
+          <w:p>
+            <w:pPr>
+              <w:spacing w:before="40" w:after="40"/>
+            </w:pPr>
+            <w:r>
+              <w:rPr>
+                <w:sz w:val="18"/>
+              </w:rPr>
+              <w:t xml:space="preserve">22%</w:t>
+            </w:r>
+          </w:p>
+        </w:tc>
+        <w:tc>
+          <w:tcPr>
+            <w:tcW w:w="2016" w:type="dxa"/>
+          </w:tcPr>
+          <w:p>
+            <w:pPr>
+              <w:spacing w:before="40" w:after="40"/>
+            </w:pPr>
+            <w:r>
+              <w:rPr>
+                <w:sz w:val="18"/>
+              </w:rPr>
+              <w:t xml:space="preserve">Product</w:t>
+            </w:r>
+          </w:p>
+        </w:tc>
+      </w:tr>
+      <w:tr>
+        <w:tc>
+          <w:tcPr>
+            <w:tcW w:w="2016" w:type="dxa"/>
+          </w:tcPr>
+          <w:p>
+            <w:pPr>
+              <w:spacing w:before="40" w:after="40"/>
+            </w:pPr>
+            <w:r>
+              <w:rPr>
+                <w:sz w:val="18"/>
+              </w:rPr>
+              <w:t xml:space="preserve">4</w:t>
+            </w:r>
+          </w:p>
+        </w:tc>
+        <w:tc>
+          <w:tcPr>
+            <w:tcW w:w="2016" w:type="dxa"/>
+          </w:tcPr>
+          <w:p>
+            <w:pPr>
+              <w:spacing w:before="40" w:after="40"/>
+            </w:pPr>
+            <w:r>
+              <w:rPr>
+                <w:sz w:val="18"/>
+              </w:rPr>
+              <w:t xml:space="preserve">Bugs, redesigns, lost work</w:t>
+            </w:r>
+          </w:p>
+        </w:tc>
+        <w:tc>
+          <w:tcPr>
+            <w:tcW w:w="2016" w:type="dxa"/>
+          </w:tcPr>
+          <w:p>
+            <w:pPr>
+              <w:spacing w:before="40" w:after="40"/>
+            </w:pPr>
+            <w:r>
+              <w:rPr>
+                <w:sz w:val="18"/>
+              </w:rPr>
+              <w:t xml:space="preserve">67</w:t>
+            </w:r>
+          </w:p>
+        </w:tc>
+        <w:tc>
+          <w:tcPr>
+            <w:tcW w:w="2016" w:type="dxa"/>
+          </w:tcPr>
+          <w:p>
+            <w:pPr>
+              <w:spacing w:before="40" w:after="40"/>
+            </w:pPr>
+            <w:r>
+              <w:rPr>
+                <w:sz w:val="18"/>
+              </w:rPr>
+              <w:t xml:space="preserve">14%</w:t>
+            </w:r>
+          </w:p>
+        </w:tc>
+        <w:tc>
+          <w:tcPr>
+            <w:tcW w:w="2016" w:type="dxa"/>
+          </w:tcPr>
+          <w:p>
+            <w:pPr>
+              <w:spacing w:before="40" w:after="40"/>
+            </w:pPr>
+            <w:r>
+              <w:rPr>
+                <w:sz w:val="18"/>
+              </w:rPr>
+              <w:t xml:space="preserve">Product</w:t>
+            </w:r>
+          </w:p>
+        </w:tc>
+      </w:tr>
+      <w:tr>
+        <w:tc>
+          <w:tcPr>
+            <w:tcW w:w="2016" w:type="dxa"/>
+          </w:tcPr>
+          <w:p>
+            <w:pPr>
+              <w:spacing w:before="40" w:after="40"/>
+            </w:pPr>
+            <w:r>
+              <w:rPr>
+                <w:sz w:val="18"/>
+              </w:rPr>
+              <w:t xml:space="preserve">5</w:t>
+            </w:r>
+          </w:p>
+        </w:tc>
+        <w:tc>
+          <w:tcPr>
+            <w:tcW w:w="2016" w:type="dxa"/>
+          </w:tcPr>
+          <w:p>
+            <w:pPr>
+              <w:spacing w:before="40" w:after="40"/>
+            </w:pPr>
+            <w:r>
+              <w:rPr>
+                <w:sz w:val="18"/>
+              </w:rPr>
+              <w:t xml:space="preserve">Grocery integration &amp; lock-in</w:t>
+            </w:r>
+          </w:p>
+        </w:tc>
+        <w:tc>
+          <w:tcPr>
+            <w:tcW w:w="2016" w:type="dxa"/>
+          </w:tcPr>
+          <w:p>
+            <w:pPr>
+              <w:spacing w:before="40" w:after="40"/>
+            </w:pPr>
+            <w:r>
+              <w:rPr>
+                <w:sz w:val="18"/>
+              </w:rPr>
+              <w:t xml:space="preserve">59</w:t>
+            </w:r>
+          </w:p>
+        </w:tc>
+        <w:tc>
+          <w:tcPr>
+            <w:tcW w:w="2016" w:type="dxa"/>
+          </w:tcPr>
+          <w:p>
+            <w:pPr>
+              <w:spacing w:before="40" w:after="40"/>
+            </w:pPr>
+            <w:r>
+              <w:rPr>
+                <w:sz w:val="18"/>
+              </w:rPr>
+              <w:t xml:space="preserve">12%</w:t>
+            </w:r>
+          </w:p>
+        </w:tc>
+        <w:tc>
+          <w:tcPr>
+            <w:tcW w:w="2016" w:type="dxa"/>
+          </w:tcPr>
+          <w:p>
+            <w:pPr>
+              <w:spacing w:before="40" w:after="40"/>
+            </w:pPr>
+            <w:r>
+              <w:rPr>
+                <w:sz w:val="18"/>
+              </w:rPr>
+              <w:t xml:space="preserve">Product</w:t>
+            </w:r>
+          </w:p>
+        </w:tc>
+      </w:tr>
+      <w:tr>
+        <w:tc>
+          <w:tcPr>
+            <w:tcW w:w="2016" w:type="dxa"/>
+          </w:tcPr>
+          <w:p>
+            <w:pPr>
+              <w:spacing w:before="40" w:after="40"/>
+            </w:pPr>
+            <w:r>
+              <w:rPr>
+                <w:sz w:val="18"/>
+              </w:rPr>
+              <w:t xml:space="preserve">6</w:t>
+            </w:r>
+          </w:p>
+        </w:tc>
+        <w:tc>
+          <w:tcPr>
+            <w:tcW w:w="2016" w:type="dxa"/>
+          </w:tcPr>
+          <w:p>
+            <w:pPr>
+              <w:spacing w:before="40" w:after="40"/>
+            </w:pPr>
+            <w:r>
+              <w:rPr>
+                <w:sz w:val="18"/>
+              </w:rPr>
+              <w:t xml:space="preserve">Rigidity / customization</w:t>
+            </w:r>
+          </w:p>
+        </w:tc>
+        <w:tc>
+          <w:tcPr>
+            <w:tcW w:w="2016" w:type="dxa"/>
+          </w:tcPr>
+          <w:p>
+            <w:pPr>
+              <w:spacing w:before="40" w:after="40"/>
+            </w:pPr>
+            <w:r>
+              <w:rPr>
+                <w:sz w:val="18"/>
+              </w:rPr>
+              <w:t xml:space="preserve">53</w:t>
+            </w:r>
+          </w:p>
+        </w:tc>
+        <w:tc>
+          <w:tcPr>
+            <w:tcW w:w="2016" w:type="dxa"/>
+          </w:tcPr>
+          <w:p>
+            <w:pPr>
+              <w:spacing w:before="40" w:after="40"/>
+            </w:pPr>
+            <w:r>
+              <w:rPr>
+                <w:sz w:val="18"/>
+              </w:rPr>
+              <w:t xml:space="preserve">11%</w:t>
+            </w:r>
+          </w:p>
+        </w:tc>
+        <w:tc>
+          <w:tcPr>
+            <w:tcW w:w="2016" w:type="dxa"/>
+          </w:tcPr>
+          <w:p>
+            <w:pPr>
+              <w:spacing w:before="40" w:after="40"/>
+            </w:pPr>
+            <w:r>
+              <w:rPr>
+                <w:sz w:val="18"/>
+              </w:rPr>
+              <w:t xml:space="preserve">Product</w:t>
+            </w:r>
+          </w:p>
+        </w:tc>
+      </w:tr>
+      <w:tr>
+        <w:tc>
+          <w:tcPr>
+            <w:tcW w:w="2016" w:type="dxa"/>
+          </w:tcPr>
+          <w:p>
+            <w:pPr>
+              <w:spacing w:before="40" w:after="40"/>
+            </w:pPr>
+            <w:r>
+              <w:rPr>
+                <w:sz w:val="18"/>
+              </w:rPr>
+              <w:t xml:space="preserve">7</w:t>
+            </w:r>
+          </w:p>
+        </w:tc>
+        <w:tc>
+          <w:tcPr>
+            <w:tcW w:w="2016" w:type="dxa"/>
+          </w:tcPr>
+          <w:p>
+            <w:pPr>
+              <w:spacing w:before="40" w:after="40"/>
+            </w:pPr>
+            <w:r>
+              <w:rPr>
+                <w:sz w:val="18"/>
+              </w:rPr>
+              <w:t xml:space="preserve">AI features under-delivering</w:t>
+            </w:r>
+          </w:p>
+        </w:tc>
+        <w:tc>
+          <w:tcPr>
+            <w:tcW w:w="2016" w:type="dxa"/>
+          </w:tcPr>
+          <w:p>
+            <w:pPr>
+              <w:spacing w:before="40" w:after="40"/>
+            </w:pPr>
+            <w:r>
+              <w:rPr>
+                <w:sz w:val="18"/>
+              </w:rPr>
+              <w:t xml:space="preserve">33</w:t>
+            </w:r>
+          </w:p>
+        </w:tc>
+        <w:tc>
+          <w:tcPr>
+            <w:tcW w:w="2016" w:type="dxa"/>
+          </w:tcPr>
+          <w:p>
+            <w:pPr>
+              <w:spacing w:before="40" w:after="40"/>
+            </w:pPr>
+            <w:r>
+              <w:rPr>
+                <w:sz w:val="18"/>
+              </w:rPr>
+              <w:t xml:space="preserve">7%</w:t>
+            </w:r>
+          </w:p>
+        </w:tc>
+        <w:tc>
+          <w:tcPr>
+            <w:tcW w:w="2016" w:type="dxa"/>
+          </w:tcPr>
+          <w:p>
+            <w:pPr>
+              <w:spacing w:before="40" w:after="40"/>
+            </w:pPr>
+            <w:r>
+              <w:rPr>
+                <w:sz w:val="18"/>
+              </w:rPr>
+              <w:t xml:space="preserve">Product</w:t>
+            </w:r>
+          </w:p>
+        </w:tc>
+      </w:tr>
+      <w:tr>
+        <w:tc>
+          <w:tcPr>
+            <w:tcW w:w="2016" w:type="dxa"/>
+          </w:tcPr>
+          <w:p>
+            <w:pPr>
+              <w:spacing w:before="40" w:after="40"/>
+            </w:pPr>
+            <w:r>
+              <w:rPr>
+                <w:sz w:val="18"/>
+              </w:rPr>
+              <w:t xml:space="preserve">8</w:t>
+            </w:r>
+          </w:p>
+        </w:tc>
+        <w:tc>
+          <w:tcPr>
+            <w:tcW w:w="2016" w:type="dxa"/>
+          </w:tcPr>
+          <w:p>
+            <w:pPr>
+              <w:spacing w:before="40" w:after="40"/>
+            </w:pPr>
+            <w:r>
+              <w:rPr>
+                <w:sz w:val="18"/>
+              </w:rPr>
+              <w:t xml:space="preserve">Ads &amp; upsell interruptions</w:t>
+            </w:r>
+          </w:p>
+        </w:tc>
+        <w:tc>
+          <w:tcPr>
+            <w:tcW w:w="2016" w:type="dxa"/>
+          </w:tcPr>
+          <w:p>
+            <w:pPr>
+              <w:spacing w:before="40" w:after="40"/>
+            </w:pPr>
+            <w:r>
+              <w:rPr>
+                <w:sz w:val="18"/>
+              </w:rPr>
+              <w:t xml:space="preserve">25</w:t>
+            </w:r>
+          </w:p>
+        </w:tc>
+        <w:tc>
+          <w:tcPr>
+            <w:tcW w:w="2016" w:type="dxa"/>
+          </w:tcPr>
+          <w:p>
+            <w:pPr>
+              <w:spacing w:before="40" w:after="40"/>
+            </w:pPr>
+            <w:r>
+              <w:rPr>
+                <w:sz w:val="18"/>
+              </w:rPr>
+              <w:t xml:space="preserve">5%</w:t>
+            </w:r>
+          </w:p>
+        </w:tc>
+        <w:tc>
+          <w:tcPr>
+            <w:tcW w:w="2016" w:type="dxa"/>
+          </w:tcPr>
+          <w:p>
+            <w:pPr>
+              <w:spacing w:before="40" w:after="40"/>
+            </w:pPr>
+            <w:r>
+              <w:rPr>
+                <w:b/>
+                <w:sz w:val="18"/>
+              </w:rPr>
+              <w:t xml:space="preserve">Pricing</w:t>
+            </w:r>
+          </w:p>
+        </w:tc>
+      </w:tr>
+      <w:tr>
+        <w:tc>
+          <w:tcPr>
+            <w:tcW w:w="2016" w:type="dxa"/>
+          </w:tcPr>
+          <w:p>
+            <w:pPr>
+              <w:spacing w:before="40" w:after="40"/>
+            </w:pPr>
+            <w:r>
+              <w:rPr>
+                <w:sz w:val="18"/>
+              </w:rPr>
+              <w:t xml:space="preserve">9</w:t>
+            </w:r>
+          </w:p>
+        </w:tc>
+        <w:tc>
+          <w:tcPr>
+            <w:tcW w:w="2016" w:type="dxa"/>
+          </w:tcPr>
+          <w:p>
+            <w:pPr>
+              <w:spacing w:before="40" w:after="40"/>
+            </w:pPr>
+            <w:r>
+              <w:rPr>
+                <w:sz w:val="18"/>
+              </w:rPr>
+              <w:t xml:space="preserve">Allergy &amp; preference exclusion</w:t>
+            </w:r>
+          </w:p>
+        </w:tc>
+        <w:tc>
+          <w:tcPr>
+            <w:tcW w:w="2016" w:type="dxa"/>
+          </w:tcPr>
+          <w:p>
+            <w:pPr>
+              <w:spacing w:before="40" w:after="40"/>
+            </w:pPr>
+            <w:r>
+              <w:rPr>
+                <w:sz w:val="18"/>
+              </w:rPr>
+              <w:t xml:space="preserve">7</w:t>
+            </w:r>
+          </w:p>
+        </w:tc>
+        <w:tc>
+          <w:tcPr>
+            <w:tcW w:w="2016" w:type="dxa"/>
+          </w:tcPr>
+          <w:p>
+            <w:pPr>
+              <w:spacing w:before="40" w:after="40"/>
+            </w:pPr>
+            <w:r>
+              <w:rPr>
+                <w:sz w:val="18"/>
+              </w:rPr>
+              <w:t xml:space="preserve">1%</w:t>
+            </w:r>
+          </w:p>
+        </w:tc>
+        <w:tc>
+          <w:tcPr>
+            <w:tcW w:w="2016" w:type="dxa"/>
+          </w:tcPr>
+          <w:p>
+            <w:pPr>
+              <w:spacing w:before="40" w:after="40"/>
+            </w:pPr>
+            <w:r>
+              <w:rPr>
+                <w:sz w:val="18"/>
+              </w:rPr>
+              <w:t xml:space="preserve">Product</w:t>
+            </w:r>
+          </w:p>
+        </w:tc>
+      </w:tr>
+    </w:tbl>
+    <w:p>
+      <w:pPr>
+        <w:spacing w:after="0"/>
+      </w:pPr>
+    </w:p>
+    <w:p>
+      <w:r>
+        <w:rPr>
+          <w:b/>
+        </w:rPr>
+        <w:t xml:space="preserve">Split: roughly 44% pricing/business-model, 56% product.</w:t>
+      </w:r>
+      <w:r>
+        <w:t xml:space="preserve"> Unusual for a category this technical — and it means a competitor can win meaningful ground on trust and pricing terms alone, before shipping a single better algorithm.</w:t>
+      </w:r>
+    </w:p>
+    <w:p>
+      <w:pPr>
+        <w:pBdr>
+          <w:bottom w:val="single" w:sz="6" w:space="6" w:color="C9CCD1"/>
+        </w:pBdr>
+      </w:pPr>
+    </w:p>
+    <w:p>
+      <w:pPr>
+        <w:pStyle w:val="Heading1"/>
+      </w:pPr>
+      <w:r>
+        <w:t xml:space="preserve">What companies pay humans to do this job</w:t>
+      </w:r>
+    </w:p>
+    <w:p>
+      <w:r>
+        <w:t xml:space="preserve">The job you'd be automating — take a person's diet and nutrition needs, choose the food, buy it, get it to their house — is currently done by humans in four different job shapes, at four very different prices.</w:t>
+      </w:r>
+    </w:p>
+    <w:p>
+      <w:pPr>
+        <w:pStyle w:val="Heading2"/>
+      </w:pPr>
+      <w:r>
+        <w:t xml:space="preserve">1. The full-stack version: personal / private chef</w:t>
+      </w:r>
+    </w:p>
+    <w:p>
+      <w:r>
+        <w:t xml:space="preserve">Plans to the client's dietary needs, shops, cooks, delivers.</w:t>
+      </w:r>
+    </w:p>
+    <w:tbl>
+      <w:tblPr>
+        <w:tblW w:w="10080" w:type="dxa"/>
+        <w:tblBorders>
+          <w:top w:val="single" w:sz="4" w:space="0" w:color="C9CCD1"/>
+          <w:left w:val="single" w:sz="4" w:space="0" w:color="C9CCD1"/>
+          <w:bottom w:val="single" w:sz="4" w:space="0" w:color="C9CCD1"/>
+          <w:right w:val="single" w:sz="4" w:space="0" w:color="C9CCD1"/>
+          <w:insideH w:val="single" w:sz="4" w:space="0" w:color="C9CCD1"/>
+          <w:insideV w:val="single" w:sz="4" w:space="0" w:color="C9CCD1"/>
+        </w:tblBorders>
+        <w:tblLayout w:type="fixed"/>
+      </w:tblPr>
+      <w:tblGrid>
+        <w:gridCol w:w="3360"/>
+        <w:gridCol w:w="3360"/>
+        <w:gridCol w:w="3360"/>
+      </w:tblGrid>
+      <w:tr>
+        <w:trPr>
+          <w:tblHeader/>
+        </w:trPr>
+        <w:tc>
+          <w:tcPr>
+            <w:tcW w:w="3360" w:type="dxa"/>
+            <w:shd w:val="clear" w:color="auto" w:fill="EFF1F3"/>
+          </w:tcPr>
+          <w:p>
+            <w:pPr>
+              <w:spacing w:before="40" w:after="40"/>
+            </w:pPr>
+            <w:r>
+              <w:rPr>
+                <w:b/>
+                <w:sz w:val="18"/>
+              </w:rPr>
+              <w:t xml:space="preserve">Metric</w:t>
+            </w:r>
+          </w:p>
+        </w:tc>
+        <w:tc>
+          <w:tcPr>
+            <w:tcW w:w="3360" w:type="dxa"/>
+            <w:shd w:val="clear" w:color="auto" w:fill="EFF1F3"/>
+          </w:tcPr>
+          <w:p>
+            <w:pPr>
+              <w:spacing w:before="40" w:after="40"/>
+            </w:pPr>
+            <w:r>
+              <w:rPr>
+                <w:b/>
+                <w:sz w:val="18"/>
+              </w:rPr>
+              <w:t xml:space="preserve">Figure</w:t>
+            </w:r>
+          </w:p>
+        </w:tc>
+        <w:tc>
+          <w:tcPr>
+            <w:tcW w:w="3360" w:type="dxa"/>
+            <w:shd w:val="clear" w:color="auto" w:fill="EFF1F3"/>
+          </w:tcPr>
+          <w:p>
+            <w:pPr>
+              <w:spacing w:before="40" w:after="40"/>
+            </w:pPr>
+            <w:r>
+              <w:rPr>
+                <w:b/>
+                <w:sz w:val="18"/>
+              </w:rPr>
+              <w:t xml:space="preserve">Source</w:t>
+            </w:r>
+          </w:p>
+        </w:tc>
+      </w:tr>
+      <w:tr>
+        <w:tc>
+          <w:tcPr>
+            <w:tcW w:w="3360" w:type="dxa"/>
+          </w:tcPr>
+          <w:p>
+            <w:pPr>
+              <w:spacing w:before="40" w:after="40"/>
+            </w:pPr>
+            <w:r>
+              <w:rPr>
+                <w:sz w:val="18"/>
+              </w:rPr>
+              <w:t xml:space="preserve">Typical independent rate</w:t>
+            </w:r>
+          </w:p>
+        </w:tc>
+        <w:tc>
+          <w:tcPr>
+            <w:tcW w:w="3360" w:type="dxa"/>
+          </w:tcPr>
+          <w:p>
+            <w:pPr>
+              <w:spacing w:before="40" w:after="40"/>
+            </w:pPr>
+            <w:r>
+              <w:rPr>
+                <w:b/>
+                <w:sz w:val="18"/>
+              </w:rPr>
+              <w:t xml:space="preserve">$45–$75/hour</w:t>
+            </w:r>
+            <w:r>
+              <w:rPr>
+                <w:sz w:val="18"/>
+              </w:rPr>
+              <w:t xml:space="preserve">; full-time roles $85K–$150K+</w:t>
+            </w:r>
+          </w:p>
+        </w:tc>
+        <w:tc>
+          <w:tcPr>
+            <w:tcW w:w="3360" w:type="dxa"/>
+          </w:tcPr>
+          <w:p>
+            <w:pPr>
+              <w:spacing w:before="40" w:after="40"/>
+            </w:pPr>
+            <w:hyperlink r:id="rHl47">
+              <w:r>
+                <w:rPr>
+                  <w:rStyle w:val="Hyperlink"/>
+                  <w:sz w:val="18"/>
+                </w:rPr>
+                <w:t xml:space="preserve">iHireChefs</w:t>
+              </w:r>
+            </w:hyperlink>
+          </w:p>
+        </w:tc>
+      </w:tr>
+      <w:tr>
+        <w:tc>
+          <w:tcPr>
+            <w:tcW w:w="3360" w:type="dxa"/>
+          </w:tcPr>
+          <w:p>
+            <w:pPr>
+              <w:spacing w:before="40" w:after="40"/>
+            </w:pPr>
+            <w:r>
+              <w:rPr>
+                <w:sz w:val="18"/>
+              </w:rPr>
+              <w:t xml:space="preserve">Posted service rates (3-hour minimum)</w:t>
+            </w:r>
+          </w:p>
+        </w:tc>
+        <w:tc>
+          <w:tcPr>
+            <w:tcW w:w="3360" w:type="dxa"/>
+          </w:tcPr>
+          <w:p>
+            <w:pPr>
+              <w:spacing w:before="40" w:after="40"/>
+            </w:pPr>
+            <w:r>
+              <w:rPr>
+                <w:sz w:val="18"/>
+              </w:rPr>
+              <w:t xml:space="preserve">Chicago </w:t>
+            </w:r>
+            <w:r>
+              <w:rPr>
+                <w:b/>
+                <w:sz w:val="18"/>
+              </w:rPr>
+              <w:t xml:space="preserve">$78.94/hr</w:t>
+            </w:r>
+            <w:r>
+              <w:rPr>
+                <w:sz w:val="18"/>
+              </w:rPr>
+              <w:t xml:space="preserve">, Philadelphia </w:t>
+            </w:r>
+            <w:r>
+              <w:rPr>
+                <w:b/>
+                <w:sz w:val="18"/>
+              </w:rPr>
+              <w:t xml:space="preserve">$66.19/hr</w:t>
+            </w:r>
+            <w:r>
+              <w:rPr>
+                <w:sz w:val="18"/>
+              </w:rPr>
+              <w:t xml:space="preserve">, Houston </w:t>
+            </w:r>
+            <w:r>
+              <w:rPr>
+                <w:b/>
+                <w:sz w:val="18"/>
+              </w:rPr>
+              <w:t xml:space="preserve">$60.94/hr</w:t>
+            </w:r>
+          </w:p>
+        </w:tc>
+        <w:tc>
+          <w:tcPr>
+            <w:tcW w:w="3360" w:type="dxa"/>
+          </w:tcPr>
+          <w:p>
+            <w:pPr>
+              <w:spacing w:before="40" w:after="40"/>
+            </w:pPr>
+            <w:hyperlink r:id="rHl48">
+              <w:r>
+                <w:rPr>
+                  <w:rStyle w:val="Hyperlink"/>
+                  <w:sz w:val="18"/>
+                </w:rPr>
+                <w:t xml:space="preserve">Friend That Cooks</w:t>
+              </w:r>
+            </w:hyperlink>
+          </w:p>
+        </w:tc>
+      </w:tr>
+      <w:tr>
+        <w:tc>
+          <w:tcPr>
+            <w:tcW w:w="3360" w:type="dxa"/>
+          </w:tcPr>
+          <w:p>
+            <w:pPr>
+              <w:spacing w:before="40" w:after="40"/>
+            </w:pPr>
+            <w:r>
+              <w:rPr>
+                <w:sz w:val="18"/>
+              </w:rPr>
+              <w:t xml:space="preserve">Private chef as an employee</w:t>
+            </w:r>
+          </w:p>
+        </w:tc>
+        <w:tc>
+          <w:tcPr>
+            <w:tcW w:w="3360" w:type="dxa"/>
+          </w:tcPr>
+          <w:p>
+            <w:pPr>
+              <w:spacing w:before="40" w:after="40"/>
+            </w:pPr>
+            <w:r>
+              <w:rPr>
+                <w:b/>
+                <w:sz w:val="18"/>
+              </w:rPr>
+              <w:t xml:space="preserve">~$29.75/hour</w:t>
+            </w:r>
+            <w:r>
+              <w:rPr>
+                <w:sz w:val="18"/>
+              </w:rPr>
+              <w:t xml:space="preserve"> (mid-2026 average)</w:t>
+            </w:r>
+          </w:p>
+        </w:tc>
+        <w:tc>
+          <w:tcPr>
+            <w:tcW w:w="3360" w:type="dxa"/>
+          </w:tcPr>
+          <w:p>
+            <w:pPr>
+              <w:spacing w:before="40" w:after="40"/>
+            </w:pPr>
+            <w:r>
+              <w:rPr>
+                <w:sz w:val="18"/>
+              </w:rPr>
+              <w:t xml:space="preserve">Indeed, via </w:t>
+            </w:r>
+            <w:hyperlink r:id="rHl47">
+              <w:r>
+                <w:rPr>
+                  <w:rStyle w:val="Hyperlink"/>
+                  <w:sz w:val="18"/>
+                </w:rPr>
+                <w:t xml:space="preserve">search</w:t>
+              </w:r>
+            </w:hyperlink>
+          </w:p>
+        </w:tc>
+      </w:tr>
+      <w:tr>
+        <w:tc>
+          <w:tcPr>
+            <w:tcW w:w="3360" w:type="dxa"/>
+          </w:tcPr>
+          <w:p>
+            <w:pPr>
+              <w:spacing w:before="40" w:after="40"/>
+            </w:pPr>
+            <w:r>
+              <w:rPr>
+                <w:sz w:val="18"/>
+              </w:rPr>
+              <w:t xml:space="preserve">Personal meal-prep chef, Chicago</w:t>
+            </w:r>
+          </w:p>
+        </w:tc>
+        <w:tc>
+          <w:tcPr>
+            <w:tcW w:w="3360" w:type="dxa"/>
+          </w:tcPr>
+          <w:p>
+            <w:pPr>
+              <w:spacing w:before="40" w:after="40"/>
+            </w:pPr>
+            <w:r>
+              <w:rPr>
+                <w:b/>
+                <w:sz w:val="18"/>
+              </w:rPr>
+              <w:t xml:space="preserve">$44K–$155K</w:t>
+            </w:r>
+          </w:p>
+        </w:tc>
+        <w:tc>
+          <w:tcPr>
+            <w:tcW w:w="3360" w:type="dxa"/>
+          </w:tcPr>
+          <w:p>
+            <w:pPr>
+              <w:spacing w:before="40" w:after="40"/>
+            </w:pPr>
+            <w:hyperlink r:id="rHl49">
+              <w:r>
+                <w:rPr>
+                  <w:rStyle w:val="Hyperlink"/>
+                  <w:sz w:val="18"/>
+                </w:rPr>
+                <w:t xml:space="preserve">ZipRecruiter</w:t>
+              </w:r>
+            </w:hyperlink>
+          </w:p>
+        </w:tc>
+      </w:tr>
+      <w:tr>
+        <w:tc>
+          <w:tcPr>
+            <w:tcW w:w="3360" w:type="dxa"/>
+          </w:tcPr>
+          <w:p>
+            <w:pPr>
+              <w:spacing w:before="40" w:after="40"/>
+            </w:pPr>
+            <w:r>
+              <w:rPr>
+                <w:sz w:val="18"/>
+              </w:rPr>
+              <w:t xml:space="preserve">Typical engagement</w:t>
+            </w:r>
+          </w:p>
+        </w:tc>
+        <w:tc>
+          <w:tcPr>
+            <w:tcW w:w="3360" w:type="dxa"/>
+          </w:tcPr>
+          <w:p>
+            <w:pPr>
+              <w:spacing w:before="40" w:after="40"/>
+            </w:pPr>
+            <w:r>
+              <w:rPr>
+                <w:sz w:val="18"/>
+              </w:rPr>
+              <w:t xml:space="preserve">5–15 hours/week per family</w:t>
+            </w:r>
+          </w:p>
+        </w:tc>
+        <w:tc>
+          <w:tcPr>
+            <w:tcW w:w="3360" w:type="dxa"/>
+          </w:tcPr>
+          <w:p>
+            <w:pPr>
+              <w:spacing w:before="40" w:after="40"/>
+            </w:pPr>
+            <w:hyperlink r:id="rHl50">
+              <w:r>
+                <w:rPr>
+                  <w:rStyle w:val="Hyperlink"/>
+                  <w:sz w:val="18"/>
+                </w:rPr>
+                <w:t xml:space="preserve">Friend That Cooks</w:t>
+              </w:r>
+            </w:hyperlink>
+          </w:p>
+        </w:tc>
+      </w:tr>
+    </w:tbl>
+    <w:p>
+      <w:pPr>
+        <w:spacing w:after="0"/>
+      </w:pPr>
+    </w:p>
+    <w:p>
+      <w:pPr>
+        <w:pStyle w:val="Heading2"/>
+      </w:pPr>
+      <w:r>
+        <w:t xml:space="preserve">2. The nutrition brain: dietitians and coaches</w:t>
+      </w:r>
+    </w:p>
+    <w:tbl>
+      <w:tblPr>
+        <w:tblW w:w="10080" w:type="dxa"/>
+        <w:tblBorders>
+          <w:top w:val="single" w:sz="4" w:space="0" w:color="C9CCD1"/>
+          <w:left w:val="single" w:sz="4" w:space="0" w:color="C9CCD1"/>
+          <w:bottom w:val="single" w:sz="4" w:space="0" w:color="C9CCD1"/>
+          <w:right w:val="single" w:sz="4" w:space="0" w:color="C9CCD1"/>
+          <w:insideH w:val="single" w:sz="4" w:space="0" w:color="C9CCD1"/>
+          <w:insideV w:val="single" w:sz="4" w:space="0" w:color="C9CCD1"/>
+        </w:tblBorders>
+        <w:tblLayout w:type="fixed"/>
+      </w:tblPr>
+      <w:tblGrid>
+        <w:gridCol w:w="3360"/>
+        <w:gridCol w:w="3360"/>
+        <w:gridCol w:w="3360"/>
+      </w:tblGrid>
+      <w:tr>
+        <w:trPr>
+          <w:tblHeader/>
+        </w:trPr>
+        <w:tc>
+          <w:tcPr>
+            <w:tcW w:w="3360" w:type="dxa"/>
+            <w:shd w:val="clear" w:color="auto" w:fill="EFF1F3"/>
+          </w:tcPr>
+          <w:p>
+            <w:pPr>
+              <w:spacing w:before="40" w:after="40"/>
+            </w:pPr>
+            <w:r>
+              <w:rPr>
+                <w:b/>
+                <w:sz w:val="18"/>
+              </w:rPr>
+              <w:t xml:space="preserve">Role</w:t>
+            </w:r>
+          </w:p>
+        </w:tc>
+        <w:tc>
+          <w:tcPr>
+            <w:tcW w:w="3360" w:type="dxa"/>
+            <w:shd w:val="clear" w:color="auto" w:fill="EFF1F3"/>
+          </w:tcPr>
+          <w:p>
+            <w:pPr>
+              <w:spacing w:before="40" w:after="40"/>
+            </w:pPr>
+            <w:r>
+              <w:rPr>
+                <w:b/>
+                <w:sz w:val="18"/>
+              </w:rPr>
+              <w:t xml:space="preserve">Pay</w:t>
+            </w:r>
+          </w:p>
+        </w:tc>
+        <w:tc>
+          <w:tcPr>
+            <w:tcW w:w="3360" w:type="dxa"/>
+            <w:shd w:val="clear" w:color="auto" w:fill="EFF1F3"/>
+          </w:tcPr>
+          <w:p>
+            <w:pPr>
+              <w:spacing w:before="40" w:after="40"/>
+            </w:pPr>
+            <w:r>
+              <w:rPr>
+                <w:b/>
+                <w:sz w:val="18"/>
+              </w:rPr>
+              <w:t xml:space="preserve">Source</w:t>
+            </w:r>
+          </w:p>
+        </w:tc>
+      </w:tr>
+      <w:tr>
+        <w:tc>
+          <w:tcPr>
+            <w:tcW w:w="3360" w:type="dxa"/>
+          </w:tcPr>
+          <w:p>
+            <w:pPr>
+              <w:spacing w:before="40" w:after="40"/>
+            </w:pPr>
+            <w:r>
+              <w:rPr>
+                <w:sz w:val="18"/>
+              </w:rPr>
+              <w:t xml:space="preserve">Registered dietitian / nutritionist (BLS, 2025 median)</w:t>
+            </w:r>
+          </w:p>
+        </w:tc>
+        <w:tc>
+          <w:tcPr>
+            <w:tcW w:w="3360" w:type="dxa"/>
+          </w:tcPr>
+          <w:p>
+            <w:pPr>
+              <w:spacing w:before="40" w:after="40"/>
+            </w:pPr>
+            <w:r>
+              <w:rPr>
+                <w:b/>
+                <w:sz w:val="18"/>
+              </w:rPr>
+              <w:t xml:space="preserve">$76,400/yr — $36.73/hour</w:t>
+            </w:r>
+            <w:r>
+              <w:rPr>
+                <w:sz w:val="18"/>
+              </w:rPr>
+              <w:t xml:space="preserve">; 86,300 jobs; +8% growth 2025–2035</w:t>
+            </w:r>
+          </w:p>
+        </w:tc>
+        <w:tc>
+          <w:tcPr>
+            <w:tcW w:w="3360" w:type="dxa"/>
+          </w:tcPr>
+          <w:p>
+            <w:pPr>
+              <w:spacing w:before="40" w:after="40"/>
+            </w:pPr>
+            <w:hyperlink r:id="rHl51">
+              <w:r>
+                <w:rPr>
+                  <w:rStyle w:val="Hyperlink"/>
+                  <w:sz w:val="18"/>
+                </w:rPr>
+                <w:t xml:space="preserve">BLS OOH</w:t>
+              </w:r>
+            </w:hyperlink>
+          </w:p>
+        </w:tc>
+      </w:tr>
+      <w:tr>
+        <w:tc>
+          <w:tcPr>
+            <w:tcW w:w="3360" w:type="dxa"/>
+          </w:tcPr>
+          <w:p>
+            <w:pPr>
+              <w:spacing w:before="40" w:after="40"/>
+            </w:pPr>
+            <w:r>
+              <w:rPr>
+                <w:sz w:val="18"/>
+              </w:rPr>
+              <w:t xml:space="preserve">Foodsmart remote RD partner</w:t>
+            </w:r>
+          </w:p>
+        </w:tc>
+        <w:tc>
+          <w:tcPr>
+            <w:tcW w:w="3360" w:type="dxa"/>
+          </w:tcPr>
+          <w:p>
+            <w:pPr>
+              <w:spacing w:before="40" w:after="40"/>
+            </w:pPr>
+            <w:r>
+              <w:rPr>
+                <w:b/>
+                <w:sz w:val="18"/>
+              </w:rPr>
+              <w:t xml:space="preserve">$52.80 per 1-hour visit</w:t>
+            </w:r>
+          </w:p>
+        </w:tc>
+        <w:tc>
+          <w:tcPr>
+            <w:tcW w:w="3360" w:type="dxa"/>
+          </w:tcPr>
+          <w:p>
+            <w:pPr>
+              <w:spacing w:before="40" w:after="40"/>
+            </w:pPr>
+            <w:hyperlink r:id="rHl52">
+              <w:r>
+                <w:rPr>
+                  <w:rStyle w:val="Hyperlink"/>
+                  <w:sz w:val="18"/>
+                </w:rPr>
+                <w:t xml:space="preserve">Foodsmart posting</w:t>
+              </w:r>
+            </w:hyperlink>
+          </w:p>
+        </w:tc>
+      </w:tr>
+      <w:tr>
+        <w:tc>
+          <w:tcPr>
+            <w:tcW w:w="3360" w:type="dxa"/>
+          </w:tcPr>
+          <w:p>
+            <w:pPr>
+              <w:spacing w:before="40" w:after="40"/>
+            </w:pPr>
+            <w:r>
+              <w:rPr>
+                <w:sz w:val="18"/>
+              </w:rPr>
+              <w:t xml:space="preserve">Nutrition coach (general)</w:t>
+            </w:r>
+          </w:p>
+        </w:tc>
+        <w:tc>
+          <w:tcPr>
+            <w:tcW w:w="3360" w:type="dxa"/>
+          </w:tcPr>
+          <w:p>
+            <w:pPr>
+              <w:spacing w:before="40" w:after="40"/>
+            </w:pPr>
+            <w:r>
+              <w:rPr>
+                <w:b/>
+                <w:sz w:val="18"/>
+              </w:rPr>
+              <w:t xml:space="preserve">$21.07/hr</w:t>
+            </w:r>
+            <w:r>
+              <w:rPr>
+                <w:sz w:val="18"/>
+              </w:rPr>
+              <w:t xml:space="preserve"> avg ($19.47–$23.08)</w:t>
+            </w:r>
+          </w:p>
+        </w:tc>
+        <w:tc>
+          <w:tcPr>
+            <w:tcW w:w="3360" w:type="dxa"/>
+          </w:tcPr>
+          <w:p>
+            <w:pPr>
+              <w:spacing w:before="40" w:after="40"/>
+            </w:pPr>
+            <w:hyperlink r:id="rHl53">
+              <w:r>
+                <w:rPr>
+                  <w:rStyle w:val="Hyperlink"/>
+                  <w:sz w:val="18"/>
+                </w:rPr>
+                <w:t xml:space="preserve">ZipRecruiter</w:t>
+              </w:r>
+            </w:hyperlink>
+          </w:p>
+        </w:tc>
+      </w:tr>
+      <w:tr>
+        <w:tc>
+          <w:tcPr>
+            <w:tcW w:w="3360" w:type="dxa"/>
+          </w:tcPr>
+          <w:p>
+            <w:pPr>
+              <w:spacing w:before="40" w:after="40"/>
+            </w:pPr>
+            <w:r>
+              <w:rPr>
+                <w:sz w:val="18"/>
+              </w:rPr>
+              <w:t xml:space="preserve">NASM-certified nutrition coach</w:t>
+            </w:r>
+          </w:p>
+        </w:tc>
+        <w:tc>
+          <w:tcPr>
+            <w:tcW w:w="3360" w:type="dxa"/>
+          </w:tcPr>
+          <w:p>
+            <w:pPr>
+              <w:spacing w:before="40" w:after="40"/>
+            </w:pPr>
+            <w:r>
+              <w:rPr>
+                <w:b/>
+                <w:sz w:val="18"/>
+              </w:rPr>
+              <w:t xml:space="preserve">$19.83/hr</w:t>
+            </w:r>
+            <w:r>
+              <w:rPr>
+                <w:sz w:val="18"/>
+              </w:rPr>
+              <w:t xml:space="preserve"> ($16.59–$22.12)</w:t>
+            </w:r>
+          </w:p>
+        </w:tc>
+        <w:tc>
+          <w:tcPr>
+            <w:tcW w:w="3360" w:type="dxa"/>
+          </w:tcPr>
+          <w:p>
+            <w:pPr>
+              <w:spacing w:before="40" w:after="40"/>
+            </w:pPr>
+            <w:hyperlink r:id="rHl54">
+              <w:r>
+                <w:rPr>
+                  <w:rStyle w:val="Hyperlink"/>
+                  <w:sz w:val="18"/>
+                </w:rPr>
+                <w:t xml:space="preserve">ZipRecruiter</w:t>
+              </w:r>
+            </w:hyperlink>
+          </w:p>
+        </w:tc>
+      </w:tr>
+      <w:tr>
+        <w:tc>
+          <w:tcPr>
+            <w:tcW w:w="3360" w:type="dxa"/>
+          </w:tcPr>
+          <w:p>
+            <w:pPr>
+              <w:spacing w:before="40" w:after="40"/>
+            </w:pPr>
+            <w:r>
+              <w:rPr>
+                <w:sz w:val="18"/>
+              </w:rPr>
+              <w:t xml:space="preserve">"Food as medicine" roles generally</w:t>
+            </w:r>
+          </w:p>
+        </w:tc>
+        <w:tc>
+          <w:tcPr>
+            <w:tcW w:w="3360" w:type="dxa"/>
+          </w:tcPr>
+          <w:p>
+            <w:pPr>
+              <w:spacing w:before="40" w:after="40"/>
+            </w:pPr>
+            <w:r>
+              <w:rPr>
+                <w:b/>
+                <w:sz w:val="18"/>
+              </w:rPr>
+              <w:t xml:space="preserve">$16.72/hr</w:t>
+            </w:r>
+            <w:r>
+              <w:rPr>
+                <w:sz w:val="18"/>
+              </w:rPr>
+              <w:t xml:space="preserve"> avg</w:t>
+            </w:r>
+          </w:p>
+        </w:tc>
+        <w:tc>
+          <w:tcPr>
+            <w:tcW w:w="3360" w:type="dxa"/>
+          </w:tcPr>
+          <w:p>
+            <w:pPr>
+              <w:spacing w:before="40" w:after="40"/>
+            </w:pPr>
+            <w:hyperlink r:id="rHl55">
+              <w:r>
+                <w:rPr>
+                  <w:rStyle w:val="Hyperlink"/>
+                  <w:sz w:val="18"/>
+                </w:rPr>
+                <w:t xml:space="preserve">ZipRecruiter</w:t>
+              </w:r>
+            </w:hyperlink>
+          </w:p>
+        </w:tc>
+      </w:tr>
+    </w:tbl>
+    <w:p>
+      <w:pPr>
+        <w:spacing w:after="0"/>
+      </w:pPr>
+    </w:p>
+    <w:p>
+      <w:pPr>
+        <w:pStyle w:val="Heading2"/>
+      </w:pPr>
+      <w:r>
+        <w:t xml:space="preserve">3. The hands: shoppers and meal-prep assistants</w:t>
+      </w:r>
+    </w:p>
+    <w:tbl>
+      <w:tblPr>
+        <w:tblW w:w="10080" w:type="dxa"/>
+        <w:tblBorders>
+          <w:top w:val="single" w:sz="4" w:space="0" w:color="C9CCD1"/>
+          <w:left w:val="single" w:sz="4" w:space="0" w:color="C9CCD1"/>
+          <w:bottom w:val="single" w:sz="4" w:space="0" w:color="C9CCD1"/>
+          <w:right w:val="single" w:sz="4" w:space="0" w:color="C9CCD1"/>
+          <w:insideH w:val="single" w:sz="4" w:space="0" w:color="C9CCD1"/>
+          <w:insideV w:val="single" w:sz="4" w:space="0" w:color="C9CCD1"/>
+        </w:tblBorders>
+        <w:tblLayout w:type="fixed"/>
+      </w:tblPr>
+      <w:tblGrid>
+        <w:gridCol w:w="3360"/>
+        <w:gridCol w:w="3360"/>
+        <w:gridCol w:w="3360"/>
+      </w:tblGrid>
+      <w:tr>
+        <w:trPr>
+          <w:tblHeader/>
+        </w:trPr>
+        <w:tc>
+          <w:tcPr>
+            <w:tcW w:w="3360" w:type="dxa"/>
+            <w:shd w:val="clear" w:color="auto" w:fill="EFF1F3"/>
+          </w:tcPr>
+          <w:p>
+            <w:pPr>
+              <w:spacing w:before="40" w:after="40"/>
+            </w:pPr>
+            <w:r>
+              <w:rPr>
+                <w:b/>
+                <w:sz w:val="18"/>
+              </w:rPr>
+              <w:t xml:space="preserve">Role</w:t>
+            </w:r>
+          </w:p>
+        </w:tc>
+        <w:tc>
+          <w:tcPr>
+            <w:tcW w:w="3360" w:type="dxa"/>
+            <w:shd w:val="clear" w:color="auto" w:fill="EFF1F3"/>
+          </w:tcPr>
+          <w:p>
+            <w:pPr>
+              <w:spacing w:before="40" w:after="40"/>
+            </w:pPr>
+            <w:r>
+              <w:rPr>
+                <w:b/>
+                <w:sz w:val="18"/>
+              </w:rPr>
+              <w:t xml:space="preserve">Pay</w:t>
+            </w:r>
+          </w:p>
+        </w:tc>
+        <w:tc>
+          <w:tcPr>
+            <w:tcW w:w="3360" w:type="dxa"/>
+            <w:shd w:val="clear" w:color="auto" w:fill="EFF1F3"/>
+          </w:tcPr>
+          <w:p>
+            <w:pPr>
+              <w:spacing w:before="40" w:after="40"/>
+            </w:pPr>
+            <w:r>
+              <w:rPr>
+                <w:b/>
+                <w:sz w:val="18"/>
+              </w:rPr>
+              <w:t xml:space="preserve">Source</w:t>
+            </w:r>
+          </w:p>
+        </w:tc>
+      </w:tr>
+      <w:tr>
+        <w:tc>
+          <w:tcPr>
+            <w:tcW w:w="3360" w:type="dxa"/>
+          </w:tcPr>
+          <w:p>
+            <w:pPr>
+              <w:spacing w:before="40" w:after="40"/>
+            </w:pPr>
+            <w:r>
+              <w:rPr>
+                <w:sz w:val="18"/>
+              </w:rPr>
+              <w:t xml:space="preserve">Personal grocery shopper</w:t>
+            </w:r>
+          </w:p>
+        </w:tc>
+        <w:tc>
+          <w:tcPr>
+            <w:tcW w:w="3360" w:type="dxa"/>
+          </w:tcPr>
+          <w:p>
+            <w:pPr>
+              <w:spacing w:before="40" w:after="40"/>
+            </w:pPr>
+            <w:r>
+              <w:rPr>
+                <w:b/>
+                <w:sz w:val="18"/>
+              </w:rPr>
+              <w:t xml:space="preserve">$12.45–$18.03/hr</w:t>
+            </w:r>
+            <w:r>
+              <w:rPr>
+                <w:sz w:val="18"/>
+              </w:rPr>
+              <w:t xml:space="preserve"> typical; NY </w:t>
+            </w:r>
+            <w:r>
+              <w:rPr>
+                <w:b/>
+                <w:sz w:val="18"/>
+              </w:rPr>
+              <w:t xml:space="preserve">$17.72</w:t>
+            </w:r>
+            <w:r>
+              <w:rPr>
+                <w:sz w:val="18"/>
+              </w:rPr>
+              <w:t xml:space="preserve">, Jacksonville </w:t>
+            </w:r>
+            <w:r>
+              <w:rPr>
+                <w:b/>
+                <w:sz w:val="18"/>
+              </w:rPr>
+              <w:t xml:space="preserve">$15.01</w:t>
+            </w:r>
+          </w:p>
+        </w:tc>
+        <w:tc>
+          <w:tcPr>
+            <w:tcW w:w="3360" w:type="dxa"/>
+          </w:tcPr>
+          <w:p>
+            <w:pPr>
+              <w:spacing w:before="40" w:after="40"/>
+            </w:pPr>
+            <w:hyperlink r:id="rHl56">
+              <w:r>
+                <w:rPr>
+                  <w:rStyle w:val="Hyperlink"/>
+                  <w:sz w:val="18"/>
+                </w:rPr>
+                <w:t xml:space="preserve">ZipRecruiter</w:t>
+              </w:r>
+            </w:hyperlink>
+          </w:p>
+        </w:tc>
+      </w:tr>
+      <w:tr>
+        <w:tc>
+          <w:tcPr>
+            <w:tcW w:w="3360" w:type="dxa"/>
+          </w:tcPr>
+          <w:p>
+            <w:pPr>
+              <w:spacing w:before="40" w:after="40"/>
+            </w:pPr>
+            <w:r>
+              <w:rPr>
+                <w:sz w:val="18"/>
+              </w:rPr>
+              <w:t xml:space="preserve">Personal shopper (general)</w:t>
+            </w:r>
+          </w:p>
+        </w:tc>
+        <w:tc>
+          <w:tcPr>
+            <w:tcW w:w="3360" w:type="dxa"/>
+          </w:tcPr>
+          <w:p>
+            <w:pPr>
+              <w:spacing w:before="40" w:after="40"/>
+            </w:pPr>
+            <w:r>
+              <w:rPr>
+                <w:b/>
+                <w:sz w:val="18"/>
+              </w:rPr>
+              <w:t xml:space="preserve">$14–$21/hr</w:t>
+            </w:r>
+          </w:p>
+        </w:tc>
+        <w:tc>
+          <w:tcPr>
+            <w:tcW w:w="3360" w:type="dxa"/>
+          </w:tcPr>
+          <w:p>
+            <w:pPr>
+              <w:spacing w:before="40" w:after="40"/>
+            </w:pPr>
+            <w:hyperlink r:id="rHl57">
+              <w:r>
+                <w:rPr>
+                  <w:rStyle w:val="Hyperlink"/>
+                  <w:sz w:val="18"/>
+                </w:rPr>
+                <w:t xml:space="preserve">Indeed Flex</w:t>
+              </w:r>
+            </w:hyperlink>
+          </w:p>
+        </w:tc>
+      </w:tr>
+      <w:tr>
+        <w:tc>
+          <w:tcPr>
+            <w:tcW w:w="3360" w:type="dxa"/>
+          </w:tcPr>
+          <w:p>
+            <w:pPr>
+              <w:spacing w:before="40" w:after="40"/>
+            </w:pPr>
+            <w:r>
+              <w:rPr>
+                <w:sz w:val="18"/>
+              </w:rPr>
+              <w:t xml:space="preserve">Meal prep assistant</w:t>
+            </w:r>
+          </w:p>
+        </w:tc>
+        <w:tc>
+          <w:tcPr>
+            <w:tcW w:w="3360" w:type="dxa"/>
+          </w:tcPr>
+          <w:p>
+            <w:pPr>
+              <w:spacing w:before="40" w:after="40"/>
+            </w:pPr>
+            <w:r>
+              <w:rPr>
+                <w:b/>
+                <w:sz w:val="18"/>
+              </w:rPr>
+              <w:t xml:space="preserve">$18.95/hr</w:t>
+            </w:r>
+            <w:r>
+              <w:rPr>
+                <w:sz w:val="18"/>
+              </w:rPr>
+              <w:t xml:space="preserve"> avg ($15.14–$21.15) — postings bundle errands, grocery shopping and transportation</w:t>
+            </w:r>
+          </w:p>
+        </w:tc>
+        <w:tc>
+          <w:tcPr>
+            <w:tcW w:w="3360" w:type="dxa"/>
+          </w:tcPr>
+          <w:p>
+            <w:pPr>
+              <w:spacing w:before="40" w:after="40"/>
+            </w:pPr>
+            <w:hyperlink r:id="rHl58">
+              <w:r>
+                <w:rPr>
+                  <w:rStyle w:val="Hyperlink"/>
+                  <w:sz w:val="18"/>
+                </w:rPr>
+                <w:t xml:space="preserve">ZipRecruiter</w:t>
+              </w:r>
+            </w:hyperlink>
+          </w:p>
+        </w:tc>
+      </w:tr>
+      <w:tr>
+        <w:tc>
+          <w:tcPr>
+            <w:tcW w:w="3360" w:type="dxa"/>
+          </w:tcPr>
+          <w:p>
+            <w:pPr>
+              <w:spacing w:before="40" w:after="40"/>
+            </w:pPr>
+            <w:r>
+              <w:rPr>
+                <w:sz w:val="18"/>
+              </w:rPr>
+              <w:t xml:space="preserve">Meal prep (general)</w:t>
+            </w:r>
+          </w:p>
+        </w:tc>
+        <w:tc>
+          <w:tcPr>
+            <w:tcW w:w="3360" w:type="dxa"/>
+          </w:tcPr>
+          <w:p>
+            <w:pPr>
+              <w:spacing w:before="40" w:after="40"/>
+            </w:pPr>
+            <w:r>
+              <w:rPr>
+                <w:b/>
+                <w:sz w:val="18"/>
+              </w:rPr>
+              <w:t xml:space="preserve">$15.69/hr</w:t>
+            </w:r>
+            <w:r>
+              <w:rPr>
+                <w:sz w:val="18"/>
+              </w:rPr>
+              <w:t xml:space="preserve"> avg ($13.70–$17.31)</w:t>
+            </w:r>
+          </w:p>
+        </w:tc>
+        <w:tc>
+          <w:tcPr>
+            <w:tcW w:w="3360" w:type="dxa"/>
+          </w:tcPr>
+          <w:p>
+            <w:pPr>
+              <w:spacing w:before="40" w:after="40"/>
+            </w:pPr>
+            <w:hyperlink r:id="rHl59">
+              <w:r>
+                <w:rPr>
+                  <w:rStyle w:val="Hyperlink"/>
+                  <w:sz w:val="18"/>
+                </w:rPr>
+                <w:t xml:space="preserve">ZipRecruiter</w:t>
+              </w:r>
+            </w:hyperlink>
+          </w:p>
+        </w:tc>
+      </w:tr>
+    </w:tbl>
+    <w:p>
+      <w:pPr>
+        <w:spacing w:after="0"/>
+      </w:pPr>
+    </w:p>
+    <w:p>
+      <w:pPr>
+        <w:pStyle w:val="Heading2"/>
+      </w:pPr>
+      <w:r>
+        <w:t xml:space="preserve">4. The institutional buyer: food-as-medicine companies</w:t>
+      </w:r>
+    </w:p>
+    <w:p>
+      <w:r>
+        <w:t xml:space="preserve">This is where diet-driven grocery ordering is already a </w:t>
+      </w:r>
+      <w:r>
+        <w:rPr>
+          <w:b/>
+        </w:rPr>
+        <w:t xml:space="preserve">funded, staffed job function</w:t>
+      </w:r>
+      <w:r>
+        <w:t xml:space="preserve"> — paid for by health plans rather than consumers. Employers include </w:t>
+      </w:r>
+      <w:r>
+        <w:rPr>
+          <w:b/>
+        </w:rPr>
+        <w:t xml:space="preserve">Foodsmart</w:t>
+      </w:r>
+      <w:r>
+        <w:t xml:space="preserve"> (RDs guide members to affordable groceries through an online marketplace), </w:t>
+      </w:r>
+      <w:r>
+        <w:rPr>
+          <w:b/>
+        </w:rPr>
+        <w:t xml:space="preserve">NourishedRX</w:t>
+      </w:r>
+      <w:r>
+        <w:t xml:space="preserve"> (medically tailored meals, meal kits and grocery kits), and </w:t>
+      </w:r>
+      <w:r>
+        <w:rPr>
+          <w:b/>
+        </w:rPr>
+        <w:t xml:space="preserve">Community Servings</w:t>
+      </w:r>
+      <w:r>
+        <w:t xml:space="preserve">. Job descriptions explicitly combine nutrition therapy with grocery access. (</w:t>
+      </w:r>
+      <w:hyperlink r:id="rHl52">
+        <w:r>
+          <w:rPr>
+            <w:rStyle w:val="Hyperlink"/>
+          </w:rPr>
+          <w:t xml:space="preserve">Foodsmart</w:t>
+        </w:r>
+      </w:hyperlink>
+      <w:r>
+        <w:t xml:space="preserve">; </w:t>
+      </w:r>
+      <w:hyperlink r:id="rHl55">
+        <w:r>
+          <w:rPr>
+            <w:rStyle w:val="Hyperlink"/>
+          </w:rPr>
+          <w:t xml:space="preserve">Food as Medicine roles</w:t>
+        </w:r>
+      </w:hyperlink>
+      <w:r>
+        <w:t xml:space="preserve">; </w:t>
+      </w:r>
+      <w:hyperlink r:id="rHl60">
+        <w:r>
+          <w:rPr>
+            <w:rStyle w:val="Hyperlink"/>
+          </w:rPr>
+          <w:t xml:space="preserve">Community Servings</w:t>
+        </w:r>
+      </w:hyperlink>
+      <w:r>
+        <w:t xml:space="preserve">)</w:t>
+      </w:r>
+    </w:p>
+    <w:p>
+      <w:pPr>
+        <w:pStyle w:val="Heading2"/>
+      </w:pPr>
+      <w:r>
+        <w:t xml:space="preserve">What this tells you about pricing</w:t>
+      </w:r>
+    </w:p>
+    <w:p>
+      <w:r>
+        <w:t xml:space="preserve">Stack the human version of the job for one household:</w:t>
+      </w:r>
+    </w:p>
+    <w:p>
+      <w:pPr>
+        <w:numPr>
+          <w:ilvl w:val="0"/>
+          <w:numId w:val="1"/>
+        </w:numPr>
+      </w:pPr>
+      <w:r>
+        <w:rPr>
+          <w:b/>
+        </w:rPr>
+        <w:t xml:space="preserve">Nutrition plan:</w:t>
+      </w:r>
+      <w:r>
+        <w:t xml:space="preserve"> one RD hour ≈ </w:t>
+      </w:r>
+      <w:r>
+        <w:rPr>
+          <w:b/>
+        </w:rPr>
+        <w:t xml:space="preserve">$37–$53</w:t>
+      </w:r>
+    </w:p>
+    <w:p>
+      <w:pPr>
+        <w:numPr>
+          <w:ilvl w:val="0"/>
+          <w:numId w:val="1"/>
+        </w:numPr>
+      </w:pPr>
+      <w:r>
+        <w:rPr>
+          <w:b/>
+        </w:rPr>
+        <w:t xml:space="preserve">Shopping and ordering:</w:t>
+      </w:r>
+      <w:r>
+        <w:t xml:space="preserve"> 2 hrs/week × ~$16/hr ≈ </w:t>
+      </w:r>
+      <w:r>
+        <w:rPr>
+          <w:b/>
+        </w:rPr>
+        <w:t xml:space="preserve">$32/week ≈ $139/month</w:t>
+      </w:r>
+    </w:p>
+    <w:p>
+      <w:pPr>
+        <w:numPr>
+          <w:ilvl w:val="0"/>
+          <w:numId w:val="1"/>
+        </w:numPr>
+      </w:pPr>
+      <w:r>
+        <w:rPr>
+          <w:b/>
+        </w:rPr>
+        <w:t xml:space="preserve">Or the all-in-one human:</w:t>
+      </w:r>
+      <w:r>
+        <w:t xml:space="preserve"> a personal chef at 5 hrs/week in Chicago ≈ </w:t>
+      </w:r>
+      <w:r>
+        <w:rPr>
+          <w:b/>
+        </w:rPr>
+        <w:t xml:space="preserve">$395/week</w:t>
+      </w:r>
+    </w:p>
+    <w:p>
+      <w:r>
+        <w:t xml:space="preserve">So the human-labor equivalent of what this app would do runs from roughly </w:t>
+      </w:r>
+      <w:r>
+        <w:rPr>
+          <w:b/>
+        </w:rPr>
+        <w:t xml:space="preserve">$150/month (coach + shopper, unbundled)</w:t>
+      </w:r>
+      <w:r>
+        <w:t xml:space="preserve"> to </w:t>
+      </w:r>
+      <w:r>
+        <w:rPr>
+          <w:b/>
+        </w:rPr>
+        <w:t xml:space="preserve">$1,500+/month (personal chef)</w:t>
+      </w:r>
+      <w:r>
+        <w:t xml:space="preserve">. Against that, the apps people are currently rage-quitting charge </w:t>
+      </w:r>
+      <w:r>
+        <w:rPr>
+          <w:b/>
+        </w:rPr>
+        <w:t xml:space="preserve">$11–$20/month</w:t>
+      </w:r>
+      <w:r>
+        <w:t xml:space="preserve"> — and 39% of the complaints are about *that* charge. The gap between what the job is worth ($150+) and what the category has trained users to pay ($11) is the central pricing problem for this project, and the B2B/health-plan channel is where that gap closes.</w:t>
+      </w:r>
+    </w:p>
+    <w:p>
+      <w:pPr>
+        <w:pBdr>
+          <w:bottom w:val="single" w:sz="6" w:space="6" w:color="C9CCD1"/>
+        </w:pBdr>
+      </w:pPr>
+    </w:p>
+    <w:p>
+      <w:pPr>
+        <w:pStyle w:val="Heading1"/>
+      </w:pPr>
+      <w:r>
+        <w:t xml:space="preserve">Flags and gaps</w:t>
+      </w:r>
+    </w:p>
+    <w:tbl>
+      <w:tblPr>
+        <w:tblW w:w="10080" w:type="dxa"/>
+        <w:tblBorders>
+          <w:top w:val="single" w:sz="4" w:space="0" w:color="C9CCD1"/>
+          <w:left w:val="single" w:sz="4" w:space="0" w:color="C9CCD1"/>
+          <w:bottom w:val="single" w:sz="4" w:space="0" w:color="C9CCD1"/>
+          <w:right w:val="single" w:sz="4" w:space="0" w:color="C9CCD1"/>
+          <w:insideH w:val="single" w:sz="4" w:space="0" w:color="C9CCD1"/>
+          <w:insideV w:val="single" w:sz="4" w:space="0" w:color="C9CCD1"/>
+        </w:tblBorders>
+        <w:tblLayout w:type="fixed"/>
+      </w:tblPr>
+      <w:tblGrid>
+        <w:gridCol w:w="5040"/>
+        <w:gridCol w:w="5040"/>
+      </w:tblGrid>
+      <w:tr>
+        <w:trPr>
+          <w:tblHeader/>
+        </w:trPr>
+        <w:tc>
+          <w:tcPr>
+            <w:tcW w:w="5040" w:type="dxa"/>
+            <w:shd w:val="clear" w:color="auto" w:fill="EFF1F3"/>
+          </w:tcPr>
+          <w:p>
+            <w:pPr>
+              <w:spacing w:before="40" w:after="40"/>
+            </w:pPr>
+            <w:r>
+              <w:rPr>
+                <w:b/>
+                <w:sz w:val="18"/>
+              </w:rPr>
+              <w:t xml:space="preserve">Item</w:t>
+            </w:r>
+          </w:p>
+        </w:tc>
+        <w:tc>
+          <w:tcPr>
+            <w:tcW w:w="5040" w:type="dxa"/>
+            <w:shd w:val="clear" w:color="auto" w:fill="EFF1F3"/>
+          </w:tcPr>
+          <w:p>
+            <w:pPr>
+              <w:spacing w:before="40" w:after="40"/>
+            </w:pPr>
+            <w:r>
+              <w:rPr>
+                <w:b/>
+                <w:sz w:val="18"/>
+              </w:rPr>
+              <w:t xml:space="preserve">Status</w:t>
+            </w:r>
+          </w:p>
+        </w:tc>
+      </w:tr>
+      <w:tr>
+        <w:tc>
+          <w:tcPr>
+            <w:tcW w:w="5040" w:type="dxa"/>
+          </w:tcPr>
+          <w:p>
+            <w:pPr>
+              <w:spacing w:before="40" w:after="40"/>
+            </w:pPr>
+            <w:r>
+              <w:rPr>
+                <w:b/>
+                <w:sz w:val="18"/>
+              </w:rPr>
+              <w:t xml:space="preserve">G2 reviews</w:t>
+            </w:r>
+          </w:p>
+        </w:tc>
+        <w:tc>
+          <w:tcPr>
+            <w:tcW w:w="5040" w:type="dxa"/>
+          </w:tcPr>
+          <w:p>
+            <w:pPr>
+              <w:spacing w:before="40" w:after="40"/>
+            </w:pPr>
+            <w:r>
+              <w:rPr>
+                <w:sz w:val="18"/>
+              </w:rPr>
+              <w:t xml:space="preserve">❌ Not obtained — 403 on fetch, blank page in browser. Requested but unavailable.</w:t>
+            </w:r>
+          </w:p>
+        </w:tc>
+      </w:tr>
+      <w:tr>
+        <w:tc>
+          <w:tcPr>
+            <w:tcW w:w="5040" w:type="dxa"/>
+          </w:tcPr>
+          <w:p>
+            <w:pPr>
+              <w:spacing w:before="40" w:after="40"/>
+            </w:pPr>
+            <w:r>
+              <w:rPr>
+                <w:b/>
+                <w:sz w:val="18"/>
+              </w:rPr>
+              <w:t xml:space="preserve">Reddit complaints</w:t>
+            </w:r>
+          </w:p>
+        </w:tc>
+        <w:tc>
+          <w:tcPr>
+            <w:tcW w:w="5040" w:type="dxa"/>
+          </w:tcPr>
+          <w:p>
+            <w:pPr>
+              <w:spacing w:before="40" w:after="40"/>
+            </w:pPr>
+            <w:r>
+              <w:rPr>
+                <w:sz w:val="18"/>
+              </w:rPr>
+              <w:t xml:space="preserve">❌ Not obtained — blocked for search and page access. Requested but unavailable.</w:t>
+            </w:r>
+          </w:p>
+        </w:tc>
+      </w:tr>
+      <w:tr>
+        <w:tc>
+          <w:tcPr>
+            <w:tcW w:w="5040" w:type="dxa"/>
+          </w:tcPr>
+          <w:p>
+            <w:pPr>
+              <w:spacing w:before="40" w:after="40"/>
+            </w:pPr>
+            <w:r>
+              <w:rPr>
+                <w:b/>
+                <w:sz w:val="18"/>
+              </w:rPr>
+              <w:t xml:space="preserve">Verbatim quotes</w:t>
+            </w:r>
+          </w:p>
+        </w:tc>
+        <w:tc>
+          <w:tcPr>
+            <w:tcW w:w="5040" w:type="dxa"/>
+          </w:tcPr>
+          <w:p>
+            <w:pPr>
+              <w:spacing w:before="40" w:after="40"/>
+            </w:pPr>
+            <w:r>
+              <w:rPr>
+                <w:sz w:val="18"/>
+              </w:rPr>
+              <w:t xml:space="preserve">⚠️ Paraphrased rather than reproduced; full original text is in the saved JSON dataset alongside this file.</w:t>
+            </w:r>
+          </w:p>
+        </w:tc>
+      </w:tr>
+      <w:tr>
+        <w:tc>
+          <w:tcPr>
+            <w:tcW w:w="5040" w:type="dxa"/>
+          </w:tcPr>
+          <w:p>
+            <w:pPr>
+              <w:spacing w:before="40" w:after="40"/>
+            </w:pPr>
+            <w:r>
+              <w:rPr>
+                <w:b/>
+                <w:sz w:val="18"/>
+              </w:rPr>
+              <w:t xml:space="preserve">Google Play reviews</w:t>
+            </w:r>
+          </w:p>
+        </w:tc>
+        <w:tc>
+          <w:tcPr>
+            <w:tcW w:w="5040" w:type="dxa"/>
+          </w:tcPr>
+          <w:p>
+            <w:pPr>
+              <w:spacing w:before="40" w:after="40"/>
+            </w:pPr>
+            <w:r>
+              <w:rPr>
+                <w:sz w:val="18"/>
+              </w:rPr>
+              <w:t xml:space="preserve">⚠️ Not collected — only Apple's feed was accessible. Android complaint patterns may differ.</w:t>
+            </w:r>
+          </w:p>
+        </w:tc>
+      </w:tr>
+      <w:tr>
+        <w:tc>
+          <w:tcPr>
+            <w:tcW w:w="5040" w:type="dxa"/>
+          </w:tcPr>
+          <w:p>
+            <w:pPr>
+              <w:spacing w:before="40" w:after="40"/>
+            </w:pPr>
+            <w:r>
+              <w:rPr>
+                <w:b/>
+                <w:sz w:val="18"/>
+              </w:rPr>
+              <w:t xml:space="preserve">Sample skew</w:t>
+            </w:r>
+          </w:p>
+        </w:tc>
+        <w:tc>
+          <w:tcPr>
+            <w:tcW w:w="5040" w:type="dxa"/>
+          </w:tcPr>
+          <w:p>
+            <w:pPr>
+              <w:spacing w:before="40" w:after="40"/>
+            </w:pPr>
+            <w:r>
+              <w:rPr>
+                <w:sz w:val="18"/>
+              </w:rPr>
+              <w:t xml:space="preserve">⚠️ Apple's public feed returns recent reviews, not a random sample, and only 1–3★ ones were kept. These are frequencies *within complaints*, not within all users. All nine apps rate 4.3–4.8★ overall.</w:t>
+            </w:r>
+          </w:p>
+        </w:tc>
+      </w:tr>
+      <w:tr>
+        <w:tc>
+          <w:tcPr>
+            <w:tcW w:w="5040" w:type="dxa"/>
+          </w:tcPr>
+          <w:p>
+            <w:pPr>
+              <w:spacing w:before="40" w:after="40"/>
+            </w:pPr>
+            <w:r>
+              <w:rPr>
+                <w:b/>
+                <w:sz w:val="18"/>
+              </w:rPr>
+              <w:t xml:space="preserve">MacroFactor volume</w:t>
+            </w:r>
+          </w:p>
+        </w:tc>
+        <w:tc>
+          <w:tcPr>
+            <w:tcW w:w="5040" w:type="dxa"/>
+          </w:tcPr>
+          <w:p>
+            <w:pPr>
+              <w:spacing w:before="40" w:after="40"/>
+            </w:pPr>
+            <w:r>
+              <w:rPr>
+                <w:sz w:val="18"/>
+              </w:rPr>
+              <w:t xml:space="preserve">⚠️ 126 critical reviews partly reflects a large, highly engaged user base, not a worse product.</w:t>
+            </w:r>
+          </w:p>
+        </w:tc>
+      </w:tr>
+      <w:tr>
+        <w:tc>
+          <w:tcPr>
+            <w:tcW w:w="5040" w:type="dxa"/>
+          </w:tcPr>
+          <w:p>
+            <w:pPr>
+              <w:spacing w:before="40" w:after="40"/>
+            </w:pPr>
+            <w:r>
+              <w:rPr>
+                <w:b/>
+                <w:sz w:val="18"/>
+              </w:rPr>
+              <w:t xml:space="preserve">Indeed private-chef $29.75/hr</w:t>
+            </w:r>
+          </w:p>
+        </w:tc>
+        <w:tc>
+          <w:tcPr>
+            <w:tcW w:w="5040" w:type="dxa"/>
+          </w:tcPr>
+          <w:p>
+            <w:pPr>
+              <w:spacing w:before="40" w:after="40"/>
+            </w:pPr>
+            <w:r>
+              <w:rPr>
+                <w:sz w:val="18"/>
+              </w:rPr>
+              <w:t xml:space="preserve">⚠️ Came through a search summary, not a directly retrieved Indeed page.</w:t>
+            </w:r>
+          </w:p>
+        </w:tc>
+      </w:tr>
+      <w:tr>
+        <w:tc>
+          <w:tcPr>
+            <w:tcW w:w="5040" w:type="dxa"/>
+          </w:tcPr>
+          <w:p>
+            <w:pPr>
+              <w:spacing w:before="40" w:after="40"/>
+            </w:pPr>
+            <w:r>
+              <w:rPr>
+                <w:b/>
+                <w:sz w:val="18"/>
+              </w:rPr>
+              <w:t xml:space="preserve">Capterra review dates</w:t>
+            </w:r>
+          </w:p>
+        </w:tc>
+        <w:tc>
+          <w:tcPr>
+            <w:tcW w:w="5040" w:type="dxa"/>
+          </w:tcPr>
+          <w:p>
+            <w:pPr>
+              <w:spacing w:before="40" w:after="40"/>
+            </w:pPr>
+            <w:r>
+              <w:rPr>
+                <w:sz w:val="18"/>
+              </w:rPr>
+              <w:t xml:space="preserve">⚠️ Some cited cons pre-date the 18-month window; they're included only where 2025–26 reviews repeat the same point.</w:t>
+            </w:r>
+          </w:p>
+        </w:tc>
+      </w:tr>
+      <w:tr>
+        <w:tc>
+          <w:tcPr>
+            <w:tcW w:w="5040" w:type="dxa"/>
+          </w:tcPr>
+          <w:p>
+            <w:pPr>
+              <w:spacing w:before="40" w:after="40"/>
+            </w:pPr>
+            <w:r>
+              <w:rPr>
+                <w:b/>
+                <w:sz w:val="18"/>
+              </w:rPr>
+              <w:t xml:space="preserve">Theme counts</w:t>
+            </w:r>
+          </w:p>
+        </w:tc>
+        <w:tc>
+          <w:tcPr>
+            <w:tcW w:w="5040" w:type="dxa"/>
+          </w:tcPr>
+          <w:p>
+            <w:pPr>
+              <w:spacing w:before="40" w:after="40"/>
+            </w:pPr>
+            <w:r>
+              <w:rPr>
+                <w:sz w:val="18"/>
+              </w:rPr>
+              <w:t xml:space="preserve">⚠️ Produced by keyword matching over review text, then spot-checked by reading samples. Reviews can count in several themes. Treat as magnitude, not precision.</w:t>
+            </w:r>
+          </w:p>
+        </w:tc>
+      </w:tr>
+    </w:tbl>
+    <w:p>
+      <w:pPr>
+        <w:spacing w:after="0"/>
+      </w:pPr>
     </w:p>
     <w:sectPr>
       <w:pgSz w:w="12240" w:h="15840"/>

</xml_diff>

<commit_message>
Add competitor teardown of nine diet and grocery apps to DietGroceryApp dossier
Co-Authored-By: Claude Opus 5 <noreply@anthropic.com>
</commit_message>
<xml_diff>
--- a/07_DietGroceryApp/ResearchAgents/DietGroceryApp_Research.docx
+++ b/07_DietGroceryApp/ResearchAgents/DietGroceryApp_Research.docx
@@ -82,6 +82,17 @@
       </w:pPr>
       <w:r>
         <w:t xml:space="preserve">Section 2 — Complaint Themes &amp; The Human Job Market: 479 recent critical app reviews grouped into nine themes, plus what companies pay humans to plan, buy and deliver food to a diet spec. *(Added Sept 22, 2026)*</w:t>
+      </w:r>
+    </w:p>
+    <w:p>
+      <w:pPr>
+        <w:numPr>
+          <w:ilvl w:val="0"/>
+          <w:numId w:val="1"/>
+        </w:numPr>
+      </w:pPr>
+      <w:r>
+        <w:t xml:space="preserve">Section 3 — Competitor Teardown: pricing, features, target customer, funding and top complaints for nine apps, plus the gaps nobody serves. *(Added Sept 22, 2026)*</w:t>
       </w:r>
     </w:p>
     <w:p>
@@ -8835,6 +8846,2833 @@
                 <w:sz w:val="18"/>
               </w:rPr>
               <w:t xml:space="preserve">⚠️ Produced by keyword matching over review text, then spot-checked by reading samples. Reviews can count in several themes. Treat as magnitude, not precision.</w:t>
+            </w:r>
+          </w:p>
+        </w:tc>
+      </w:tr>
+    </w:tbl>
+    <w:p>
+      <w:pPr>
+        <w:spacing w:after="0"/>
+      </w:pPr>
+    </w:p>
+    <w:p>
+      <w:r>
+        <w:br w:type="page"/>
+      </w:r>
+    </w:p>
+    <w:p>
+      <w:pPr>
+        <w:pStyle w:val="Title"/>
+      </w:pPr>
+      <w:r>
+        <w:t xml:space="preserve">Competitor Teardown — 9 Apps</w:t>
+      </w:r>
+    </w:p>
+    <w:p>
+      <w:r>
+        <w:rPr>
+          <w:b/>
+        </w:rPr>
+        <w:t xml:space="preserve">Prepared:</w:t>
+      </w:r>
+      <w:r>
+        <w:t xml:space="preserve"> September 22, 2026</w:t>
+      </w:r>
+    </w:p>
+    <w:p>
+      <w:r>
+        <w:rPr>
+          <w:b/>
+        </w:rPr>
+        <w:t xml:space="preserve">Method:</w:t>
+      </w:r>
+      <w:r>
+        <w:t xml:space="preserve"> Prices taken from each company's own pricing page where one exists and is readable; otherwise from the app's App Store listing, which shows in-app purchase prices directly from Apple. Complaints come from the 479 critical App Store reviews (≤3★, since March 22, 2025) collected in </w:t>
+      </w:r>
+      <w:hyperlink r:id="rHl61">
+        <w:r>
+          <w:rPr>
+            <w:rStyle w:val="Hyperlink"/>
+          </w:rPr>
+          <w:t xml:space="preserve">appstore-reviews-2025-2026.json</w:t>
+        </w:r>
+      </w:hyperlink>
+      <w:r>
+        <w:t xml:space="preserve">.</w:t>
+      </w:r>
+    </w:p>
+    <w:p>
+      <w:r>
+        <w:rPr>
+          <w:b/>
+        </w:rPr>
+        <w:t xml:space="preserve">Two standing caveats:</w:t>
+      </w:r>
+    </w:p>
+    <w:p>
+      <w:pPr>
+        <w:numPr>
+          <w:ilvl w:val="0"/>
+          <w:numId w:val="1"/>
+        </w:numPr>
+      </w:pPr>
+      <w:r>
+        <w:rPr>
+          <w:b/>
+        </w:rPr>
+        <w:t xml:space="preserve">Complaints are paraphrased, not quoted.</w:t>
+      </w:r>
+      <w:r>
+        <w:t xml:space="preserve"> I don't reproduce other people's writing verbatim. Each one carries the app, star rating, date and reviewer handle so you can find the original — the exact text of all 479 is in the JSON file above, ready to quote in your coursework.</w:t>
+      </w:r>
+    </w:p>
+    <w:p>
+      <w:pPr>
+        <w:numPr>
+          <w:ilvl w:val="0"/>
+          <w:numId w:val="1"/>
+        </w:numPr>
+      </w:pPr>
+      <w:r>
+        <w:rPr>
+          <w:b/>
+        </w:rPr>
+        <w:t xml:space="preserve">Anything I inferred rather than read is tagged `[UNVERIFIED]`.</w:t>
+      </w:r>
+    </w:p>
+    <w:p>
+      <w:pPr>
+        <w:pBdr>
+          <w:bottom w:val="single" w:sz="6" w:space="6" w:color="C9CCD1"/>
+        </w:pBdr>
+      </w:pPr>
+    </w:p>
+    <w:p>
+      <w:pPr>
+        <w:pStyle w:val="Heading1"/>
+      </w:pPr>
+      <w:r>
+        <w:t xml:space="preserve">Master comparison table</w:t>
+      </w:r>
+    </w:p>
+    <w:tbl>
+      <w:tblPr>
+        <w:tblW w:w="10080" w:type="dxa"/>
+        <w:tblBorders>
+          <w:top w:val="single" w:sz="4" w:space="0" w:color="C9CCD1"/>
+          <w:left w:val="single" w:sz="4" w:space="0" w:color="C9CCD1"/>
+          <w:bottom w:val="single" w:sz="4" w:space="0" w:color="C9CCD1"/>
+          <w:right w:val="single" w:sz="4" w:space="0" w:color="C9CCD1"/>
+          <w:insideH w:val="single" w:sz="4" w:space="0" w:color="C9CCD1"/>
+          <w:insideV w:val="single" w:sz="4" w:space="0" w:color="C9CCD1"/>
+        </w:tblBorders>
+        <w:tblLayout w:type="fixed"/>
+      </w:tblPr>
+      <w:tblGrid>
+        <w:gridCol w:w="1680"/>
+        <w:gridCol w:w="1680"/>
+        <w:gridCol w:w="1680"/>
+        <w:gridCol w:w="1680"/>
+        <w:gridCol w:w="1680"/>
+        <w:gridCol w:w="1680"/>
+      </w:tblGrid>
+      <w:tr>
+        <w:trPr>
+          <w:tblHeader/>
+        </w:trPr>
+        <w:tc>
+          <w:tcPr>
+            <w:tcW w:w="1680" w:type="dxa"/>
+            <w:shd w:val="clear" w:color="auto" w:fill="EFF1F3"/>
+          </w:tcPr>
+          <w:p>
+            <w:pPr>
+              <w:spacing w:before="40" w:after="40"/>
+            </w:pPr>
+            <w:r>
+              <w:rPr>
+                <w:b/>
+                <w:sz w:val="18"/>
+              </w:rPr>
+              <w:t xml:space="preserve">App</w:t>
+            </w:r>
+          </w:p>
+        </w:tc>
+        <w:tc>
+          <w:tcPr>
+            <w:tcW w:w="1680" w:type="dxa"/>
+            <w:shd w:val="clear" w:color="auto" w:fill="EFF1F3"/>
+          </w:tcPr>
+          <w:p>
+            <w:pPr>
+              <w:spacing w:before="40" w:after="40"/>
+            </w:pPr>
+            <w:r>
+              <w:rPr>
+                <w:b/>
+                <w:sz w:val="18"/>
+              </w:rPr>
+              <w:t xml:space="preserve">Price (from source)</w:t>
+            </w:r>
+          </w:p>
+        </w:tc>
+        <w:tc>
+          <w:tcPr>
+            <w:tcW w:w="1680" w:type="dxa"/>
+            <w:shd w:val="clear" w:color="auto" w:fill="EFF1F3"/>
+          </w:tcPr>
+          <w:p>
+            <w:pPr>
+              <w:spacing w:before="40" w:after="40"/>
+            </w:pPr>
+            <w:r>
+              <w:rPr>
+                <w:b/>
+                <w:sz w:val="18"/>
+              </w:rPr>
+              <w:t xml:space="preserve">Three core features</w:t>
+            </w:r>
+          </w:p>
+        </w:tc>
+        <w:tc>
+          <w:tcPr>
+            <w:tcW w:w="1680" w:type="dxa"/>
+            <w:shd w:val="clear" w:color="auto" w:fill="EFF1F3"/>
+          </w:tcPr>
+          <w:p>
+            <w:pPr>
+              <w:spacing w:before="40" w:after="40"/>
+            </w:pPr>
+            <w:r>
+              <w:rPr>
+                <w:b/>
+                <w:sz w:val="18"/>
+              </w:rPr>
+              <w:t xml:space="preserve">Target customer</w:t>
+            </w:r>
+          </w:p>
+        </w:tc>
+        <w:tc>
+          <w:tcPr>
+            <w:tcW w:w="1680" w:type="dxa"/>
+            <w:shd w:val="clear" w:color="auto" w:fill="EFF1F3"/>
+          </w:tcPr>
+          <w:p>
+            <w:pPr>
+              <w:spacing w:before="40" w:after="40"/>
+            </w:pPr>
+            <w:r>
+              <w:rPr>
+                <w:b/>
+                <w:sz w:val="18"/>
+              </w:rPr>
+              <w:t xml:space="preserve">Funding / ownership</w:t>
+            </w:r>
+          </w:p>
+        </w:tc>
+        <w:tc>
+          <w:tcPr>
+            <w:tcW w:w="1680" w:type="dxa"/>
+            <w:shd w:val="clear" w:color="auto" w:fill="EFF1F3"/>
+          </w:tcPr>
+          <w:p>
+            <w:pPr>
+              <w:spacing w:before="40" w:after="40"/>
+            </w:pPr>
+            <w:r>
+              <w:rPr>
+                <w:b/>
+                <w:sz w:val="18"/>
+              </w:rPr>
+              <w:t xml:space="preserve">Top 3 complaints</w:t>
+            </w:r>
+          </w:p>
+        </w:tc>
+      </w:tr>
+      <w:tr>
+        <w:tc>
+          <w:tcPr>
+            <w:tcW w:w="1680" w:type="dxa"/>
+          </w:tcPr>
+          <w:p>
+            <w:pPr>
+              <w:spacing w:before="40" w:after="40"/>
+            </w:pPr>
+            <w:r>
+              <w:rPr>
+                <w:b/>
+                <w:sz w:val="18"/>
+              </w:rPr>
+              <w:t xml:space="preserve">MyFitnessPal</w:t>
+            </w:r>
+          </w:p>
+        </w:tc>
+        <w:tc>
+          <w:tcPr>
+            <w:tcW w:w="1680" w:type="dxa"/>
+          </w:tcPr>
+          <w:p>
+            <w:pPr>
+              <w:spacing w:before="40" w:after="40"/>
+            </w:pPr>
+            <w:r>
+              <w:rPr>
+                <w:sz w:val="18"/>
+              </w:rPr>
+              <w:t xml:space="preserve">Premium </w:t>
+            </w:r>
+            <w:r>
+              <w:rPr>
+                <w:b/>
+                <w:sz w:val="18"/>
+              </w:rPr>
+              <w:t xml:space="preserve">$19.99/mo</w:t>
+            </w:r>
+            <w:r>
+              <w:rPr>
+                <w:sz w:val="18"/>
+              </w:rPr>
+              <w:t xml:space="preserve"> or </w:t>
+            </w:r>
+            <w:r>
+              <w:rPr>
+                <w:b/>
+                <w:sz w:val="18"/>
+              </w:rPr>
+              <w:t xml:space="preserve">$79.99/yr</w:t>
+            </w:r>
+            <w:r>
+              <w:rPr>
+                <w:sz w:val="18"/>
+              </w:rPr>
+              <w:t xml:space="preserve">, 7-day trial; free tier exists — </w:t>
+            </w:r>
+            <w:hyperlink r:id="rHl62">
+              <w:r>
+                <w:rPr>
+                  <w:rStyle w:val="Hyperlink"/>
+                  <w:sz w:val="18"/>
+                </w:rPr>
+                <w:t xml:space="preserve">pricing page</w:t>
+              </w:r>
+            </w:hyperlink>
+          </w:p>
+        </w:tc>
+        <w:tc>
+          <w:tcPr>
+            <w:tcW w:w="1680" w:type="dxa"/>
+          </w:tcPr>
+          <w:p>
+            <w:pPr>
+              <w:spacing w:before="40" w:after="40"/>
+            </w:pPr>
+            <w:r>
+              <w:rPr>
+                <w:sz w:val="18"/>
+              </w:rPr>
+              <w:t xml:space="preserve">1. Food logging w/ barcode + voice 2. Custom macro goals 3. Recipes, meal planner, AI photo logging</w:t>
+            </w:r>
+          </w:p>
+        </w:tc>
+        <w:tc>
+          <w:tcPr>
+            <w:tcW w:w="1680" w:type="dxa"/>
+          </w:tcPr>
+          <w:p>
+            <w:pPr>
+              <w:spacing w:before="40" w:after="40"/>
+            </w:pPr>
+            <w:r>
+              <w:rPr>
+                <w:sz w:val="18"/>
+              </w:rPr>
+              <w:t xml:space="preserve">Mass-market calorie counters; the default first app</w:t>
+            </w:r>
+          </w:p>
+        </w:tc>
+        <w:tc>
+          <w:tcPr>
+            <w:tcW w:w="1680" w:type="dxa"/>
+          </w:tcPr>
+          <w:p>
+            <w:pPr>
+              <w:spacing w:before="40" w:after="40"/>
+            </w:pPr>
+            <w:r>
+              <w:rPr>
+                <w:sz w:val="18"/>
+              </w:rPr>
+              <w:t xml:space="preserve">Under Armour bought for </w:t>
+            </w:r>
+            <w:r>
+              <w:rPr>
+                <w:b/>
+                <w:sz w:val="18"/>
+              </w:rPr>
+              <w:t xml:space="preserve">$475M (2015)</w:t>
+            </w:r>
+            <w:r>
+              <w:rPr>
+                <w:sz w:val="18"/>
+              </w:rPr>
+              <w:t xml:space="preserve">, sold to </w:t>
+            </w:r>
+            <w:r>
+              <w:rPr>
+                <w:b/>
+                <w:sz w:val="18"/>
+              </w:rPr>
+              <w:t xml:space="preserve">Francisco Partners for $345M (Dec 2020)</w:t>
+            </w:r>
+            <w:r>
+              <w:rPr>
+                <w:sz w:val="18"/>
+              </w:rPr>
+              <w:t xml:space="preserve"> — $215M at close + up to $130M earnout (</w:t>
+            </w:r>
+            <w:hyperlink r:id="rHl63">
+              <w:r>
+                <w:rPr>
+                  <w:rStyle w:val="Hyperlink"/>
+                  <w:sz w:val="18"/>
+                </w:rPr>
+                <w:t xml:space="preserve">Francisco Partners</w:t>
+              </w:r>
+            </w:hyperlink>
+            <w:r>
+              <w:rPr>
+                <w:sz w:val="18"/>
+              </w:rPr>
+              <w:t xml:space="preserve">, </w:t>
+            </w:r>
+            <w:hyperlink r:id="rHl64">
+              <w:r>
+                <w:rPr>
+                  <w:rStyle w:val="Hyperlink"/>
+                  <w:sz w:val="18"/>
+                </w:rPr>
+                <w:t xml:space="preserve">Under Armour 8-K</w:t>
+              </w:r>
+            </w:hyperlink>
+            <w:r>
+              <w:rPr>
+                <w:sz w:val="18"/>
+              </w:rPr>
+              <w:t xml:space="preserve">)</w:t>
+            </w:r>
+          </w:p>
+        </w:tc>
+        <w:tc>
+          <w:tcPr>
+            <w:tcW w:w="1680" w:type="dxa"/>
+          </w:tcPr>
+          <w:p>
+            <w:pPr>
+              <w:spacing w:before="40" w:after="40"/>
+            </w:pPr>
+            <w:r>
+              <w:rPr>
+                <w:sz w:val="18"/>
+              </w:rPr>
+              <w:t xml:space="preserve">Paywalling of formerly-free basics (40%); redesign removed what users relied on (40%); barcode/AI data inaccuracy (36%)</w:t>
+            </w:r>
+          </w:p>
+        </w:tc>
+      </w:tr>
+      <w:tr>
+        <w:tc>
+          <w:tcPr>
+            <w:tcW w:w="1680" w:type="dxa"/>
+          </w:tcPr>
+          <w:p>
+            <w:pPr>
+              <w:spacing w:before="40" w:after="40"/>
+            </w:pPr>
+            <w:r>
+              <w:rPr>
+                <w:b/>
+                <w:sz w:val="18"/>
+              </w:rPr>
+              <w:t xml:space="preserve">MacroFactor</w:t>
+            </w:r>
+          </w:p>
+        </w:tc>
+        <w:tc>
+          <w:tcPr>
+            <w:tcW w:w="1680" w:type="dxa"/>
+          </w:tcPr>
+          <w:p>
+            <w:pPr>
+              <w:spacing w:before="40" w:after="40"/>
+            </w:pPr>
+            <w:r>
+              <w:rPr>
+                <w:b/>
+                <w:sz w:val="18"/>
+              </w:rPr>
+              <w:t xml:space="preserve">$11.99/mo</w:t>
+            </w:r>
+            <w:r>
+              <w:rPr>
+                <w:sz w:val="18"/>
+              </w:rPr>
+              <w:t xml:space="preserve">, </w:t>
+            </w:r>
+            <w:r>
+              <w:rPr>
+                <w:b/>
+                <w:sz w:val="18"/>
+              </w:rPr>
+              <w:t xml:space="preserve">$47.99/6mo</w:t>
+            </w:r>
+            <w:r>
+              <w:rPr>
+                <w:sz w:val="18"/>
+              </w:rPr>
+              <w:t xml:space="preserve">, </w:t>
+            </w:r>
+            <w:r>
+              <w:rPr>
+                <w:b/>
+                <w:sz w:val="18"/>
+              </w:rPr>
+              <w:t xml:space="preserve">$71.99/yr</w:t>
+            </w:r>
+            <w:r>
+              <w:rPr>
+                <w:sz w:val="18"/>
+              </w:rPr>
+              <w:t xml:space="preserve">, </w:t>
+            </w:r>
+            <w:r>
+              <w:rPr>
+                <w:b/>
+                <w:sz w:val="18"/>
+              </w:rPr>
+              <w:t xml:space="preserve">$89.99/yr</w:t>
+            </w:r>
+            <w:r>
+              <w:rPr>
+                <w:sz w:val="18"/>
+              </w:rPr>
+              <w:t xml:space="preserve"> bundle w/ Workouts; 7-day trial; </w:t>
+            </w:r>
+            <w:r>
+              <w:rPr>
+                <w:b/>
+                <w:sz w:val="18"/>
+              </w:rPr>
+              <w:t xml:space="preserve">no free tier</w:t>
+            </w:r>
+            <w:r>
+              <w:rPr>
+                <w:sz w:val="18"/>
+              </w:rPr>
+              <w:t xml:space="preserve"> — </w:t>
+            </w:r>
+            <w:hyperlink r:id="rHl65">
+              <w:r>
+                <w:rPr>
+                  <w:rStyle w:val="Hyperlink"/>
+                  <w:sz w:val="18"/>
+                </w:rPr>
+                <w:t xml:space="preserve">App Store</w:t>
+              </w:r>
+            </w:hyperlink>
+            <w:r>
+              <w:rPr>
+                <w:sz w:val="18"/>
+              </w:rPr>
+              <w:t xml:space="preserve">, </w:t>
+            </w:r>
+            <w:hyperlink r:id="rHl66">
+              <w:r>
+                <w:rPr>
+                  <w:rStyle w:val="Hyperlink"/>
+                  <w:sz w:val="18"/>
+                </w:rPr>
+                <w:t xml:space="preserve">Workouts price page</w:t>
+              </w:r>
+            </w:hyperlink>
+          </w:p>
+        </w:tc>
+        <w:tc>
+          <w:tcPr>
+            <w:tcW w:w="1680" w:type="dxa"/>
+          </w:tcPr>
+          <w:p>
+            <w:pPr>
+              <w:spacing w:before="40" w:after="40"/>
+            </w:pPr>
+            <w:r>
+              <w:rPr>
+                <w:sz w:val="18"/>
+              </w:rPr>
+              <w:t xml:space="preserve">1. Adaptive metabolism algorithm 2. Verified food database + barcode 3. Weekly coached macro adjustments</w:t>
+            </w:r>
+          </w:p>
+        </w:tc>
+        <w:tc>
+          <w:tcPr>
+            <w:tcW w:w="1680" w:type="dxa"/>
+          </w:tcPr>
+          <w:p>
+            <w:pPr>
+              <w:spacing w:before="40" w:after="40"/>
+            </w:pPr>
+            <w:r>
+              <w:rPr>
+                <w:sz w:val="18"/>
+              </w:rPr>
+              <w:t xml:space="preserve">Serious lifters, macro-literate users</w:t>
+            </w:r>
+          </w:p>
+        </w:tc>
+        <w:tc>
+          <w:tcPr>
+            <w:tcW w:w="1680" w:type="dxa"/>
+          </w:tcPr>
+          <w:p>
+            <w:pPr>
+              <w:spacing w:before="40" w:after="40"/>
+            </w:pPr>
+            <w:r>
+              <w:rPr>
+                <w:b/>
+                <w:sz w:val="18"/>
+              </w:rPr>
+              <w:t xml:space="preserve">Stronger By Science Technologies LLC</w:t>
+            </w:r>
+            <w:r>
+              <w:rPr>
+                <w:sz w:val="18"/>
+              </w:rPr>
+              <w:t xml:space="preserve">; no outside funding found </w:t>
+            </w:r>
+            <w:r>
+              <w:rPr>
+                <w:rFonts w:ascii="Consolas" w:hAnsi="Consolas"/>
+                <w:sz w:val="18"/>
+              </w:rPr>
+              <w:t xml:space="preserve">[UNVERIFIED]</w:t>
+            </w:r>
+          </w:p>
+        </w:tc>
+        <w:tc>
+          <w:tcPr>
+            <w:tcW w:w="1680" w:type="dxa"/>
+          </w:tcPr>
+          <w:p>
+            <w:pPr>
+              <w:spacing w:before="40" w:after="40"/>
+            </w:pPr>
+            <w:r>
+              <w:rPr>
+                <w:sz w:val="18"/>
+              </w:rPr>
+              <w:t xml:space="preserve">Database/import accuracy (42%); paywall with no free tier (33%); unannounced UI changes (11%)</w:t>
+            </w:r>
+          </w:p>
+        </w:tc>
+      </w:tr>
+      <w:tr>
+        <w:tc>
+          <w:tcPr>
+            <w:tcW w:w="1680" w:type="dxa"/>
+          </w:tcPr>
+          <w:p>
+            <w:pPr>
+              <w:spacing w:before="40" w:after="40"/>
+            </w:pPr>
+            <w:r>
+              <w:rPr>
+                <w:b/>
+                <w:sz w:val="18"/>
+              </w:rPr>
+              <w:t xml:space="preserve">eMeals</w:t>
+            </w:r>
+          </w:p>
+        </w:tc>
+        <w:tc>
+          <w:tcPr>
+            <w:tcW w:w="1680" w:type="dxa"/>
+          </w:tcPr>
+          <w:p>
+            <w:pPr>
+              <w:spacing w:before="40" w:after="40"/>
+            </w:pPr>
+            <w:r>
+              <w:rPr>
+                <w:sz w:val="18"/>
+              </w:rPr>
+              <w:t xml:space="preserve">From </w:t>
+            </w:r>
+            <w:r>
+              <w:rPr>
+                <w:b/>
+                <w:sz w:val="18"/>
+              </w:rPr>
+              <w:t xml:space="preserve">$4.99/mo on 12-month</w:t>
+            </w:r>
+            <w:r>
+              <w:rPr>
+                <w:sz w:val="18"/>
+              </w:rPr>
+              <w:t xml:space="preserve">; </w:t>
+            </w:r>
+            <w:r>
+              <w:rPr>
+                <w:b/>
+                <w:sz w:val="18"/>
+              </w:rPr>
+              <w:t xml:space="preserve">$37.50/3mo</w:t>
+            </w:r>
+            <w:r>
+              <w:rPr>
+                <w:sz w:val="18"/>
+              </w:rPr>
+              <w:t xml:space="preserve">; 14-day trial; App Store IAPs $37.49–$99.99 — </w:t>
+            </w:r>
+            <w:hyperlink r:id="rHl67">
+              <w:r>
+                <w:rPr>
+                  <w:rStyle w:val="Hyperlink"/>
+                  <w:sz w:val="18"/>
+                </w:rPr>
+                <w:t xml:space="preserve">emeals.com</w:t>
+              </w:r>
+            </w:hyperlink>
+            <w:r>
+              <w:rPr>
+                <w:sz w:val="18"/>
+              </w:rPr>
+              <w:t xml:space="preserve">, </w:t>
+            </w:r>
+            <w:hyperlink r:id="rHl68">
+              <w:r>
+                <w:rPr>
+                  <w:rStyle w:val="Hyperlink"/>
+                  <w:sz w:val="18"/>
+                </w:rPr>
+                <w:t xml:space="preserve">App Store</w:t>
+              </w:r>
+            </w:hyperlink>
+          </w:p>
+        </w:tc>
+        <w:tc>
+          <w:tcPr>
+            <w:tcW w:w="1680" w:type="dxa"/>
+          </w:tcPr>
+          <w:p>
+            <w:pPr>
+              <w:spacing w:before="40" w:after="40"/>
+            </w:pPr>
+            <w:r>
+              <w:rPr>
+                <w:sz w:val="18"/>
+              </w:rPr>
+              <w:t xml:space="preserve">1. 15 diet-specific weekly plans 2. Auto grocery list 3. Ordering via Walmart, Kroger, Instacart, Shipt, AmazonFresh, Albertsons, Safeway, H-E-B</w:t>
+            </w:r>
+          </w:p>
+        </w:tc>
+        <w:tc>
+          <w:tcPr>
+            <w:tcW w:w="1680" w:type="dxa"/>
+          </w:tcPr>
+          <w:p>
+            <w:pPr>
+              <w:spacing w:before="40" w:after="40"/>
+            </w:pPr>
+            <w:r>
+              <w:rPr>
+                <w:sz w:val="18"/>
+              </w:rPr>
+              <w:t xml:space="preserve">Busy families who want dinner solved</w:t>
+            </w:r>
+          </w:p>
+        </w:tc>
+        <w:tc>
+          <w:tcPr>
+            <w:tcW w:w="1680" w:type="dxa"/>
+          </w:tcPr>
+          <w:p>
+            <w:pPr>
+              <w:spacing w:before="40" w:after="40"/>
+            </w:pPr>
+            <w:r>
+              <w:rPr>
+                <w:b/>
+                <w:sz w:val="18"/>
+              </w:rPr>
+              <w:t xml:space="preserve">eMeals, Inc.</w:t>
+            </w:r>
+            <w:r>
+              <w:rPr>
+                <w:sz w:val="18"/>
+              </w:rPr>
+              <w:t xml:space="preserve"> (Birmingham AL / Atlanta); no funding raised per Crunchbase </w:t>
+            </w:r>
+            <w:r>
+              <w:rPr>
+                <w:rFonts w:ascii="Consolas" w:hAnsi="Consolas"/>
+                <w:sz w:val="18"/>
+              </w:rPr>
+              <w:t xml:space="preserve">[UNVERIFIED — secondary source]</w:t>
+            </w:r>
+          </w:p>
+        </w:tc>
+        <w:tc>
+          <w:tcPr>
+            <w:tcW w:w="1680" w:type="dxa"/>
+          </w:tcPr>
+          <w:p>
+            <w:pPr>
+              <w:spacing w:before="40" w:after="40"/>
+            </w:pPr>
+            <w:r>
+              <w:rPr>
+                <w:sz w:val="18"/>
+              </w:rPr>
+              <w:t xml:space="preserve">Subscription terms / no refunds (52%); grocery hand-off failures (38%); bland, limited recipes (34%)</w:t>
+            </w:r>
+          </w:p>
+        </w:tc>
+      </w:tr>
+      <w:tr>
+        <w:tc>
+          <w:tcPr>
+            <w:tcW w:w="1680" w:type="dxa"/>
+          </w:tcPr>
+          <w:p>
+            <w:pPr>
+              <w:spacing w:before="40" w:after="40"/>
+            </w:pPr>
+            <w:r>
+              <w:rPr>
+                <w:b/>
+                <w:sz w:val="18"/>
+              </w:rPr>
+              <w:t xml:space="preserve">Mealime</w:t>
+            </w:r>
+          </w:p>
+        </w:tc>
+        <w:tc>
+          <w:tcPr>
+            <w:tcW w:w="1680" w:type="dxa"/>
+          </w:tcPr>
+          <w:p>
+            <w:pPr>
+              <w:spacing w:before="40" w:after="40"/>
+            </w:pPr>
+            <w:r>
+              <w:rPr>
+                <w:b/>
+                <w:sz w:val="18"/>
+              </w:rPr>
+              <w:t xml:space="preserve">Shutting down Oct 21, 2026.</w:t>
+            </w:r>
+            <w:r>
+              <w:rPr>
+                <w:sz w:val="18"/>
+              </w:rPr>
+              <w:t xml:space="preserve"> Pro subscribers will not be charged again; data deleted at closure — </w:t>
+            </w:r>
+            <w:hyperlink r:id="rHl69">
+              <w:r>
+                <w:rPr>
+                  <w:rStyle w:val="Hyperlink"/>
+                  <w:sz w:val="18"/>
+                </w:rPr>
+                <w:t xml:space="preserve">closing notice</w:t>
+              </w:r>
+            </w:hyperlink>
+          </w:p>
+        </w:tc>
+        <w:tc>
+          <w:tcPr>
+            <w:tcW w:w="1680" w:type="dxa"/>
+          </w:tcPr>
+          <w:p>
+            <w:pPr>
+              <w:spacing w:before="40" w:after="40"/>
+            </w:pPr>
+            <w:r>
+              <w:rPr>
+                <w:sz w:val="18"/>
+              </w:rPr>
+              <w:t xml:space="preserve">1. 200+ allergy/dislike personalization options 2. Auto-sorted grocery lists 3. 30-minute recipes</w:t>
+            </w:r>
+          </w:p>
+        </w:tc>
+        <w:tc>
+          <w:tcPr>
+            <w:tcW w:w="1680" w:type="dxa"/>
+          </w:tcPr>
+          <w:p>
+            <w:pPr>
+              <w:spacing w:before="40" w:after="40"/>
+            </w:pPr>
+            <w:r>
+              <w:rPr>
+                <w:sz w:val="18"/>
+              </w:rPr>
+              <w:t xml:space="preserve">Weeknight cooks with dietary restrictions</w:t>
+            </w:r>
+          </w:p>
+        </w:tc>
+        <w:tc>
+          <w:tcPr>
+            <w:tcW w:w="1680" w:type="dxa"/>
+          </w:tcPr>
+          <w:p>
+            <w:pPr>
+              <w:spacing w:before="40" w:after="40"/>
+            </w:pPr>
+            <w:r>
+              <w:rPr>
+                <w:sz w:val="18"/>
+              </w:rPr>
+              <w:t xml:space="preserve">Acquired by </w:t>
+            </w:r>
+            <w:r>
+              <w:rPr>
+                <w:b/>
+                <w:sz w:val="18"/>
+              </w:rPr>
+              <w:t xml:space="preserve">Albertsons Companies (2021)</w:t>
+            </w:r>
+            <w:r>
+              <w:rPr>
+                <w:sz w:val="18"/>
+              </w:rPr>
+              <w:t xml:space="preserve">, terms undisclosed; folded into "Meals Hub" inside Albertsons/Safeway/Vons/Jewel-Osco apps (</w:t>
+            </w:r>
+            <w:hyperlink r:id="rHl70">
+              <w:r>
+                <w:rPr>
+                  <w:rStyle w:val="Hyperlink"/>
+                  <w:sz w:val="18"/>
+                </w:rPr>
+                <w:t xml:space="preserve">Businesswire</w:t>
+              </w:r>
+            </w:hyperlink>
+            <w:r>
+              <w:rPr>
+                <w:sz w:val="18"/>
+              </w:rPr>
+              <w:t xml:space="preserve">)</w:t>
+            </w:r>
+          </w:p>
+        </w:tc>
+        <w:tc>
+          <w:tcPr>
+            <w:tcW w:w="1680" w:type="dxa"/>
+          </w:tcPr>
+          <w:p>
+            <w:pPr>
+              <w:spacing w:before="40" w:after="40"/>
+            </w:pPr>
+            <w:r>
+              <w:rPr>
+                <w:sz w:val="18"/>
+              </w:rPr>
+              <w:t xml:space="preserve">Shutdown + forced move into a grocery chain's app (58% of its recent reviews); no recipe export, data deleted; replacement stores not local</w:t>
+            </w:r>
+          </w:p>
+        </w:tc>
+      </w:tr>
+      <w:tr>
+        <w:tc>
+          <w:tcPr>
+            <w:tcW w:w="1680" w:type="dxa"/>
+          </w:tcPr>
+          <w:p>
+            <w:pPr>
+              <w:spacing w:before="40" w:after="40"/>
+            </w:pPr>
+            <w:r>
+              <w:rPr>
+                <w:b/>
+                <w:sz w:val="18"/>
+              </w:rPr>
+              <w:t xml:space="preserve">Fitia</w:t>
+            </w:r>
+          </w:p>
+        </w:tc>
+        <w:tc>
+          <w:tcPr>
+            <w:tcW w:w="1680" w:type="dxa"/>
+          </w:tcPr>
+          <w:p>
+            <w:pPr>
+              <w:spacing w:before="40" w:after="40"/>
+            </w:pPr>
+            <w:r>
+              <w:rPr>
+                <w:b/>
+                <w:sz w:val="18"/>
+              </w:rPr>
+              <w:t xml:space="preserve">$19.99/mo</w:t>
+            </w:r>
+            <w:r>
+              <w:rPr>
+                <w:sz w:val="18"/>
+              </w:rPr>
+              <w:t xml:space="preserve">, $23.99/3mo, $35.99/6mo, </w:t>
+            </w:r>
+            <w:r>
+              <w:rPr>
+                <w:b/>
+                <w:sz w:val="18"/>
+              </w:rPr>
+              <w:t xml:space="preserve">$53.99–$59.99/yr</w:t>
+            </w:r>
+            <w:r>
+              <w:rPr>
+                <w:sz w:val="18"/>
+              </w:rPr>
+              <w:t xml:space="preserve">, $89.99/yr family — </w:t>
+            </w:r>
+            <w:hyperlink r:id="rHl71">
+              <w:r>
+                <w:rPr>
+                  <w:rStyle w:val="Hyperlink"/>
+                  <w:sz w:val="18"/>
+                </w:rPr>
+                <w:t xml:space="preserve">App Store</w:t>
+              </w:r>
+            </w:hyperlink>
+          </w:p>
+        </w:tc>
+        <w:tc>
+          <w:tcPr>
+            <w:tcW w:w="1680" w:type="dxa"/>
+          </w:tcPr>
+          <w:p>
+            <w:pPr>
+              <w:spacing w:before="40" w:after="40"/>
+            </w:pPr>
+            <w:r>
+              <w:rPr>
+                <w:sz w:val="18"/>
+              </w:rPr>
+              <w:t xml:space="preserve">1. Photo/voice/text calorie logging 2. Auto meal plans 3. Auto grocery list + AI coach</w:t>
+            </w:r>
+          </w:p>
+        </w:tc>
+        <w:tc>
+          <w:tcPr>
+            <w:tcW w:w="1680" w:type="dxa"/>
+          </w:tcPr>
+          <w:p>
+            <w:pPr>
+              <w:spacing w:before="40" w:after="40"/>
+            </w:pPr>
+            <w:r>
+              <w:rPr>
+                <w:sz w:val="18"/>
+              </w:rPr>
+              <w:t xml:space="preserve">Spanish-speaking + US budget-conscious trackers</w:t>
+            </w:r>
+          </w:p>
+        </w:tc>
+        <w:tc>
+          <w:tcPr>
+            <w:tcW w:w="1680" w:type="dxa"/>
+          </w:tcPr>
+          <w:p>
+            <w:pPr>
+              <w:spacing w:before="40" w:after="40"/>
+            </w:pPr>
+            <w:r>
+              <w:rPr>
+                <w:b/>
+                <w:sz w:val="18"/>
+              </w:rPr>
+              <w:t xml:space="preserve">Nutrition Technologies</w:t>
+            </w:r>
+            <w:r>
+              <w:rPr>
+                <w:sz w:val="18"/>
+              </w:rPr>
+              <w:t xml:space="preserve">, Lima, Peru; </w:t>
+            </w:r>
+            <w:r>
+              <w:rPr>
+                <w:b/>
+                <w:sz w:val="18"/>
+              </w:rPr>
+              <w:t xml:space="preserve">Y Combinator</w:t>
+            </w:r>
+            <w:r>
+              <w:rPr>
+                <w:sz w:val="18"/>
+              </w:rPr>
+              <w:t xml:space="preserve">, $125K seed (2021); ~$3.5M revenue 2024 </w:t>
+            </w:r>
+            <w:r>
+              <w:rPr>
+                <w:rFonts w:ascii="Consolas" w:hAnsi="Consolas"/>
+                <w:sz w:val="18"/>
+              </w:rPr>
+              <w:t xml:space="preserve">[UNVERIFIED — Latka/Tracxn secondary]</w:t>
+            </w:r>
+          </w:p>
+        </w:tc>
+        <w:tc>
+          <w:tcPr>
+            <w:tcW w:w="1680" w:type="dxa"/>
+          </w:tcPr>
+          <w:p>
+            <w:pPr>
+              <w:spacing w:before="40" w:after="40"/>
+            </w:pPr>
+            <w:r>
+              <w:rPr>
+                <w:sz w:val="18"/>
+              </w:rPr>
+              <w:t xml:space="preserve">Trial→charge surprises and refusal of refunds (36%); photo estimates wrong (19%); data loss/crashes (17%)</w:t>
+            </w:r>
+          </w:p>
+        </w:tc>
+      </w:tr>
+      <w:tr>
+        <w:tc>
+          <w:tcPr>
+            <w:tcW w:w="1680" w:type="dxa"/>
+          </w:tcPr>
+          <w:p>
+            <w:pPr>
+              <w:spacing w:before="40" w:after="40"/>
+            </w:pPr>
+            <w:r>
+              <w:rPr>
+                <w:b/>
+                <w:sz w:val="18"/>
+              </w:rPr>
+              <w:t xml:space="preserve">Samsung Food</w:t>
+            </w:r>
+          </w:p>
+        </w:tc>
+        <w:tc>
+          <w:tcPr>
+            <w:tcW w:w="1680" w:type="dxa"/>
+          </w:tcPr>
+          <w:p>
+            <w:pPr>
+              <w:spacing w:before="40" w:after="40"/>
+            </w:pPr>
+            <w:r>
+              <w:rPr>
+                <w:b/>
+                <w:sz w:val="18"/>
+              </w:rPr>
+              <w:t xml:space="preserve">$6.99/mo</w:t>
+            </w:r>
+            <w:r>
+              <w:rPr>
+                <w:sz w:val="18"/>
+              </w:rPr>
+              <w:t xml:space="preserve"> or </w:t>
+            </w:r>
+            <w:r>
+              <w:rPr>
+                <w:b/>
+                <w:sz w:val="18"/>
+              </w:rPr>
+              <w:t xml:space="preserve">$59.99/yr</w:t>
+            </w:r>
+            <w:r>
+              <w:rPr>
+                <w:sz w:val="18"/>
+              </w:rPr>
+              <w:t xml:space="preserve"> (Samsung Food+); large free tier — </w:t>
+            </w:r>
+            <w:hyperlink r:id="rHl72">
+              <w:r>
+                <w:rPr>
+                  <w:rStyle w:val="Hyperlink"/>
+                  <w:sz w:val="18"/>
+                </w:rPr>
+                <w:t xml:space="preserve">App Store</w:t>
+              </w:r>
+            </w:hyperlink>
+          </w:p>
+        </w:tc>
+        <w:tc>
+          <w:tcPr>
+            <w:tcW w:w="1680" w:type="dxa"/>
+          </w:tcPr>
+          <w:p>
+            <w:pPr>
+              <w:spacing w:before="40" w:after="40"/>
+            </w:pPr>
+            <w:r>
+              <w:rPr>
+                <w:sz w:val="18"/>
+              </w:rPr>
+              <w:t xml:space="preserve">1. 240k+ recipes, save from any site 2. Meal planning + nutrition scores 3. 23 retailer integrations across 4 regions</w:t>
+            </w:r>
+          </w:p>
+        </w:tc>
+        <w:tc>
+          <w:tcPr>
+            <w:tcW w:w="1680" w:type="dxa"/>
+          </w:tcPr>
+          <w:p>
+            <w:pPr>
+              <w:spacing w:before="40" w:after="40"/>
+            </w:pPr>
+            <w:r>
+              <w:rPr>
+                <w:sz w:val="18"/>
+              </w:rPr>
+              <w:t xml:space="preserve">Recipe collectors in the Samsung appliance ecosystem</w:t>
+            </w:r>
+          </w:p>
+        </w:tc>
+        <w:tc>
+          <w:tcPr>
+            <w:tcW w:w="1680" w:type="dxa"/>
+          </w:tcPr>
+          <w:p>
+            <w:pPr>
+              <w:spacing w:before="40" w:after="40"/>
+            </w:pPr>
+            <w:r>
+              <w:rPr>
+                <w:b/>
+                <w:sz w:val="18"/>
+              </w:rPr>
+              <w:t xml:space="preserve">Samsung</w:t>
+            </w:r>
+            <w:r>
+              <w:rPr>
+                <w:sz w:val="18"/>
+              </w:rPr>
+              <w:t xml:space="preserve"> — acquired Whisk (2019), rebranded Samsung Food (Aug 2023); entity Foodient Ltd (</w:t>
+            </w:r>
+            <w:hyperlink r:id="rHl73">
+              <w:r>
+                <w:rPr>
+                  <w:rStyle w:val="Hyperlink"/>
+                  <w:sz w:val="18"/>
+                </w:rPr>
+                <w:t xml:space="preserve">9to5Google</w:t>
+              </w:r>
+            </w:hyperlink>
+            <w:r>
+              <w:rPr>
+                <w:sz w:val="18"/>
+              </w:rPr>
+              <w:t xml:space="preserve">)</w:t>
+            </w:r>
+          </w:p>
+        </w:tc>
+        <w:tc>
+          <w:tcPr>
+            <w:tcW w:w="1680" w:type="dxa"/>
+          </w:tcPr>
+          <w:p>
+            <w:pPr>
+              <w:spacing w:before="40" w:after="40"/>
+            </w:pPr>
+            <w:r>
+              <w:rPr>
+                <w:sz w:val="18"/>
+              </w:rPr>
+              <w:t xml:space="preserve">Recipe/collection management gaps (54%); iOS bugs and lost accounts (33%); ads and upsell (29%)</w:t>
+            </w:r>
+          </w:p>
+        </w:tc>
+      </w:tr>
+      <w:tr>
+        <w:tc>
+          <w:tcPr>
+            <w:tcW w:w="1680" w:type="dxa"/>
+          </w:tcPr>
+          <w:p>
+            <w:pPr>
+              <w:spacing w:before="40" w:after="40"/>
+            </w:pPr>
+            <w:r>
+              <w:rPr>
+                <w:b/>
+                <w:sz w:val="18"/>
+              </w:rPr>
+              <w:t xml:space="preserve">MealPrepPro</w:t>
+            </w:r>
+          </w:p>
+        </w:tc>
+        <w:tc>
+          <w:tcPr>
+            <w:tcW w:w="1680" w:type="dxa"/>
+          </w:tcPr>
+          <w:p>
+            <w:pPr>
+              <w:spacing w:before="40" w:after="40"/>
+            </w:pPr>
+            <w:r>
+              <w:rPr>
+                <w:sz w:val="18"/>
+              </w:rPr>
+              <w:t xml:space="preserve">IAPs </w:t>
+            </w:r>
+            <w:r>
+              <w:rPr>
+                <w:b/>
+                <w:sz w:val="18"/>
+              </w:rPr>
+              <w:t xml:space="preserve">$9.99 / $29.99 / $59.99 / $229.99</w:t>
+            </w:r>
+            <w:r>
+              <w:rPr>
+                <w:sz w:val="18"/>
+              </w:rPr>
+              <w:t xml:space="preserve">; 7-day trial — </w:t>
+            </w:r>
+            <w:hyperlink r:id="rHl74">
+              <w:r>
+                <w:rPr>
+                  <w:rStyle w:val="Hyperlink"/>
+                  <w:sz w:val="18"/>
+                </w:rPr>
+                <w:t xml:space="preserve">App Store</w:t>
+              </w:r>
+            </w:hyperlink>
+            <w:r>
+              <w:rPr>
+                <w:sz w:val="18"/>
+              </w:rPr>
+              <w:t xml:space="preserve">. Tier labels aren't stated; $229.99 is likely lifetime </w:t>
+            </w:r>
+            <w:r>
+              <w:rPr>
+                <w:rFonts w:ascii="Consolas" w:hAnsi="Consolas"/>
+                <w:sz w:val="18"/>
+              </w:rPr>
+              <w:t xml:space="preserve">[UNVERIFIED]</w:t>
+            </w:r>
+          </w:p>
+        </w:tc>
+        <w:tc>
+          <w:tcPr>
+            <w:tcW w:w="1680" w:type="dxa"/>
+          </w:tcPr>
+          <w:p>
+            <w:pPr>
+              <w:spacing w:before="40" w:after="40"/>
+            </w:pPr>
+            <w:r>
+              <w:rPr>
+                <w:sz w:val="18"/>
+              </w:rPr>
+              <w:t xml:space="preserve">1. Macro-aware plans, 15+ diet types 2. Aisle-sorted grocery lists 3. Multi-user household plans</w:t>
+            </w:r>
+          </w:p>
+        </w:tc>
+        <w:tc>
+          <w:tcPr>
+            <w:tcW w:w="1680" w:type="dxa"/>
+          </w:tcPr>
+          <w:p>
+            <w:pPr>
+              <w:spacing w:before="40" w:after="40"/>
+            </w:pPr>
+            <w:r>
+              <w:rPr>
+                <w:sz w:val="18"/>
+              </w:rPr>
+              <w:t xml:space="preserve">Gym-goers who batch-cook</w:t>
+            </w:r>
+          </w:p>
+        </w:tc>
+        <w:tc>
+          <w:tcPr>
+            <w:tcW w:w="1680" w:type="dxa"/>
+          </w:tcPr>
+          <w:p>
+            <w:pPr>
+              <w:spacing w:before="40" w:after="40"/>
+            </w:pPr>
+            <w:r>
+              <w:rPr>
+                <w:b/>
+                <w:sz w:val="18"/>
+              </w:rPr>
+              <w:t xml:space="preserve">Nibble Apps Ltd</w:t>
+            </w:r>
+            <w:r>
+              <w:rPr>
+                <w:sz w:val="18"/>
+              </w:rPr>
+              <w:t xml:space="preserve">; indie, no funding found </w:t>
+            </w:r>
+            <w:r>
+              <w:rPr>
+                <w:rFonts w:ascii="Consolas" w:hAnsi="Consolas"/>
+                <w:sz w:val="18"/>
+              </w:rPr>
+              <w:t xml:space="preserve">[UNVERIFIED]</w:t>
+            </w:r>
+          </w:p>
+        </w:tc>
+        <w:tc>
+          <w:tcPr>
+            <w:tcW w:w="1680" w:type="dxa"/>
+          </w:tcPr>
+          <w:p>
+            <w:pPr>
+              <w:spacing w:before="40" w:after="40"/>
+            </w:pPr>
+            <w:r>
+              <w:rPr>
+                <w:sz w:val="18"/>
+              </w:rPr>
+              <w:t xml:space="preserve">Price vs. AI-generated value (58%); bland/AI-tasting recipes (37%); can't set macros; ignores stated exclusions</w:t>
+            </w:r>
+          </w:p>
+        </w:tc>
+      </w:tr>
+      <w:tr>
+        <w:tc>
+          <w:tcPr>
+            <w:tcW w:w="1680" w:type="dxa"/>
+          </w:tcPr>
+          <w:p>
+            <w:pPr>
+              <w:spacing w:before="40" w:after="40"/>
+            </w:pPr>
+            <w:r>
+              <w:rPr>
+                <w:b/>
+                <w:sz w:val="18"/>
+              </w:rPr>
+              <w:t xml:space="preserve">Eat This Much</w:t>
+            </w:r>
+          </w:p>
+        </w:tc>
+        <w:tc>
+          <w:tcPr>
+            <w:tcW w:w="1680" w:type="dxa"/>
+          </w:tcPr>
+          <w:p>
+            <w:pPr>
+              <w:spacing w:before="40" w:after="40"/>
+            </w:pPr>
+            <w:r>
+              <w:rPr>
+                <w:sz w:val="18"/>
+              </w:rPr>
+              <w:t xml:space="preserve">IAPs </w:t>
+            </w:r>
+            <w:r>
+              <w:rPr>
+                <w:b/>
+                <w:sz w:val="18"/>
+              </w:rPr>
+              <w:t xml:space="preserve">$8.99–$14.99/mo</w:t>
+            </w:r>
+            <w:r>
+              <w:rPr>
+                <w:sz w:val="18"/>
+              </w:rPr>
+              <w:t xml:space="preserve">, </w:t>
+            </w:r>
+            <w:r>
+              <w:rPr>
+                <w:b/>
+                <w:sz w:val="18"/>
+              </w:rPr>
+              <w:t xml:space="preserve">$47.99–$84.99/yr</w:t>
+            </w:r>
+            <w:r>
+              <w:rPr>
+                <w:sz w:val="18"/>
+              </w:rPr>
+              <w:t xml:space="preserve">; free tier exists </w:t>
+            </w:r>
+            <w:r>
+              <w:rPr>
+                <w:rFonts w:ascii="Consolas" w:hAnsi="Consolas"/>
+                <w:sz w:val="18"/>
+              </w:rPr>
+              <w:t xml:space="preserve">[UNVERIFIED — site is JS-only and unreadable to this tool]</w:t>
+            </w:r>
+            <w:r>
+              <w:rPr>
+                <w:sz w:val="18"/>
+              </w:rPr>
+              <w:t xml:space="preserve"> — </w:t>
+            </w:r>
+            <w:hyperlink r:id="rHl75">
+              <w:r>
+                <w:rPr>
+                  <w:rStyle w:val="Hyperlink"/>
+                  <w:sz w:val="18"/>
+                </w:rPr>
+                <w:t xml:space="preserve">App Store</w:t>
+              </w:r>
+            </w:hyperlink>
+          </w:p>
+        </w:tc>
+        <w:tc>
+          <w:tcPr>
+            <w:tcW w:w="1680" w:type="dxa"/>
+          </w:tcPr>
+          <w:p>
+            <w:pPr>
+              <w:spacing w:before="40" w:after="40"/>
+            </w:pPr>
+            <w:r>
+              <w:rPr>
+                <w:sz w:val="18"/>
+              </w:rPr>
+              <w:t xml:space="preserve">1. Auto-generates plans to hit macro targets 2. Grocery lists + US/Canada delivery integration 3. Pantry + budget inputs</w:t>
+            </w:r>
+          </w:p>
+        </w:tc>
+        <w:tc>
+          <w:tcPr>
+            <w:tcW w:w="1680" w:type="dxa"/>
+          </w:tcPr>
+          <w:p>
+            <w:pPr>
+              <w:spacing w:before="40" w:after="40"/>
+            </w:pPr>
+            <w:r>
+              <w:rPr>
+                <w:sz w:val="18"/>
+              </w:rPr>
+              <w:t xml:space="preserve">Macro-target dieters who don't want to log</w:t>
+            </w:r>
+          </w:p>
+        </w:tc>
+        <w:tc>
+          <w:tcPr>
+            <w:tcW w:w="1680" w:type="dxa"/>
+          </w:tcPr>
+          <w:p>
+            <w:pPr>
+              <w:spacing w:before="40" w:after="40"/>
+            </w:pPr>
+            <w:r>
+              <w:rPr>
+                <w:b/>
+                <w:sz w:val="18"/>
+              </w:rPr>
+              <w:t xml:space="preserve">Eat This Much Inc.</w:t>
+            </w:r>
+            <w:r>
+              <w:rPr>
+                <w:sz w:val="18"/>
+              </w:rPr>
+              <w:t xml:space="preserve">, founder Louis DeMenthon; no funding data found </w:t>
+            </w:r>
+            <w:r>
+              <w:rPr>
+                <w:rFonts w:ascii="Consolas" w:hAnsi="Consolas"/>
+                <w:sz w:val="18"/>
+              </w:rPr>
+              <w:t xml:space="preserve">[UNVERIFIED]</w:t>
+            </w:r>
+          </w:p>
+        </w:tc>
+        <w:tc>
+          <w:tcPr>
+            <w:tcW w:w="1680" w:type="dxa"/>
+          </w:tcPr>
+          <w:p>
+            <w:pPr>
+              <w:spacing w:before="40" w:after="40"/>
+            </w:pPr>
+            <w:r>
+              <w:rPr>
+                <w:sz w:val="18"/>
+              </w:rPr>
+              <w:t xml:space="preserve">Nonsensical/repetitive generated plans (39%); advertised budget &amp; pantry features not working (22%); refund requests (33%)</w:t>
+            </w:r>
+          </w:p>
+        </w:tc>
+      </w:tr>
+      <w:tr>
+        <w:tc>
+          <w:tcPr>
+            <w:tcW w:w="1680" w:type="dxa"/>
+          </w:tcPr>
+          <w:p>
+            <w:pPr>
+              <w:spacing w:before="40" w:after="40"/>
+            </w:pPr>
+            <w:r>
+              <w:rPr>
+                <w:b/>
+                <w:sz w:val="18"/>
+              </w:rPr>
+              <w:t xml:space="preserve">Plan to Eat</w:t>
+            </w:r>
+          </w:p>
+        </w:tc>
+        <w:tc>
+          <w:tcPr>
+            <w:tcW w:w="1680" w:type="dxa"/>
+          </w:tcPr>
+          <w:p>
+            <w:pPr>
+              <w:spacing w:before="40" w:after="40"/>
+            </w:pPr>
+            <w:r>
+              <w:rPr>
+                <w:b/>
+                <w:sz w:val="18"/>
+              </w:rPr>
+              <w:t xml:space="preserve">$5.95/mo</w:t>
+            </w:r>
+            <w:r>
+              <w:rPr>
+                <w:sz w:val="18"/>
+              </w:rPr>
+              <w:t xml:space="preserve"> or </w:t>
+            </w:r>
+            <w:r>
+              <w:rPr>
+                <w:b/>
+                <w:sz w:val="18"/>
+              </w:rPr>
+              <w:t xml:space="preserve">$49/yr</w:t>
+            </w:r>
+            <w:r>
+              <w:rPr>
+                <w:sz w:val="18"/>
+              </w:rPr>
+              <w:t xml:space="preserve">, 14-day trial, no card required — </w:t>
+            </w:r>
+            <w:hyperlink r:id="rHl76">
+              <w:r>
+                <w:rPr>
+                  <w:rStyle w:val="Hyperlink"/>
+                  <w:sz w:val="18"/>
+                </w:rPr>
+                <w:t xml:space="preserve">plantoeat.com</w:t>
+              </w:r>
+            </w:hyperlink>
+          </w:p>
+        </w:tc>
+        <w:tc>
+          <w:tcPr>
+            <w:tcW w:w="1680" w:type="dxa"/>
+          </w:tcPr>
+          <w:p>
+            <w:pPr>
+              <w:spacing w:before="40" w:after="40"/>
+            </w:pPr>
+            <w:r>
+              <w:rPr>
+                <w:sz w:val="18"/>
+              </w:rPr>
+              <w:t xml:space="preserve">1. Recipe clipper from any site 2. Planning calendar 3. Auto shopping list</w:t>
+            </w:r>
+          </w:p>
+        </w:tc>
+        <w:tc>
+          <w:tcPr>
+            <w:tcW w:w="1680" w:type="dxa"/>
+          </w:tcPr>
+          <w:p>
+            <w:pPr>
+              <w:spacing w:before="40" w:after="40"/>
+            </w:pPr>
+            <w:r>
+              <w:rPr>
+                <w:sz w:val="18"/>
+              </w:rPr>
+              <w:t xml:space="preserve">Home cooks who own their recipes</w:t>
+            </w:r>
+          </w:p>
+        </w:tc>
+        <w:tc>
+          <w:tcPr>
+            <w:tcW w:w="1680" w:type="dxa"/>
+          </w:tcPr>
+          <w:p>
+            <w:pPr>
+              <w:spacing w:before="40" w:after="40"/>
+            </w:pPr>
+            <w:r>
+              <w:rPr>
+                <w:b/>
+                <w:sz w:val="18"/>
+              </w:rPr>
+              <w:t xml:space="preserve">Independently owned, no investors</w:t>
+            </w:r>
+            <w:r>
+              <w:rPr>
+                <w:sz w:val="18"/>
+              </w:rPr>
+              <w:t xml:space="preserve">; founded by Clint &amp; Lisa Bounds, Loveland CO (</w:t>
+            </w:r>
+            <w:hyperlink r:id="rHl77">
+              <w:r>
+                <w:rPr>
+                  <w:rStyle w:val="Hyperlink"/>
+                  <w:sz w:val="18"/>
+                </w:rPr>
+                <w:t xml:space="preserve">about</w:t>
+              </w:r>
+            </w:hyperlink>
+            <w:r>
+              <w:rPr>
+                <w:sz w:val="18"/>
+              </w:rPr>
+              <w:t xml:space="preserve">)</w:t>
+            </w:r>
+          </w:p>
+        </w:tc>
+        <w:tc>
+          <w:tcPr>
+            <w:tcW w:w="1680" w:type="dxa"/>
+          </w:tcPr>
+          <w:p>
+            <w:pPr>
+              <w:spacing w:before="40" w:after="40"/>
+            </w:pPr>
+            <w:r>
+              <w:rPr>
+                <w:sz w:val="18"/>
+              </w:rPr>
+              <w:t xml:space="preserve">Shopping list can't be exported or filtered; free-to-paid transition cost users recipes; *(only 2 recent critical reviews — smallest complaint base here)*</w:t>
+            </w:r>
+          </w:p>
+        </w:tc>
+      </w:tr>
+    </w:tbl>
+    <w:p>
+      <w:pPr>
+        <w:spacing w:after="0"/>
+      </w:pPr>
+    </w:p>
+    <w:p>
+      <w:r>
+        <w:rPr>
+          <w:b/>
+        </w:rPr>
+        <w:t xml:space="preserve">App Store standing (for context):</w:t>
+      </w:r>
+      <w:r>
+        <w:t xml:space="preserve"> Fitia 4.9★ (22k) · MacroFactor 4.8★ (22k) · Samsung Food 4.8★ (6.4k) · MyFitnessPal 4.7★ (2.4M) · Eat This Much 4.7★ (22k) · MealPrepPro 4.7★ (12k) · eMeals 4.6★ (53k) · Plan to Eat 4.84★ (6.1k). All of these are well-liked apps; what follows is the complaint layer underneath.</w:t>
+      </w:r>
+    </w:p>
+    <w:p>
+      <w:pPr>
+        <w:pBdr>
+          <w:bottom w:val="single" w:sz="6" w:space="6" w:color="C9CCD1"/>
+        </w:pBdr>
+      </w:pPr>
+    </w:p>
+    <w:p>
+      <w:pPr>
+        <w:pStyle w:val="Heading1"/>
+      </w:pPr>
+      <w:r>
+        <w:t xml:space="preserve">Per-competitor detail: the three most common complaints</w:t>
+      </w:r>
+    </w:p>
+    <w:p>
+      <w:pPr>
+        <w:pStyle w:val="Heading2"/>
+      </w:pPr>
+      <w:r>
+        <w:t xml:space="preserve">MyFitnessPal — *the incumbent that's monetizing its own history*</w:t>
+      </w:r>
+    </w:p>
+    <w:p>
+      <w:r>
+        <w:t xml:space="preserve">1. </w:t>
+      </w:r>
+      <w:r>
+        <w:rPr>
+          <w:b/>
+        </w:rPr>
+        <w:t xml:space="preserve">Formerly-free features moved behind the paywall</w:t>
+      </w:r>
+      <w:r>
+        <w:t xml:space="preserve"> — 1★, Sept 19 2026 (*Xxxxxxggggxxaxxy*): barcode scanning used to be free, now it's paid, deleting the app. 1★, Sept 19 2026 (*Luke5t*): setting your own macros is now paid. (</w:t>
+      </w:r>
+      <w:hyperlink r:id="rHl43">
+        <w:r>
+          <w:rPr>
+            <w:rStyle w:val="Hyperlink"/>
+          </w:rPr>
+          <w:t xml:space="preserve">reviews</w:t>
+        </w:r>
+      </w:hyperlink>
+      <w:r>
+        <w:t xml:space="preserve">)</w:t>
+      </w:r>
+    </w:p>
+    <w:p>
+      <w:r>
+        <w:t xml:space="preserve">2. </w:t>
+      </w:r>
+      <w:r>
+        <w:rPr>
+          <w:b/>
+        </w:rPr>
+        <w:t xml:space="preserve">The redesign hid what people used</w:t>
+      </w:r>
+      <w:r>
+        <w:t xml:space="preserve"> — 1★, Sept 15 2026 (*AshenPie*): the old screen let them pin saturated fat and fiber for cholesterol management; now those are several screens deep. 1★, Aug 30 2026 (*Ravi2020*): more taps, no dashboard customization.</w:t>
+      </w:r>
+    </w:p>
+    <w:p>
+      <w:r>
+        <w:t xml:space="preserve">3. </w:t>
+      </w:r>
+      <w:r>
+        <w:rPr>
+          <w:b/>
+        </w:rPr>
+        <w:t xml:space="preserve">Accuracy and AI quality</w:t>
+      </w:r>
+      <w:r>
+        <w:t xml:space="preserve"> — 3★, Sept 18 2026 (*Hnsptl*): paid extra for barcode scanning, frequently inaccurate. 2★, Sept 16 2026 (*BAK77!*): AI camera inaccurate, fiber wrong, photo entries can't be edited without redoing them.</w:t>
+      </w:r>
+    </w:p>
+    <w:p>
+      <w:pPr>
+        <w:pStyle w:val="Heading2"/>
+      </w:pPr>
+      <w:r>
+        <w:t xml:space="preserve">MacroFactor — *the best algorithm, the weakest data trust*</w:t>
+      </w:r>
+    </w:p>
+    <w:p>
+      <w:r>
+        <w:t xml:space="preserve">1. </w:t>
+      </w:r>
+      <w:r>
+        <w:rPr>
+          <w:b/>
+        </w:rPr>
+        <w:t xml:space="preserve">Nutrition data disagrees with the label</w:t>
+      </w:r>
+      <w:r>
+        <w:t xml:space="preserve"> — 1★, Sept 8 2026 (*feelingconcerned*): repeated discrepancies vs. package labels, including via barcode.</w:t>
+      </w:r>
+    </w:p>
+    <w:p>
+      <w:r>
+        <w:t xml:space="preserve">2. </w:t>
+      </w:r>
+      <w:r>
+        <w:rPr>
+          <w:b/>
+        </w:rPr>
+        <w:t xml:space="preserve">Recipe import mangles macros</w:t>
+      </w:r>
+      <w:r>
+        <w:t xml:space="preserve"> — 1★, Apr 6 2026 (*kodiec*): a 45g-protein recipe imported as 9g, with no way to reach support.</w:t>
+      </w:r>
+    </w:p>
+    <w:p>
+      <w:r>
+        <w:t xml:space="preserve">3. </w:t>
+      </w:r>
+      <w:r>
+        <w:rPr>
+          <w:b/>
+        </w:rPr>
+        <w:t xml:space="preserve">No free tier at all</w:t>
+      </w:r>
+      <w:r>
+        <w:t xml:space="preserve"> — 1★, Sept 12 2026 (*Mrbaconcakes*) and 1★, Sept 2 2026 (*Crazydick65341*): a long onboarding questionnaire ending in a hard ~$11.99/month wall.</w:t>
+      </w:r>
+    </w:p>
+    <w:p>
+      <w:pPr>
+        <w:pStyle w:val="Heading2"/>
+      </w:pPr>
+      <w:r>
+        <w:t xml:space="preserve">eMeals — *the best grocery integration, the worst subscription terms*</w:t>
+      </w:r>
+    </w:p>
+    <w:p>
+      <w:r>
+        <w:t xml:space="preserve">1. </w:t>
+      </w:r>
+      <w:r>
+        <w:rPr>
+          <w:b/>
+        </w:rPr>
+        <w:t xml:space="preserve">No refunds, ever</w:t>
+      </w:r>
+      <w:r>
+        <w:t xml:space="preserve"> — 2★, Aug 29 2026 (*Phatpatio*): planning and ordering work; the objection is a blanket no-refund policy. 1★, Aug 5 2026 (*Sarah-Beee*): charged after cancelling, refund refused.</w:t>
+      </w:r>
+    </w:p>
+    <w:p>
+      <w:r>
+        <w:t xml:space="preserve">2. </w:t>
+      </w:r>
+      <w:r>
+        <w:rPr>
+          <w:b/>
+        </w:rPr>
+        <w:t xml:space="preserve">The grocery hand-off breaks</w:t>
+      </w:r>
+      <w:r>
+        <w:t xml:space="preserve"> — 2★, Sept 13 2026 (*cleanmydesk*): items didn't appear in the Walmart app and the whole list vanished on return.</w:t>
+      </w:r>
+    </w:p>
+    <w:p>
+      <w:r>
+        <w:t xml:space="preserve">3. </w:t>
+      </w:r>
+      <w:r>
+        <w:rPr>
+          <w:b/>
+        </w:rPr>
+        <w:t xml:space="preserve">Bland recipes and in-app commerce</w:t>
+      </w:r>
+      <w:r>
+        <w:t xml:space="preserve"> — 3★, June 24 2026 (*BeeKrazy77*): limited, under-seasoned, "kid friendly" untested on kids. 1★, Sept 19 2026 (*Brilliant.girl*): wine-pairing suggestions that can't be turned off, plus brand placements.</w:t>
+      </w:r>
+    </w:p>
+    <w:p>
+      <w:pPr>
+        <w:pStyle w:val="Heading2"/>
+      </w:pPr>
+      <w:r>
+        <w:t xml:space="preserve">Mealime — *the closest thing to this project, being switched off*</w:t>
+      </w:r>
+    </w:p>
+    <w:p>
+      <w:r>
+        <w:t xml:space="preserve">1. </w:t>
+      </w:r>
+      <w:r>
+        <w:rPr>
+          <w:b/>
+        </w:rPr>
+        <w:t xml:space="preserve">Being folded into a grocery chain</w:t>
+      </w:r>
+      <w:r>
+        <w:t xml:space="preserve"> — 1★, Sept 5 2026 (*99Grumps*): wanted a meal planner, not a chain's app tracking purchases; Meals Hub makes you pick one chain.</w:t>
+      </w:r>
+    </w:p>
+    <w:p>
+      <w:r>
+        <w:t xml:space="preserve">2. </w:t>
+      </w:r>
+      <w:r>
+        <w:rPr>
+          <w:b/>
+        </w:rPr>
+        <w:t xml:space="preserve">Loyal payers would have paid more to keep it</w:t>
+      </w:r>
+      <w:r>
+        <w:t xml:space="preserve"> — 1★, Sept 3 2026 (*Csquaredbrady*): years-long Pro subscriber, no Albertsons banner nearby, would gladly have paid more for it standalone.</w:t>
+      </w:r>
+    </w:p>
+    <w:p>
+      <w:r>
+        <w:t xml:space="preserve">3. </w:t>
+      </w:r>
+      <w:r>
+        <w:rPr>
+          <w:b/>
+        </w:rPr>
+        <w:t xml:space="preserve">No export; hand-copy or lose it</w:t>
+      </w:r>
+      <w:r>
+        <w:t xml:space="preserve"> — 1★, Sept 17 2026 (*Lady Wynter*): copying saved recipes into a document before deletion.</w:t>
+      </w:r>
+    </w:p>
+    <w:p>
+      <w:pPr>
+        <w:ind w:left="360"/>
+        <w:pBdr>
+          <w:left w:val="single" w:sz="18" w:space="8" w:color="9AA0A6"/>
+        </w:pBdr>
+      </w:pPr>
+      <w:r>
+        <w:rPr>
+          <w:b/>
+        </w:rPr>
+        <w:t xml:space="preserve">Conflict worth noting:</w:t>
+      </w:r>
+      <w:r>
+        <w:t xml:space="preserve"> Mealime's own </w:t>
+      </w:r>
+      <w:hyperlink r:id="rHl69">
+        <w:r>
+          <w:rPr>
+            <w:rStyle w:val="Hyperlink"/>
+          </w:rPr>
+          <w:t xml:space="preserve">closing notice</w:t>
+        </w:r>
+      </w:hyperlink>
+      <w:r>
+        <w:t xml:space="preserve"> states Meals Hub works regardless of store proximity, while multiple reviewers in FL and elsewhere report they cannot use it without a nearby banner store. I could not resolve which is right without an Albertsons account. </w:t>
+      </w:r>
+      <w:r>
+        <w:rPr>
+          <w:rFonts w:ascii="Consolas" w:hAnsi="Consolas"/>
+        </w:rPr>
+        <w:t xml:space="preserve">[UNVERIFIED]</w:t>
+      </w:r>
+    </w:p>
+    <w:p>
+      <w:pPr>
+        <w:pStyle w:val="Heading2"/>
+      </w:pPr>
+      <w:r>
+        <w:t xml:space="preserve">Fitia — *cheapest per-feature, most aggressive funnel*</w:t>
+      </w:r>
+    </w:p>
+    <w:p>
+      <w:r>
+        <w:t xml:space="preserve">1. </w:t>
+      </w:r>
+      <w:r>
+        <w:rPr>
+          <w:b/>
+        </w:rPr>
+        <w:t xml:space="preserve">Trial-to-charge surprises</w:t>
+      </w:r>
+      <w:r>
+        <w:t xml:space="preserve"> — 1★, Aug 26 2026 (*S brawl*): expected a 3-day trial, was charged $95, Apple refund refused.</w:t>
+      </w:r>
+    </w:p>
+    <w:p>
+      <w:r>
+        <w:t xml:space="preserve">2. </w:t>
+      </w:r>
+      <w:r>
+        <w:rPr>
+          <w:b/>
+        </w:rPr>
+        <w:t xml:space="preserve">Photo estimation misses</w:t>
+      </w:r>
+      <w:r>
+        <w:t xml:space="preserve"> — 1★, Aug 5 2026 (*curtis88*): confused chicken with fish, missed portion sizes, then deleted three days of entries.</w:t>
+      </w:r>
+    </w:p>
+    <w:p>
+      <w:r>
+        <w:t xml:space="preserve">3. </w:t>
+      </w:r>
+      <w:r>
+        <w:rPr>
+          <w:b/>
+        </w:rPr>
+        <w:t xml:space="preserve">Free version is effectively a demo</w:t>
+      </w:r>
+      <w:r>
+        <w:t xml:space="preserve"> — 1★, Sept 18 2026 (*Hajdjajcenckamanfkanxmckanv*, in Spanish): the app is useless unless you pay for Plus.</w:t>
+      </w:r>
+    </w:p>
+    <w:p>
+      <w:pPr>
+        <w:pStyle w:val="Heading2"/>
+      </w:pPr>
+      <w:r>
+        <w:t xml:space="preserve">Samsung Food — *the widest retailer coverage, the thinnest polish*</w:t>
+      </w:r>
+    </w:p>
+    <w:p>
+      <w:r>
+        <w:t xml:space="preserve">1. </w:t>
+      </w:r>
+      <w:r>
+        <w:rPr>
+          <w:b/>
+        </w:rPr>
+        <w:t xml:space="preserve">Recipe/collection management gaps</w:t>
+      </w:r>
+      <w:r>
+        <w:t xml:space="preserve"> — 2★, July 10 2026 (*2567 warrior princess*): can save 1,000+ recipes free, but can't delete or reorganize plan boxes properly.</w:t>
+      </w:r>
+    </w:p>
+    <w:p>
+      <w:r>
+        <w:t xml:space="preserve">2. </w:t>
+      </w:r>
+      <w:r>
+        <w:rPr>
+          <w:b/>
+        </w:rPr>
+        <w:t xml:space="preserve">Platform bugs and lost accounts</w:t>
+      </w:r>
+      <w:r>
+        <w:t xml:space="preserve"> — 1★, May 21 2026 (*Cschumer*): glitchy since the Whisk→Samsung Food change, won't load. 1★, Feb 24 2026 (*Phailbot*): account reported as never existing.</w:t>
+      </w:r>
+    </w:p>
+    <w:p>
+      <w:r>
+        <w:t xml:space="preserve">3. </w:t>
+      </w:r>
+      <w:r>
+        <w:rPr>
+          <w:b/>
+        </w:rPr>
+        <w:t xml:space="preserve">The headline feature doesn't rank correctly</w:t>
+      </w:r>
+      <w:r>
+        <w:t xml:space="preserve"> — 3★, Feb 1 2026 (*Indecho*): subscribed specifically for "use up your ingredients" recipe search; results come back effectively random.</w:t>
+      </w:r>
+    </w:p>
+    <w:p>
+      <w:pPr>
+        <w:pStyle w:val="Heading2"/>
+      </w:pPr>
+      <w:r>
+        <w:t xml:space="preserve">MealPrepPro — *the AI-slop problem in one app*</w:t>
+      </w:r>
+    </w:p>
+    <w:p>
+      <w:r>
+        <w:t xml:space="preserve">1. </w:t>
+      </w:r>
+      <w:r>
+        <w:rPr>
+          <w:b/>
+        </w:rPr>
+        <w:t xml:space="preserve">Paying for what a free chatbot does</w:t>
+      </w:r>
+      <w:r>
+        <w:t xml:space="preserve"> — 1★, July 15 2026 (*Chocokity1*): won't pay $9.99/month for AI-generated plans when ChatGPT or Gemini do it free.</w:t>
+      </w:r>
+    </w:p>
+    <w:p>
+      <w:r>
+        <w:t xml:space="preserve">2. </w:t>
+      </w:r>
+      <w:r>
+        <w:rPr>
+          <w:b/>
+        </w:rPr>
+        <w:t xml:space="preserve">Recipes taste bad</w:t>
+      </w:r>
+      <w:r>
+        <w:t xml:space="preserve"> — 1★, July 30 2026 (*Ospreyvision*): two meals cooked during the trial, one the worst they'd ever made. 2★, Sept 5 2026 (*SamLLLR23*): bland and obviously AI-written.</w:t>
+      </w:r>
+    </w:p>
+    <w:p>
+      <w:r>
+        <w:t xml:space="preserve">3. </w:t>
+      </w:r>
+      <w:r>
+        <w:rPr>
+          <w:b/>
+        </w:rPr>
+        <w:t xml:space="preserve">Ignores the targets and exclusions you set</w:t>
+      </w:r>
+      <w:r>
+        <w:t xml:space="preserve"> — 2★, Aug 30 2026 (*PatriciaVal*): asked about macros at onboarding then offers no macro setting. 2★, Apr 24 2026 (*spin0057*): "no beans" set, beans still appeared.</w:t>
+      </w:r>
+    </w:p>
+    <w:p>
+      <w:pPr>
+        <w:pStyle w:val="Heading2"/>
+      </w:pPr>
+      <w:r>
+        <w:t xml:space="preserve">Eat This Much — *right idea, unreliable execution*</w:t>
+      </w:r>
+    </w:p>
+    <w:p>
+      <w:r>
+        <w:t xml:space="preserve">1. </w:t>
+      </w:r>
+      <w:r>
+        <w:rPr>
+          <w:b/>
+        </w:rPr>
+        <w:t xml:space="preserve">Generated plans defy common sense</w:t>
+      </w:r>
+      <w:r>
+        <w:t xml:space="preserve"> — 1★, May 8 2026 (*billix0*): blocked recipes keep returning; two smoothies for breakfast, three for lunch; 6½ servings of yogurt in one sitting. 2★, June 28 2026 (*helloimarealist*): a lettuce-and-lemon wrap as dinner.</w:t>
+      </w:r>
+    </w:p>
+    <w:p>
+      <w:r>
+        <w:t xml:space="preserve">2. </w:t>
+      </w:r>
+      <w:r>
+        <w:rPr>
+          <w:b/>
+        </w:rPr>
+        <w:t xml:space="preserve">Advertised features that don't work</w:t>
+      </w:r>
+      <w:r>
+        <w:t xml:space="preserve"> — 3★, June 8 2026 (*AshleyNichol96*): pantry items no longer affect the plan. 1★, Apr 5 2026 (*InMarlton NJ*): can't find the advertised budget function, and quantities came out wrong.</w:t>
+      </w:r>
+    </w:p>
+    <w:p>
+      <w:r>
+        <w:t xml:space="preserve">3. </w:t>
+      </w:r>
+      <w:r>
+        <w:rPr>
+          <w:b/>
+        </w:rPr>
+        <w:t xml:space="preserve">Cost of the resulting groceries</w:t>
+      </w:r>
+      <w:r>
+        <w:t xml:space="preserve"> — 3★, May 26 2026 (*ConnorRealll*): even the "cheapest" generated plan produces an expensive shop; wants a hard budget setting.</w:t>
+      </w:r>
+    </w:p>
+    <w:p>
+      <w:pPr>
+        <w:pStyle w:val="Heading2"/>
+      </w:pPr>
+      <w:r>
+        <w:t xml:space="preserve">Plan to Eat — *small, liked, and deliberately narrow*</w:t>
+      </w:r>
+    </w:p>
+    <w:p>
+      <w:r>
+        <w:t xml:space="preserve">1. </w:t>
+      </w:r>
+      <w:r>
+        <w:rPr>
+          <w:b/>
+        </w:rPr>
+        <w:t xml:space="preserve">List is trapped in the app</w:t>
+      </w:r>
+      <w:r>
+        <w:t xml:space="preserve"> — 3★, Sept 19 2026 (*123Dana456*): no export to iOS Lists/Reminders, and every ingredient is force-added with no way to turn it off.</w:t>
+      </w:r>
+    </w:p>
+    <w:p>
+      <w:r>
+        <w:t xml:space="preserve">2. </w:t>
+      </w:r>
+      <w:r>
+        <w:rPr>
+          <w:b/>
+        </w:rPr>
+        <w:t xml:space="preserve">Paywall transition cost people their recipes</w:t>
+      </w:r>
+      <w:r>
+        <w:t xml:space="preserve"> — 1★, July 9 2026 (*MWDUIFLE*): was free until it wasn't; lost recipes as a result.</w:t>
+      </w:r>
+    </w:p>
+    <w:p>
+      <w:r>
+        <w:t xml:space="preserve">3. </w:t>
+      </w:r>
+      <w:r>
+        <w:rPr>
+          <w:b/>
+        </w:rPr>
+        <w:t xml:space="preserve">No third complaint of substance</w:t>
+      </w:r>
+      <w:r>
+        <w:t xml:space="preserve"> — only 2 critical reviews since March 2025, the lowest in this set. Read that as a satisfied niche, not as proof of quality </w:t>
+      </w:r>
+      <w:r>
+        <w:rPr>
+          <w:rFonts w:ascii="Consolas" w:hAnsi="Consolas"/>
+        </w:rPr>
+        <w:t xml:space="preserve">[UNVERIFIED]</w:t>
+      </w:r>
+      <w:r>
+        <w:t xml:space="preserve">.</w:t>
+      </w:r>
+    </w:p>
+    <w:p>
+      <w:pPr>
+        <w:pBdr>
+          <w:bottom w:val="single" w:sz="6" w:space="6" w:color="C9CCD1"/>
+        </w:pBdr>
+      </w:pPr>
+    </w:p>
+    <w:p>
+      <w:pPr>
+        <w:pStyle w:val="Heading1"/>
+      </w:pPr>
+      <w:r>
+        <w:t xml:space="preserve">What does nobody serve well?</w:t>
+      </w:r>
+    </w:p>
+    <w:p>
+      <w:r>
+        <w:t xml:space="preserve">Nine apps, and the category still splits cleanly into two halves that don't touch: </w:t>
+      </w:r>
+      <w:r>
+        <w:rPr>
+          <w:b/>
+        </w:rPr>
+        <w:t xml:space="preserve">apps that know your nutrition but can't buy food</w:t>
+      </w:r>
+      <w:r>
+        <w:t xml:space="preserve"> (MyFitnessPal, MacroFactor, Fitia) and </w:t>
+      </w:r>
+      <w:r>
+        <w:rPr>
+          <w:b/>
+        </w:rPr>
+        <w:t xml:space="preserve">apps that buy food but barely know your nutrition</w:t>
+      </w:r>
+      <w:r>
+        <w:t xml:space="preserve"> (eMeals, Mealime, Plan to Eat, Samsung Food). The gaps live in between.</w:t>
+      </w:r>
+    </w:p>
+    <w:p>
+      <w:r>
+        <w:rPr>
+          <w:b/>
+        </w:rPr>
+        <w:t xml:space="preserve">1. Micronutrients → cart. Nobody closes this loop.</w:t>
+      </w:r>
+    </w:p>
+    <w:p>
+      <w:r>
+        <w:t xml:space="preserve">MacroFactor tracks micronutrients but sells nothing; eMeals orders from eight retailers but plans by diet *label* ("keto," "heart healthy"), not by nutrient gap. </w:t>
+      </w:r>
+      <w:r>
+        <w:rPr>
+          <w:b/>
+        </w:rPr>
+        <w:t xml:space="preserve">No app in this set says "you're short on potassium and vitamin D this week, here are three recipes that fix it, here's the cart."</w:t>
+      </w:r>
+      <w:r>
+        <w:t xml:space="preserve"> That is the whole thesis of this project and it is genuinely unoccupied.</w:t>
+      </w:r>
+    </w:p>
+    <w:p>
+      <w:r>
+        <w:rPr>
+          <w:b/>
+        </w:rPr>
+        <w:t xml:space="preserve">2. Hard allergy and intolerance exclusion.</w:t>
+      </w:r>
+    </w:p>
+    <w:p>
+      <w:r>
+        <w:t xml:space="preserve">Every app offers preset allergen checkboxes. None reliably handles *your* list. Mealime — the best of them at 200+ options — still had no slot for a cilantro allergy or a low-histamine diet, and users of both Mealime and MealPrepPro report disliked ingredients appearing in plans anyway. </w:t>
+      </w:r>
+      <w:r>
+        <w:rPr>
+          <w:b/>
+        </w:rPr>
+        <w:t xml:space="preserve">An exclusion that actually holds, and is visibly verified at cart-build time, is a small feature with outsized trust value — and a safety issue for real allergies.</w:t>
+      </w:r>
+    </w:p>
+    <w:p>
+      <w:r>
+        <w:rPr>
+          <w:b/>
+        </w:rPr>
+        <w:t xml:space="preserve">3. Retailer neutrality and data portability.</w:t>
+      </w:r>
+    </w:p>
+    <w:p>
+      <w:r>
+        <w:t xml:space="preserve">Mealime's death is the proof: the one app that combined preferences, recipes and grocery lists well was bought by a grocery chain and is being switched off, with no export, pushing users into one chain's walled garden. Samsung Food has the same structural risk (an appliance maker's funnel). </w:t>
+      </w:r>
+      <w:r>
+        <w:rPr>
+          <w:b/>
+        </w:rPr>
+        <w:t xml:space="preserve">Being retailer-neutral and letting people leave with their data is a position no well-funded competitor can copy, because their owners bought them for the lock-in.</w:t>
+      </w:r>
+    </w:p>
+    <w:p>
+      <w:r>
+        <w:rPr>
+          <w:b/>
+        </w:rPr>
+        <w:t xml:space="preserve">4. GLP-1 users.</w:t>
+      </w:r>
+    </w:p>
+    <w:p>
+      <w:r>
+        <w:t xml:space="preserve">31M US adults are currently on a GLP-1 (Section 1). </w:t>
+      </w:r>
+      <w:r>
+        <w:rPr>
+          <w:b/>
+        </w:rPr>
+        <w:t xml:space="preserve">Not one of these nine apps is designed for suppressed appetite</w:t>
+      </w:r>
+      <w:r>
+        <w:t xml:space="preserve"> — where the problem inverts from "eat less" to "hit protein and micronutrient adequacy on 1,200 calories." Reviews don't even mention it. </w:t>
+      </w:r>
+      <w:r>
+        <w:rPr>
+          <w:rFonts w:ascii="Consolas" w:hAnsi="Consolas"/>
+        </w:rPr>
+        <w:t xml:space="preserve">[UNVERIFIED — absence in reviews is weak evidence of absence in product; I did not audit each app's full feature list for GLP-1 modes]</w:t>
+      </w:r>
+    </w:p>
+    <w:p>
+      <w:r>
+        <w:rPr>
+          <w:b/>
+        </w:rPr>
+        <w:t xml:space="preserve">5. Budget as a real constraint.</w:t>
+      </w:r>
+    </w:p>
+    <w:p>
+      <w:r>
+        <w:t xml:space="preserve">Eat This Much advertises budget planning and users can't find it working; another calls the cheapest generated plan expensive to shop. eMeals markets savings but doesn't price a cart before you commit. </w:t>
+      </w:r>
+      <w:r>
+        <w:rPr>
+          <w:b/>
+        </w:rPr>
+        <w:t xml:space="preserve">Nobody shows the actual dollar total of the week's plan before you buy, or re-plans to hit a number.</w:t>
+      </w:r>
+    </w:p>
+    <w:p>
+      <w:r>
+        <w:rPr>
+          <w:b/>
+        </w:rPr>
+        <w:t xml:space="preserve">6. The household, not the individual.</w:t>
+      </w:r>
+    </w:p>
+    <w:p>
+      <w:r>
+        <w:t xml:space="preserve">Every app plans for one eater. MyFitnessPal reviewers ask for per-person portions and half-servings for children; MealPrepPro's multi-user support is the exception and is thin. </w:t>
+      </w:r>
+      <w:r>
+        <w:rPr>
+          <w:b/>
+        </w:rPr>
+        <w:t xml:space="preserve">One plan, one cart, different people's targets and dislikes — unsolved.</w:t>
+      </w:r>
+    </w:p>
+    <w:p>
+      <w:r>
+        <w:rPr>
+          <w:b/>
+        </w:rPr>
+        <w:t xml:space="preserve">7. Pantry-aware planning that works.</w:t>
+      </w:r>
+    </w:p>
+    <w:p>
+      <w:r>
+        <w:t xml:space="preserve">Two apps advertise it (Eat This Much's pantry, Samsung Food's "use up your ingredients") and reviewers of both say it doesn't function. </w:t>
+      </w:r>
+      <w:r>
+        <w:rPr>
+          <w:b/>
+        </w:rPr>
+        <w:t xml:space="preserve">Waste reduction is a promised-but-undelivered feature category-wide.</w:t>
+      </w:r>
+    </w:p>
+    <w:p>
+      <w:r>
+        <w:rPr>
+          <w:b/>
+        </w:rPr>
+        <w:t xml:space="preserve">8. Trust as a product feature.</w:t>
+      </w:r>
+    </w:p>
+    <w:p>
+      <w:r>
+        <w:t xml:space="preserve">39% of all complaints in Section 2 were about money, not software: paywalls on formerly-free basics, refunds refused, cancellation friction, ads interrupting logging. </w:t>
+      </w:r>
+      <w:r>
+        <w:rPr>
+          <w:b/>
+        </w:rPr>
+        <w:t xml:space="preserve">A plain price, an easy cancel, no ads mid-log, and export-on-demand would be differentiating in this category — which is a damning thing to be able to say.</w:t>
+      </w:r>
+    </w:p>
+    <w:p>
+      <w:pPr>
+        <w:pStyle w:val="Heading2"/>
+      </w:pPr>
+      <w:r>
+        <w:t xml:space="preserve">The sharpest wedge</w:t>
+      </w:r>
+    </w:p>
+    <w:p>
+      <w:r>
+        <w:t xml:space="preserve">Combining 1, 2, 3 and 4: </w:t>
+      </w:r>
+      <w:r>
+        <w:rPr>
+          <w:b/>
+        </w:rPr>
+        <w:t xml:space="preserve">a retailer-neutral app that plans to nutrient targets (not diet labels), enforces personal exclusions strictly, prices the cart before you buy, and is built for people eating less than they used to.</w:t>
+      </w:r>
+      <w:r>
+        <w:t xml:space="preserve"> Mealime's users are looking for a new home *right now* — before October 21, 2026 — and the replacement being offered to them is a grocery chain's app. That is the most time-sensitive opening this research has found.</w:t>
+      </w:r>
+    </w:p>
+    <w:p>
+      <w:pPr>
+        <w:pBdr>
+          <w:bottom w:val="single" w:sz="6" w:space="6" w:color="C9CCD1"/>
+        </w:pBdr>
+      </w:pPr>
+    </w:p>
+    <w:p>
+      <w:pPr>
+        <w:pStyle w:val="Heading1"/>
+      </w:pPr>
+      <w:r>
+        <w:t xml:space="preserve">Flags</w:t>
+      </w:r>
+    </w:p>
+    <w:tbl>
+      <w:tblPr>
+        <w:tblW w:w="10080" w:type="dxa"/>
+        <w:tblBorders>
+          <w:top w:val="single" w:sz="4" w:space="0" w:color="C9CCD1"/>
+          <w:left w:val="single" w:sz="4" w:space="0" w:color="C9CCD1"/>
+          <w:bottom w:val="single" w:sz="4" w:space="0" w:color="C9CCD1"/>
+          <w:right w:val="single" w:sz="4" w:space="0" w:color="C9CCD1"/>
+          <w:insideH w:val="single" w:sz="4" w:space="0" w:color="C9CCD1"/>
+          <w:insideV w:val="single" w:sz="4" w:space="0" w:color="C9CCD1"/>
+        </w:tblBorders>
+        <w:tblLayout w:type="fixed"/>
+      </w:tblPr>
+      <w:tblGrid>
+        <w:gridCol w:w="5040"/>
+        <w:gridCol w:w="5040"/>
+      </w:tblGrid>
+      <w:tr>
+        <w:trPr>
+          <w:tblHeader/>
+        </w:trPr>
+        <w:tc>
+          <w:tcPr>
+            <w:tcW w:w="5040" w:type="dxa"/>
+            <w:shd w:val="clear" w:color="auto" w:fill="EFF1F3"/>
+          </w:tcPr>
+          <w:p>
+            <w:pPr>
+              <w:spacing w:before="40" w:after="40"/>
+            </w:pPr>
+            <w:r>
+              <w:rPr>
+                <w:b/>
+                <w:sz w:val="18"/>
+              </w:rPr>
+              <w:t xml:space="preserve">Item</w:t>
+            </w:r>
+          </w:p>
+        </w:tc>
+        <w:tc>
+          <w:tcPr>
+            <w:tcW w:w="5040" w:type="dxa"/>
+            <w:shd w:val="clear" w:color="auto" w:fill="EFF1F3"/>
+          </w:tcPr>
+          <w:p>
+            <w:pPr>
+              <w:spacing w:before="40" w:after="40"/>
+            </w:pPr>
+            <w:r>
+              <w:rPr>
+                <w:b/>
+                <w:sz w:val="18"/>
+              </w:rPr>
+              <w:t xml:space="preserve">Status</w:t>
+            </w:r>
+          </w:p>
+        </w:tc>
+      </w:tr>
+      <w:tr>
+        <w:tc>
+          <w:tcPr>
+            <w:tcW w:w="5040" w:type="dxa"/>
+          </w:tcPr>
+          <w:p>
+            <w:pPr>
+              <w:spacing w:before="40" w:after="40"/>
+            </w:pPr>
+            <w:r>
+              <w:rPr>
+                <w:sz w:val="18"/>
+              </w:rPr>
+              <w:t xml:space="preserve">Mealime Pro's former price</w:t>
+            </w:r>
+          </w:p>
+        </w:tc>
+        <w:tc>
+          <w:tcPr>
+            <w:tcW w:w="5040" w:type="dxa"/>
+          </w:tcPr>
+          <w:p>
+            <w:pPr>
+              <w:spacing w:before="40" w:after="40"/>
+            </w:pPr>
+            <w:r>
+              <w:rPr>
+                <w:sz w:val="18"/>
+              </w:rPr>
+              <w:t xml:space="preserve">❌ Not verified — the pricing page is gone post-shutdown-notice.</w:t>
+            </w:r>
+          </w:p>
+        </w:tc>
+      </w:tr>
+      <w:tr>
+        <w:tc>
+          <w:tcPr>
+            <w:tcW w:w="5040" w:type="dxa"/>
+          </w:tcPr>
+          <w:p>
+            <w:pPr>
+              <w:spacing w:before="40" w:after="40"/>
+            </w:pPr>
+            <w:r>
+              <w:rPr>
+                <w:sz w:val="18"/>
+              </w:rPr>
+              <w:t xml:space="preserve">MyFitnessPal "Premium+" tier</w:t>
+            </w:r>
+          </w:p>
+        </w:tc>
+        <w:tc>
+          <w:tcPr>
+            <w:tcW w:w="5040" w:type="dxa"/>
+          </w:tcPr>
+          <w:p>
+            <w:pPr>
+              <w:spacing w:before="40" w:after="40"/>
+            </w:pPr>
+            <w:r>
+              <w:rPr>
+                <w:sz w:val="18"/>
+              </w:rPr>
+              <w:t xml:space="preserve">❌ Not verified — </w:t>
+            </w:r>
+            <w:r>
+              <w:rPr>
+                <w:rFonts w:ascii="Consolas" w:hAnsi="Consolas"/>
+                <w:sz w:val="18"/>
+              </w:rPr>
+              <w:t xml:space="preserve">/premium/plus</w:t>
+            </w:r>
+            <w:r>
+              <w:rPr>
+                <w:sz w:val="18"/>
+              </w:rPr>
+              <w:t xml:space="preserve"> returns 404; the premium page shows only one tier.</w:t>
+            </w:r>
+          </w:p>
+        </w:tc>
+      </w:tr>
+      <w:tr>
+        <w:tc>
+          <w:tcPr>
+            <w:tcW w:w="5040" w:type="dxa"/>
+          </w:tcPr>
+          <w:p>
+            <w:pPr>
+              <w:spacing w:before="40" w:after="40"/>
+            </w:pPr>
+            <w:r>
+              <w:rPr>
+                <w:sz w:val="18"/>
+              </w:rPr>
+              <w:t xml:space="preserve">MealPrepPro tier names</w:t>
+            </w:r>
+          </w:p>
+        </w:tc>
+        <w:tc>
+          <w:tcPr>
+            <w:tcW w:w="5040" w:type="dxa"/>
+          </w:tcPr>
+          <w:p>
+            <w:pPr>
+              <w:spacing w:before="40" w:after="40"/>
+            </w:pPr>
+            <w:r>
+              <w:rPr>
+                <w:sz w:val="18"/>
+              </w:rPr>
+              <w:t xml:space="preserve">⚠️ App Store shows four prices without labels; the $229.99 being lifetime is </w:t>
+            </w:r>
+            <w:r>
+              <w:rPr>
+                <w:rFonts w:ascii="Consolas" w:hAnsi="Consolas"/>
+                <w:sz w:val="18"/>
+              </w:rPr>
+              <w:t xml:space="preserve">[UNVERIFIED]</w:t>
+            </w:r>
+            <w:r>
+              <w:rPr>
+                <w:sz w:val="18"/>
+              </w:rPr>
+              <w:t xml:space="preserve">.</w:t>
+            </w:r>
+          </w:p>
+        </w:tc>
+      </w:tr>
+      <w:tr>
+        <w:tc>
+          <w:tcPr>
+            <w:tcW w:w="5040" w:type="dxa"/>
+          </w:tcPr>
+          <w:p>
+            <w:pPr>
+              <w:spacing w:before="40" w:after="40"/>
+            </w:pPr>
+            <w:r>
+              <w:rPr>
+                <w:sz w:val="18"/>
+              </w:rPr>
+              <w:t xml:space="preserve">Eat This Much free tier &amp; pricing page</w:t>
+            </w:r>
+          </w:p>
+        </w:tc>
+        <w:tc>
+          <w:tcPr>
+            <w:tcW w:w="5040" w:type="dxa"/>
+          </w:tcPr>
+          <w:p>
+            <w:pPr>
+              <w:spacing w:before="40" w:after="40"/>
+            </w:pPr>
+            <w:r>
+              <w:rPr>
+                <w:sz w:val="18"/>
+              </w:rPr>
+              <w:t xml:space="preserve">⚠️ Their site requires JavaScript this tool can't run; prices come from the App Store instead.</w:t>
+            </w:r>
+          </w:p>
+        </w:tc>
+      </w:tr>
+      <w:tr>
+        <w:tc>
+          <w:tcPr>
+            <w:tcW w:w="5040" w:type="dxa"/>
+          </w:tcPr>
+          <w:p>
+            <w:pPr>
+              <w:spacing w:before="40" w:after="40"/>
+            </w:pPr>
+            <w:r>
+              <w:rPr>
+                <w:sz w:val="18"/>
+              </w:rPr>
+              <w:t xml:space="preserve">Funding for MacroFactor, MealPrepPro, Eat This Much, eMeals</w:t>
+            </w:r>
+          </w:p>
+        </w:tc>
+        <w:tc>
+          <w:tcPr>
+            <w:tcW w:w="5040" w:type="dxa"/>
+          </w:tcPr>
+          <w:p>
+            <w:pPr>
+              <w:spacing w:before="40" w:after="40"/>
+            </w:pPr>
+            <w:r>
+              <w:rPr>
+                <w:sz w:val="18"/>
+              </w:rPr>
+              <w:t xml:space="preserve">⚠️ "No funding found" ≠ "no funding." Crunchbase/PitchBook pages are paywalled to this tool.</w:t>
+            </w:r>
+          </w:p>
+        </w:tc>
+      </w:tr>
+      <w:tr>
+        <w:tc>
+          <w:tcPr>
+            <w:tcW w:w="5040" w:type="dxa"/>
+          </w:tcPr>
+          <w:p>
+            <w:pPr>
+              <w:spacing w:before="40" w:after="40"/>
+            </w:pPr>
+            <w:r>
+              <w:rPr>
+                <w:sz w:val="18"/>
+              </w:rPr>
+              <w:t xml:space="preserve">Fitia revenue (~$3.5M, 2024)</w:t>
+            </w:r>
+          </w:p>
+        </w:tc>
+        <w:tc>
+          <w:tcPr>
+            <w:tcW w:w="5040" w:type="dxa"/>
+          </w:tcPr>
+          <w:p>
+            <w:pPr>
+              <w:spacing w:before="40" w:after="40"/>
+            </w:pPr>
+            <w:r>
+              <w:rPr>
+                <w:sz w:val="18"/>
+              </w:rPr>
+              <w:t xml:space="preserve">⚠️ Secondary source (Latka), self-reported.</w:t>
+            </w:r>
+          </w:p>
+        </w:tc>
+      </w:tr>
+      <w:tr>
+        <w:tc>
+          <w:tcPr>
+            <w:tcW w:w="5040" w:type="dxa"/>
+          </w:tcPr>
+          <w:p>
+            <w:pPr>
+              <w:spacing w:before="40" w:after="40"/>
+            </w:pPr>
+            <w:r>
+              <w:rPr>
+                <w:sz w:val="18"/>
+              </w:rPr>
+              <w:t xml:space="preserve">G2 / Capterra / Reddit for these nine</w:t>
+            </w:r>
+          </w:p>
+        </w:tc>
+        <w:tc>
+          <w:tcPr>
+            <w:tcW w:w="5040" w:type="dxa"/>
+          </w:tcPr>
+          <w:p>
+            <w:pPr>
+              <w:spacing w:before="40" w:after="40"/>
+            </w:pPr>
+            <w:r>
+              <w:rPr>
+                <w:sz w:val="18"/>
+              </w:rPr>
+              <w:t xml:space="preserve">❌ G2 and Reddit blocked; Capterra lists professional software, not these consumer apps.</w:t>
+            </w:r>
+          </w:p>
+        </w:tc>
+      </w:tr>
+      <w:tr>
+        <w:tc>
+          <w:tcPr>
+            <w:tcW w:w="5040" w:type="dxa"/>
+          </w:tcPr>
+          <w:p>
+            <w:pPr>
+              <w:spacing w:before="40" w:after="40"/>
+            </w:pPr>
+            <w:r>
+              <w:rPr>
+                <w:sz w:val="18"/>
+              </w:rPr>
+              <w:t xml:space="preserve">Complaint percentages</w:t>
+            </w:r>
+          </w:p>
+        </w:tc>
+        <w:tc>
+          <w:tcPr>
+            <w:tcW w:w="5040" w:type="dxa"/>
+          </w:tcPr>
+          <w:p>
+            <w:pPr>
+              <w:spacing w:before="40" w:after="40"/>
+            </w:pPr>
+            <w:r>
+              <w:rPr>
+                <w:sz w:val="18"/>
+              </w:rPr>
+              <w:t xml:space="preserve">⚠️ Keyword matching over review text, spot-checked by reading. Magnitudes, not precision. Plan to Eat's base (n=2) is too small to generalize.</w:t>
             </w:r>
           </w:p>
         </w:tc>

</xml_diff>

<commit_message>
Add adversarial test of the newly-possible claim to DietGroceryApp dossier
Co-Authored-By: Claude Opus 5 <noreply@anthropic.com>
</commit_message>
<xml_diff>
--- a/07_DietGroceryApp/ResearchAgents/DietGroceryApp_Research.docx
+++ b/07_DietGroceryApp/ResearchAgents/DietGroceryApp_Research.docx
@@ -104,6 +104,17 @@
       </w:pPr>
       <w:r>
         <w:t xml:space="preserve">Section 4 — Bottom-Up Market Size: population-to-revenue funnel at $19.99/month, with conservative, base and optimistic cases and every assumption stated. *(Added Sept 22, 2026)*</w:t>
+      </w:r>
+    </w:p>
+    <w:p>
+      <w:pPr>
+        <w:numPr>
+          <w:ilvl w:val="0"/>
+          <w:numId w:val="1"/>
+        </w:numPr>
+      </w:pPr>
+      <w:r>
+        <w:t xml:space="preserve">Section 5 — Testing the "Newly Possible" Claim: evidence for and against, both counterarguments argued at full strength, and the narrowed claim that survives. *(Added Sept 22, 2026)*</w:t>
       </w:r>
     </w:p>
     <w:p>
@@ -11453,7 +11464,20 @@
               <w:rPr>
                 <w:sz w:val="18"/>
               </w:rPr>
-              <w:t xml:space="preserve">❌ Not verified — </w:t>
+              <w:t xml:space="preserve">⚠️ </w:t>
+            </w:r>
+            <w:r>
+              <w:rPr>
+                <w:b/>
+                <w:sz w:val="18"/>
+              </w:rPr>
+              <w:t xml:space="preserve">Corrected in Section 5:</w:t>
+            </w:r>
+            <w:r>
+              <w:rPr>
+                <w:sz w:val="18"/>
+              </w:rPr>
+              <w:t xml:space="preserve"> </w:t>
             </w:r>
             <w:r>
               <w:rPr>
@@ -11466,7 +11490,20 @@
               <w:rPr>
                 <w:sz w:val="18"/>
               </w:rPr>
-              <w:t xml:space="preserve"> returns 404; the premium page shows only one tier.</w:t>
+              <w:t xml:space="preserve"> returns 404, but Apple's App Store listing names </w:t>
+            </w:r>
+            <w:r>
+              <w:rPr>
+                <w:b/>
+                <w:sz w:val="18"/>
+              </w:rPr>
+              <w:t xml:space="preserve">Premium Plus</w:t>
+            </w:r>
+            <w:r>
+              <w:rPr>
+                <w:sz w:val="18"/>
+              </w:rPr>
+              <w:t xml:space="preserve"> and describes "personalized meal plans, integrated grocery delivery." So MyFitnessPal does ship the full combined bundle; the retailer list remains unverified.</w:t>
             </w:r>
           </w:p>
         </w:tc>
@@ -17111,6 +17148,2535 @@
                 <w:sz w:val="18"/>
               </w:rPr>
               <w:t xml:space="preserve">⚠️ Derived by subtracting the under-18 count from the national total — both Census figures, same vintage, but the Bureau doesn't publish the 18+ total in these two releases directly.</w:t>
+            </w:r>
+          </w:p>
+        </w:tc>
+      </w:tr>
+    </w:tbl>
+    <w:p>
+      <w:pPr>
+        <w:spacing w:after="0"/>
+      </w:pPr>
+    </w:p>
+    <w:p>
+      <w:r>
+        <w:br w:type="page"/>
+      </w:r>
+    </w:p>
+    <w:p>
+      <w:pPr>
+        <w:pStyle w:val="Title"/>
+      </w:pPr>
+      <w:r>
+        <w:t xml:space="preserve">Testing the Claim: "This Is Newly Possible Because of AI Agents"</w:t>
+      </w:r>
+    </w:p>
+    <w:p>
+      <w:r>
+        <w:rPr>
+          <w:b/>
+        </w:rPr>
+        <w:t xml:space="preserve">Prepared:</w:t>
+      </w:r>
+      <w:r>
+        <w:t xml:space="preserve"> September 22, 2026</w:t>
+      </w:r>
+    </w:p>
+    <w:p>
+      <w:r>
+        <w:rPr>
+          <w:b/>
+        </w:rPr>
+        <w:t xml:space="preserve">Window searched:</w:t>
+      </w:r>
+      <w:r>
+        <w:t xml:space="preserve"> March 2025 – September 2026 (last 18 months), plus historical evidence needed to test counterargument 1.</w:t>
+      </w:r>
+    </w:p>
+    <w:p>
+      <w:pPr>
+        <w:pStyle w:val="Heading1"/>
+      </w:pPr>
+      <w:r>
+        <w:t xml:space="preserve">The claim, stated precisely</w:t>
+      </w:r>
+    </w:p>
+    <w:p>
+      <w:pPr>
+        <w:ind w:left="360"/>
+        <w:pBdr>
+          <w:left w:val="single" w:sz="18" w:space="8" w:color="9AA0A6"/>
+        </w:pBdr>
+      </w:pPr>
+      <w:r>
+        <w:t xml:space="preserve">A single app combining (a) diet and nutrient assessment, (b) preferred-food selection and allergy exclusion, (c) recipe selection, and (d) grocery ordering from a </w:t>
+      </w:r>
+      <w:r>
+        <w:rPr>
+          <w:b/>
+        </w:rPr>
+        <w:t xml:space="preserve">locally selected</w:t>
+      </w:r>
+      <w:r>
+        <w:t xml:space="preserve"> store is </w:t>
+      </w:r>
+      <w:r>
+        <w:rPr>
+          <w:b/>
+        </w:rPr>
+        <w:t xml:space="preserve">newly possible</w:t>
+      </w:r>
+      <w:r>
+        <w:t xml:space="preserve"> because an AI agent can now compile these functions and execute the order.</w:t>
+      </w:r>
+    </w:p>
+    <w:p>
+      <w:r>
+        <w:rPr>
+          <w:b/>
+        </w:rPr>
+        <w:t xml:space="preserve">Verdict up front: the claim as written does not survive.</w:t>
+      </w:r>
+      <w:r>
+        <w:t xml:space="preserve"> Two of its four pillars were shipping commercially ten years ago, and the agentic-checkout rail it leans on was publicly scaled back in March 2026. A narrower version does survive — stated at the end.</w:t>
+      </w:r>
+    </w:p>
+    <w:p>
+      <w:pPr>
+        <w:pBdr>
+          <w:bottom w:val="single" w:sz="6" w:space="6" w:color="C9CCD1"/>
+        </w:pBdr>
+      </w:pPr>
+    </w:p>
+    <w:p>
+      <w:pPr>
+        <w:pStyle w:val="Heading1"/>
+      </w:pPr>
+      <w:r>
+        <w:t xml:space="preserve">Part 1 — Evidence FOR</w:t>
+      </w:r>
+    </w:p>
+    <w:p>
+      <w:pPr>
+        <w:pStyle w:val="Heading2"/>
+      </w:pPr>
+      <w:r>
+        <w:t xml:space="preserve">1a. Product launches (last 18 months)</w:t>
+      </w:r>
+    </w:p>
+    <w:tbl>
+      <w:tblPr>
+        <w:tblW w:w="10080" w:type="dxa"/>
+        <w:tblBorders>
+          <w:top w:val="single" w:sz="4" w:space="0" w:color="C9CCD1"/>
+          <w:left w:val="single" w:sz="4" w:space="0" w:color="C9CCD1"/>
+          <w:bottom w:val="single" w:sz="4" w:space="0" w:color="C9CCD1"/>
+          <w:right w:val="single" w:sz="4" w:space="0" w:color="C9CCD1"/>
+          <w:insideH w:val="single" w:sz="4" w:space="0" w:color="C9CCD1"/>
+          <w:insideV w:val="single" w:sz="4" w:space="0" w:color="C9CCD1"/>
+        </w:tblBorders>
+        <w:tblLayout w:type="fixed"/>
+      </w:tblPr>
+      <w:tblGrid>
+        <w:gridCol w:w="3360"/>
+        <w:gridCol w:w="3360"/>
+        <w:gridCol w:w="3360"/>
+      </w:tblGrid>
+      <w:tr>
+        <w:trPr>
+          <w:tblHeader/>
+        </w:trPr>
+        <w:tc>
+          <w:tcPr>
+            <w:tcW w:w="3360" w:type="dxa"/>
+            <w:shd w:val="clear" w:color="auto" w:fill="EFF1F3"/>
+          </w:tcPr>
+          <w:p>
+            <w:pPr>
+              <w:spacing w:before="40" w:after="40"/>
+            </w:pPr>
+            <w:r>
+              <w:rPr>
+                <w:b/>
+                <w:sz w:val="18"/>
+              </w:rPr>
+              <w:t xml:space="preserve">Date</w:t>
+            </w:r>
+          </w:p>
+        </w:tc>
+        <w:tc>
+          <w:tcPr>
+            <w:tcW w:w="3360" w:type="dxa"/>
+            <w:shd w:val="clear" w:color="auto" w:fill="EFF1F3"/>
+          </w:tcPr>
+          <w:p>
+            <w:pPr>
+              <w:spacing w:before="40" w:after="40"/>
+            </w:pPr>
+            <w:r>
+              <w:rPr>
+                <w:b/>
+                <w:sz w:val="18"/>
+              </w:rPr>
+              <w:t xml:space="preserve">Launch</w:t>
+            </w:r>
+          </w:p>
+        </w:tc>
+        <w:tc>
+          <w:tcPr>
+            <w:tcW w:w="3360" w:type="dxa"/>
+            <w:shd w:val="clear" w:color="auto" w:fill="EFF1F3"/>
+          </w:tcPr>
+          <w:p>
+            <w:pPr>
+              <w:spacing w:before="40" w:after="40"/>
+            </w:pPr>
+            <w:r>
+              <w:rPr>
+                <w:b/>
+                <w:sz w:val="18"/>
+              </w:rPr>
+              <w:t xml:space="preserve">Why it supports the claim</w:t>
+            </w:r>
+          </w:p>
+        </w:tc>
+      </w:tr>
+      <w:tr>
+        <w:tc>
+          <w:tcPr>
+            <w:tcW w:w="3360" w:type="dxa"/>
+          </w:tcPr>
+          <w:p>
+            <w:pPr>
+              <w:spacing w:before="40" w:after="40"/>
+            </w:pPr>
+            <w:r>
+              <w:rPr>
+                <w:b/>
+                <w:sz w:val="18"/>
+              </w:rPr>
+              <w:t xml:space="preserve">Dec 8, 2025</w:t>
+            </w:r>
+          </w:p>
+        </w:tc>
+        <w:tc>
+          <w:tcPr>
+            <w:tcW w:w="3360" w:type="dxa"/>
+          </w:tcPr>
+          <w:p>
+            <w:pPr>
+              <w:spacing w:before="40" w:after="40"/>
+            </w:pPr>
+            <w:r>
+              <w:rPr>
+                <w:b/>
+                <w:sz w:val="18"/>
+              </w:rPr>
+              <w:t xml:space="preserve">Instacart app inside ChatGPT</w:t>
+            </w:r>
+            <w:r>
+              <w:rPr>
+                <w:sz w:val="18"/>
+              </w:rPr>
+              <w:t xml:space="preserve"> with Instant Checkout — plan meals, browse local items, build a cart and check out in one conversation, across </w:t>
+            </w:r>
+            <w:r>
+              <w:rPr>
+                <w:b/>
+                <w:sz w:val="18"/>
+              </w:rPr>
+              <w:t xml:space="preserve">1,800+ retailers</w:t>
+            </w:r>
+          </w:p>
+        </w:tc>
+        <w:tc>
+          <w:tcPr>
+            <w:tcW w:w="3360" w:type="dxa"/>
+          </w:tcPr>
+          <w:p>
+            <w:pPr>
+              <w:spacing w:before="40" w:after="40"/>
+            </w:pPr>
+            <w:r>
+              <w:rPr>
+                <w:sz w:val="18"/>
+              </w:rPr>
+              <w:t xml:space="preserve">This is close to a literal implementation of the claim's last mile (</w:t>
+            </w:r>
+            <w:hyperlink r:id="rHl85">
+              <w:r>
+                <w:rPr>
+                  <w:rStyle w:val="Hyperlink"/>
+                  <w:sz w:val="18"/>
+                </w:rPr>
+                <w:t xml:space="preserve">Instacart newsroom</w:t>
+              </w:r>
+            </w:hyperlink>
+            <w:r>
+              <w:rPr>
+                <w:sz w:val="18"/>
+              </w:rPr>
+              <w:t xml:space="preserve">)</w:t>
+            </w:r>
+          </w:p>
+        </w:tc>
+      </w:tr>
+      <w:tr>
+        <w:tc>
+          <w:tcPr>
+            <w:tcW w:w="3360" w:type="dxa"/>
+          </w:tcPr>
+          <w:p>
+            <w:pPr>
+              <w:spacing w:before="40" w:after="40"/>
+            </w:pPr>
+            <w:r>
+              <w:rPr>
+                <w:b/>
+                <w:sz w:val="18"/>
+              </w:rPr>
+              <w:t xml:space="preserve">Oct 14, 2025</w:t>
+            </w:r>
+          </w:p>
+        </w:tc>
+        <w:tc>
+          <w:tcPr>
+            <w:tcW w:w="3360" w:type="dxa"/>
+          </w:tcPr>
+          <w:p>
+            <w:pPr>
+              <w:spacing w:before="40" w:after="40"/>
+            </w:pPr>
+            <w:r>
+              <w:rPr>
+                <w:b/>
+                <w:sz w:val="18"/>
+              </w:rPr>
+              <w:t xml:space="preserve">Walmart + OpenAI partnership</w:t>
+            </w:r>
+            <w:r>
+              <w:rPr>
+                <w:sz w:val="18"/>
+              </w:rPr>
+              <w:t xml:space="preserve"> for AI-first shopping</w:t>
+            </w:r>
+          </w:p>
+        </w:tc>
+        <w:tc>
+          <w:tcPr>
+            <w:tcW w:w="3360" w:type="dxa"/>
+          </w:tcPr>
+          <w:p>
+            <w:pPr>
+              <w:spacing w:before="40" w:after="40"/>
+            </w:pPr>
+            <w:r>
+              <w:rPr>
+                <w:sz w:val="18"/>
+              </w:rPr>
+              <w:t xml:space="preserve">Largest US grocer committing to agent-mediated ordering (</w:t>
+            </w:r>
+            <w:hyperlink r:id="rHl86">
+              <w:r>
+                <w:rPr>
+                  <w:rStyle w:val="Hyperlink"/>
+                  <w:sz w:val="18"/>
+                </w:rPr>
+                <w:t xml:space="preserve">Businesswire</w:t>
+              </w:r>
+            </w:hyperlink>
+            <w:r>
+              <w:rPr>
+                <w:sz w:val="18"/>
+              </w:rPr>
+              <w:t xml:space="preserve">)</w:t>
+            </w:r>
+          </w:p>
+        </w:tc>
+      </w:tr>
+      <w:tr>
+        <w:tc>
+          <w:tcPr>
+            <w:tcW w:w="3360" w:type="dxa"/>
+          </w:tcPr>
+          <w:p>
+            <w:pPr>
+              <w:spacing w:before="40" w:after="40"/>
+            </w:pPr>
+            <w:r>
+              <w:rPr>
+                <w:b/>
+                <w:sz w:val="18"/>
+              </w:rPr>
+              <w:t xml:space="preserve">Mar 25, 2026</w:t>
+            </w:r>
+          </w:p>
+        </w:tc>
+        <w:tc>
+          <w:tcPr>
+            <w:tcW w:w="3360" w:type="dxa"/>
+          </w:tcPr>
+          <w:p>
+            <w:pPr>
+              <w:spacing w:before="40" w:after="40"/>
+            </w:pPr>
+            <w:r>
+              <w:rPr>
+                <w:b/>
+                <w:sz w:val="18"/>
+              </w:rPr>
+              <w:t xml:space="preserve">Walmart's Sparky agent inside ChatGPT</w:t>
+            </w:r>
+            <w:r>
+              <w:rPr>
+                <w:sz w:val="18"/>
+              </w:rPr>
+              <w:t xml:space="preserve">; Sparky usage </w:t>
+            </w:r>
+            <w:r>
+              <w:rPr>
+                <w:b/>
+                <w:sz w:val="18"/>
+              </w:rPr>
+              <w:t xml:space="preserve">+60% quarter-over-quarter</w:t>
+            </w:r>
+            <w:r>
+              <w:rPr>
+                <w:sz w:val="18"/>
+              </w:rPr>
+              <w:t xml:space="preserve">, engaged customers place orders </w:t>
+            </w:r>
+            <w:r>
+              <w:rPr>
+                <w:b/>
+                <w:sz w:val="18"/>
+              </w:rPr>
+              <w:t xml:space="preserve">40% larger</w:t>
+            </w:r>
+          </w:p>
+        </w:tc>
+        <w:tc>
+          <w:tcPr>
+            <w:tcW w:w="3360" w:type="dxa"/>
+          </w:tcPr>
+          <w:p>
+            <w:pPr>
+              <w:spacing w:before="40" w:after="40"/>
+            </w:pPr>
+            <w:r>
+              <w:rPr>
+                <w:sz w:val="18"/>
+              </w:rPr>
+              <w:t xml:space="preserve">Real usage and basket data, not a pilot (</w:t>
+            </w:r>
+            <w:hyperlink r:id="rHl87">
+              <w:r>
+                <w:rPr>
+                  <w:rStyle w:val="Hyperlink"/>
+                  <w:sz w:val="18"/>
+                </w:rPr>
+                <w:t xml:space="preserve">Grocery Dive</w:t>
+              </w:r>
+            </w:hyperlink>
+            <w:r>
+              <w:rPr>
+                <w:sz w:val="18"/>
+              </w:rPr>
+              <w:t xml:space="preserve">, </w:t>
+            </w:r>
+            <w:hyperlink r:id="rHl88">
+              <w:r>
+                <w:rPr>
+                  <w:rStyle w:val="Hyperlink"/>
+                  <w:sz w:val="18"/>
+                </w:rPr>
+                <w:t xml:space="preserve">Constellation</w:t>
+              </w:r>
+            </w:hyperlink>
+            <w:r>
+              <w:rPr>
+                <w:sz w:val="18"/>
+              </w:rPr>
+              <w:t xml:space="preserve">)</w:t>
+            </w:r>
+          </w:p>
+        </w:tc>
+      </w:tr>
+      <w:tr>
+        <w:tc>
+          <w:tcPr>
+            <w:tcW w:w="3360" w:type="dxa"/>
+          </w:tcPr>
+          <w:p>
+            <w:pPr>
+              <w:spacing w:before="40" w:after="40"/>
+            </w:pPr>
+            <w:r>
+              <w:rPr>
+                <w:b/>
+                <w:sz w:val="18"/>
+              </w:rPr>
+              <w:t xml:space="preserve">July 2026</w:t>
+            </w:r>
+          </w:p>
+        </w:tc>
+        <w:tc>
+          <w:tcPr>
+            <w:tcW w:w="3360" w:type="dxa"/>
+          </w:tcPr>
+          <w:p>
+            <w:pPr>
+              <w:spacing w:before="40" w:after="40"/>
+            </w:pPr>
+            <w:r>
+              <w:rPr>
+                <w:b/>
+                <w:sz w:val="18"/>
+              </w:rPr>
+              <w:t xml:space="preserve">Kroger AI shopping assistant</w:t>
+            </w:r>
+            <w:r>
+              <w:rPr>
+                <w:sz w:val="18"/>
+              </w:rPr>
+              <w:t xml:space="preserve"> (Gemini Enterprise) — plans meals, finds recipes, builds carts "tailored to budgets and </w:t>
+            </w:r>
+            <w:r>
+              <w:rPr>
+                <w:b/>
+                <w:sz w:val="18"/>
+              </w:rPr>
+              <w:t xml:space="preserve">dietary needs</w:t>
+            </w:r>
+            <w:r>
+              <w:rPr>
+                <w:sz w:val="18"/>
+              </w:rPr>
+              <w:t xml:space="preserve">"</w:t>
+            </w:r>
+          </w:p>
+        </w:tc>
+        <w:tc>
+          <w:tcPr>
+            <w:tcW w:w="3360" w:type="dxa"/>
+          </w:tcPr>
+          <w:p>
+            <w:pPr>
+              <w:spacing w:before="40" w:after="40"/>
+            </w:pPr>
+            <w:r>
+              <w:rPr>
+                <w:sz w:val="18"/>
+              </w:rPr>
+              <w:t xml:space="preserve">A major grocer shipping the diet-aware cart (</w:t>
+            </w:r>
+            <w:hyperlink r:id="rHl89">
+              <w:r>
+                <w:rPr>
+                  <w:rStyle w:val="Hyperlink"/>
+                  <w:sz w:val="18"/>
+                </w:rPr>
+                <w:t xml:space="preserve">Kroger IR</w:t>
+              </w:r>
+            </w:hyperlink>
+            <w:r>
+              <w:rPr>
+                <w:sz w:val="18"/>
+              </w:rPr>
+              <w:t xml:space="preserve">)</w:t>
+            </w:r>
+          </w:p>
+        </w:tc>
+      </w:tr>
+      <w:tr>
+        <w:tc>
+          <w:tcPr>
+            <w:tcW w:w="3360" w:type="dxa"/>
+          </w:tcPr>
+          <w:p>
+            <w:pPr>
+              <w:spacing w:before="40" w:after="40"/>
+            </w:pPr>
+            <w:r>
+              <w:rPr>
+                <w:b/>
+                <w:sz w:val="18"/>
+              </w:rPr>
+              <w:t xml:space="preserve">Aug 2026</w:t>
+            </w:r>
+          </w:p>
+        </w:tc>
+        <w:tc>
+          <w:tcPr>
+            <w:tcW w:w="3360" w:type="dxa"/>
+          </w:tcPr>
+          <w:p>
+            <w:pPr>
+              <w:spacing w:before="40" w:after="40"/>
+            </w:pPr>
+            <w:r>
+              <w:rPr>
+                <w:b/>
+                <w:sz w:val="18"/>
+              </w:rPr>
+              <w:t xml:space="preserve">Ninth Circuit vacated</w:t>
+            </w:r>
+            <w:r>
+              <w:rPr>
+                <w:sz w:val="18"/>
+              </w:rPr>
+              <w:t xml:space="preserve"> Amazon's injunction against Perplexity's Comet: when a user directs an agent, it is </w:t>
+            </w:r>
+            <w:r>
+              <w:rPr>
+                <w:b/>
+                <w:sz w:val="18"/>
+              </w:rPr>
+              <w:t xml:space="preserve">the user</w:t>
+            </w:r>
+            <w:r>
+              <w:rPr>
+                <w:sz w:val="18"/>
+              </w:rPr>
+              <w:t xml:space="preserve"> accessing the site</w:t>
+            </w:r>
+          </w:p>
+        </w:tc>
+        <w:tc>
+          <w:tcPr>
+            <w:tcW w:w="3360" w:type="dxa"/>
+          </w:tcPr>
+          <w:p>
+            <w:pPr>
+              <w:spacing w:before="40" w:after="40"/>
+            </w:pPr>
+            <w:r>
+              <w:rPr>
+                <w:sz w:val="18"/>
+              </w:rPr>
+              <w:t xml:space="preserve">Removes a major legal blocker to agent-driven ordering (</w:t>
+            </w:r>
+            <w:hyperlink r:id="rHl90">
+              <w:r>
+                <w:rPr>
+                  <w:rStyle w:val="Hyperlink"/>
+                  <w:sz w:val="18"/>
+                </w:rPr>
+                <w:t xml:space="preserve">eMarketer</w:t>
+              </w:r>
+            </w:hyperlink>
+            <w:r>
+              <w:rPr>
+                <w:sz w:val="18"/>
+              </w:rPr>
+              <w:t xml:space="preserve">, </w:t>
+            </w:r>
+            <w:hyperlink r:id="rHl91">
+              <w:r>
+                <w:rPr>
+                  <w:rStyle w:val="Hyperlink"/>
+                  <w:sz w:val="18"/>
+                </w:rPr>
+                <w:t xml:space="preserve">CNBC</w:t>
+              </w:r>
+            </w:hyperlink>
+            <w:r>
+              <w:rPr>
+                <w:sz w:val="18"/>
+              </w:rPr>
+              <w:t xml:space="preserve">)</w:t>
+            </w:r>
+          </w:p>
+        </w:tc>
+      </w:tr>
+    </w:tbl>
+    <w:p>
+      <w:pPr>
+        <w:spacing w:after="0"/>
+      </w:pPr>
+    </w:p>
+    <w:p>
+      <w:pPr>
+        <w:pStyle w:val="Heading2"/>
+      </w:pPr>
+      <w:r>
+        <w:t xml:space="preserve">1b. Adoption data (last 18 months)</w:t>
+      </w:r>
+    </w:p>
+    <w:tbl>
+      <w:tblPr>
+        <w:tblW w:w="10080" w:type="dxa"/>
+        <w:tblBorders>
+          <w:top w:val="single" w:sz="4" w:space="0" w:color="C9CCD1"/>
+          <w:left w:val="single" w:sz="4" w:space="0" w:color="C9CCD1"/>
+          <w:bottom w:val="single" w:sz="4" w:space="0" w:color="C9CCD1"/>
+          <w:right w:val="single" w:sz="4" w:space="0" w:color="C9CCD1"/>
+          <w:insideH w:val="single" w:sz="4" w:space="0" w:color="C9CCD1"/>
+          <w:insideV w:val="single" w:sz="4" w:space="0" w:color="C9CCD1"/>
+        </w:tblBorders>
+        <w:tblLayout w:type="fixed"/>
+      </w:tblPr>
+      <w:tblGrid>
+        <w:gridCol w:w="3360"/>
+        <w:gridCol w:w="3360"/>
+        <w:gridCol w:w="3360"/>
+      </w:tblGrid>
+      <w:tr>
+        <w:trPr>
+          <w:tblHeader/>
+        </w:trPr>
+        <w:tc>
+          <w:tcPr>
+            <w:tcW w:w="3360" w:type="dxa"/>
+            <w:shd w:val="clear" w:color="auto" w:fill="EFF1F3"/>
+          </w:tcPr>
+          <w:p>
+            <w:pPr>
+              <w:spacing w:before="40" w:after="40"/>
+            </w:pPr>
+            <w:r>
+              <w:rPr>
+                <w:b/>
+                <w:sz w:val="18"/>
+              </w:rPr>
+              <w:t xml:space="preserve">Metric</w:t>
+            </w:r>
+          </w:p>
+        </w:tc>
+        <w:tc>
+          <w:tcPr>
+            <w:tcW w:w="3360" w:type="dxa"/>
+            <w:shd w:val="clear" w:color="auto" w:fill="EFF1F3"/>
+          </w:tcPr>
+          <w:p>
+            <w:pPr>
+              <w:spacing w:before="40" w:after="40"/>
+            </w:pPr>
+            <w:r>
+              <w:rPr>
+                <w:b/>
+                <w:sz w:val="18"/>
+              </w:rPr>
+              <w:t xml:space="preserve">Figure</w:t>
+            </w:r>
+          </w:p>
+        </w:tc>
+        <w:tc>
+          <w:tcPr>
+            <w:tcW w:w="3360" w:type="dxa"/>
+            <w:shd w:val="clear" w:color="auto" w:fill="EFF1F3"/>
+          </w:tcPr>
+          <w:p>
+            <w:pPr>
+              <w:spacing w:before="40" w:after="40"/>
+            </w:pPr>
+            <w:r>
+              <w:rPr>
+                <w:b/>
+                <w:sz w:val="18"/>
+              </w:rPr>
+              <w:t xml:space="preserve">Source</w:t>
+            </w:r>
+          </w:p>
+        </w:tc>
+      </w:tr>
+      <w:tr>
+        <w:tc>
+          <w:tcPr>
+            <w:tcW w:w="3360" w:type="dxa"/>
+          </w:tcPr>
+          <w:p>
+            <w:pPr>
+              <w:spacing w:before="40" w:after="40"/>
+            </w:pPr>
+            <w:r>
+              <w:rPr>
+                <w:sz w:val="18"/>
+              </w:rPr>
+              <w:t xml:space="preserve">AI-referred traffic to US retail sites, Q1 2026</w:t>
+            </w:r>
+          </w:p>
+        </w:tc>
+        <w:tc>
+          <w:tcPr>
+            <w:tcW w:w="3360" w:type="dxa"/>
+          </w:tcPr>
+          <w:p>
+            <w:pPr>
+              <w:spacing w:before="40" w:after="40"/>
+            </w:pPr>
+            <w:r>
+              <w:rPr>
+                <w:b/>
+                <w:sz w:val="18"/>
+              </w:rPr>
+              <w:t xml:space="preserve">+393% YoY</w:t>
+            </w:r>
+            <w:r>
+              <w:rPr>
+                <w:sz w:val="18"/>
+              </w:rPr>
+              <w:t xml:space="preserve">; +1,324% since Oct 2024</w:t>
+            </w:r>
+          </w:p>
+        </w:tc>
+        <w:tc>
+          <w:tcPr>
+            <w:tcW w:w="3360" w:type="dxa"/>
+          </w:tcPr>
+          <w:p>
+            <w:pPr>
+              <w:spacing w:before="40" w:after="40"/>
+            </w:pPr>
+            <w:hyperlink r:id="rHl92">
+              <w:r>
+                <w:rPr>
+                  <w:rStyle w:val="Hyperlink"/>
+                  <w:sz w:val="18"/>
+                </w:rPr>
+                <w:t xml:space="preserve">Adobe via TechCrunch</w:t>
+              </w:r>
+            </w:hyperlink>
+          </w:p>
+        </w:tc>
+      </w:tr>
+      <w:tr>
+        <w:tc>
+          <w:tcPr>
+            <w:tcW w:w="3360" w:type="dxa"/>
+          </w:tcPr>
+          <w:p>
+            <w:pPr>
+              <w:spacing w:before="40" w:after="40"/>
+            </w:pPr>
+            <w:r>
+              <w:rPr>
+                <w:sz w:val="18"/>
+              </w:rPr>
+              <w:t xml:space="preserve">AI-referred conversion vs. non-AI traffic, May 2026</w:t>
+            </w:r>
+          </w:p>
+        </w:tc>
+        <w:tc>
+          <w:tcPr>
+            <w:tcW w:w="3360" w:type="dxa"/>
+          </w:tcPr>
+          <w:p>
+            <w:pPr>
+              <w:spacing w:before="40" w:after="40"/>
+            </w:pPr>
+            <w:r>
+              <w:rPr>
+                <w:b/>
+                <w:sz w:val="18"/>
+              </w:rPr>
+              <w:t xml:space="preserve">+54%</w:t>
+            </w:r>
+            <w:r>
+              <w:rPr>
+                <w:sz w:val="18"/>
+              </w:rPr>
+              <w:t xml:space="preserve"> (was </w:t>
+            </w:r>
+            <w:r>
+              <w:rPr>
+                <w:b/>
+                <w:sz w:val="18"/>
+              </w:rPr>
+              <w:t xml:space="preserve">−38%</w:t>
+            </w:r>
+            <w:r>
+              <w:rPr>
+                <w:sz w:val="18"/>
+              </w:rPr>
+              <w:t xml:space="preserve"> in March 2025 — a complete reversal in 14 months)</w:t>
+            </w:r>
+          </w:p>
+        </w:tc>
+        <w:tc>
+          <w:tcPr>
+            <w:tcW w:w="3360" w:type="dxa"/>
+          </w:tcPr>
+          <w:p>
+            <w:pPr>
+              <w:spacing w:before="40" w:after="40"/>
+            </w:pPr>
+            <w:hyperlink r:id="rHl93">
+              <w:r>
+                <w:rPr>
+                  <w:rStyle w:val="Hyperlink"/>
+                  <w:sz w:val="18"/>
+                </w:rPr>
+                <w:t xml:space="preserve">Adobe</w:t>
+              </w:r>
+            </w:hyperlink>
+          </w:p>
+        </w:tc>
+      </w:tr>
+      <w:tr>
+        <w:tc>
+          <w:tcPr>
+            <w:tcW w:w="3360" w:type="dxa"/>
+          </w:tcPr>
+          <w:p>
+            <w:pPr>
+              <w:spacing w:before="40" w:after="40"/>
+            </w:pPr>
+            <w:r>
+              <w:rPr>
+                <w:sz w:val="18"/>
+              </w:rPr>
+              <w:t xml:space="preserve">Consumers who have used AI assistants to shop</w:t>
+            </w:r>
+          </w:p>
+        </w:tc>
+        <w:tc>
+          <w:tcPr>
+            <w:tcW w:w="3360" w:type="dxa"/>
+          </w:tcPr>
+          <w:p>
+            <w:pPr>
+              <w:spacing w:before="40" w:after="40"/>
+            </w:pPr>
+            <w:r>
+              <w:rPr>
+                <w:b/>
+                <w:sz w:val="18"/>
+              </w:rPr>
+              <w:t xml:space="preserve">39%</w:t>
+            </w:r>
+            <w:r>
+              <w:rPr>
+                <w:sz w:val="18"/>
+              </w:rPr>
+              <w:t xml:space="preserve"> (Adobe survey, Mar 2026)</w:t>
+            </w:r>
+          </w:p>
+        </w:tc>
+        <w:tc>
+          <w:tcPr>
+            <w:tcW w:w="3360" w:type="dxa"/>
+          </w:tcPr>
+          <w:p>
+            <w:pPr>
+              <w:spacing w:before="40" w:after="40"/>
+            </w:pPr>
+            <w:hyperlink r:id="rHl93">
+              <w:r>
+                <w:rPr>
+                  <w:rStyle w:val="Hyperlink"/>
+                  <w:sz w:val="18"/>
+                </w:rPr>
+                <w:t xml:space="preserve">Adobe</w:t>
+              </w:r>
+            </w:hyperlink>
+          </w:p>
+        </w:tc>
+      </w:tr>
+      <w:tr>
+        <w:tc>
+          <w:tcPr>
+            <w:tcW w:w="3360" w:type="dxa"/>
+          </w:tcPr>
+          <w:p>
+            <w:pPr>
+              <w:spacing w:before="40" w:after="40"/>
+            </w:pPr>
+            <w:r>
+              <w:rPr>
+                <w:sz w:val="18"/>
+              </w:rPr>
+              <w:t xml:space="preserve">Consumers who used AI to generate a </w:t>
+            </w:r>
+            <w:r>
+              <w:rPr>
+                <w:b/>
+                <w:sz w:val="18"/>
+              </w:rPr>
+              <w:t xml:space="preserve">grocery list</w:t>
+            </w:r>
+          </w:p>
+        </w:tc>
+        <w:tc>
+          <w:tcPr>
+            <w:tcW w:w="3360" w:type="dxa"/>
+          </w:tcPr>
+          <w:p>
+            <w:pPr>
+              <w:spacing w:before="40" w:after="40"/>
+            </w:pPr>
+            <w:r>
+              <w:rPr>
+                <w:b/>
+                <w:sz w:val="18"/>
+              </w:rPr>
+              <w:t xml:space="preserve">25%</w:t>
+            </w:r>
+            <w:r>
+              <w:rPr>
+                <w:sz w:val="18"/>
+              </w:rPr>
+              <w:t xml:space="preserve"> (MorganMyers Food Pulse, Mar 2026, n=366, ±5%)</w:t>
+            </w:r>
+          </w:p>
+        </w:tc>
+        <w:tc>
+          <w:tcPr>
+            <w:tcW w:w="3360" w:type="dxa"/>
+          </w:tcPr>
+          <w:p>
+            <w:pPr>
+              <w:spacing w:before="40" w:after="40"/>
+            </w:pPr>
+            <w:hyperlink r:id="rHl94">
+              <w:r>
+                <w:rPr>
+                  <w:rStyle w:val="Hyperlink"/>
+                  <w:sz w:val="18"/>
+                </w:rPr>
+                <w:t xml:space="preserve">MorganMyers</w:t>
+              </w:r>
+            </w:hyperlink>
+          </w:p>
+        </w:tc>
+      </w:tr>
+      <w:tr>
+        <w:tc>
+          <w:tcPr>
+            <w:tcW w:w="3360" w:type="dxa"/>
+          </w:tcPr>
+          <w:p>
+            <w:pPr>
+              <w:spacing w:before="40" w:after="40"/>
+            </w:pPr>
+            <w:r>
+              <w:rPr>
+                <w:sz w:val="18"/>
+              </w:rPr>
+              <w:t xml:space="preserve">Consumers naming AI as their most-used recipe source</w:t>
+            </w:r>
+          </w:p>
+        </w:tc>
+        <w:tc>
+          <w:tcPr>
+            <w:tcW w:w="3360" w:type="dxa"/>
+          </w:tcPr>
+          <w:p>
+            <w:pPr>
+              <w:spacing w:before="40" w:after="40"/>
+            </w:pPr>
+            <w:r>
+              <w:rPr>
+                <w:b/>
+                <w:sz w:val="18"/>
+              </w:rPr>
+              <w:t xml:space="preserve">13%</w:t>
+            </w:r>
+            <w:r>
+              <w:rPr>
+                <w:sz w:val="18"/>
+              </w:rPr>
+              <w:t xml:space="preserve"> (vs. 42% social media)</w:t>
+            </w:r>
+          </w:p>
+        </w:tc>
+        <w:tc>
+          <w:tcPr>
+            <w:tcW w:w="3360" w:type="dxa"/>
+          </w:tcPr>
+          <w:p>
+            <w:pPr>
+              <w:spacing w:before="40" w:after="40"/>
+            </w:pPr>
+            <w:hyperlink r:id="rHl94">
+              <w:r>
+                <w:rPr>
+                  <w:rStyle w:val="Hyperlink"/>
+                  <w:sz w:val="18"/>
+                </w:rPr>
+                <w:t xml:space="preserve">MorganMyers</w:t>
+              </w:r>
+            </w:hyperlink>
+          </w:p>
+        </w:tc>
+      </w:tr>
+    </w:tbl>
+    <w:p>
+      <w:pPr>
+        <w:spacing w:after="0"/>
+      </w:pPr>
+    </w:p>
+    <w:p>
+      <w:pPr>
+        <w:pStyle w:val="Heading2"/>
+      </w:pPr>
+      <w:r>
+        <w:t xml:space="preserve">1c. The strongest single data point for "AI changed something"</w:t>
+      </w:r>
+    </w:p>
+    <w:p>
+      <w:r>
+        <w:rPr>
+          <w:b/>
+        </w:rPr>
+        <w:t xml:space="preserve">Cal AI</w:t>
+      </w:r>
+      <w:r>
+        <w:t xml:space="preserve">: founded early 2024, first code March 2024, launched May 2024, photo-based calorie logging → </w:t>
+      </w:r>
+      <w:r>
+        <w:rPr>
+          <w:b/>
+        </w:rPr>
+        <w:t xml:space="preserve">15M+ downloads and $40M in sales in the trailing 12 months</w:t>
+      </w:r>
+      <w:r>
+        <w:t xml:space="preserve">, acquired by MyFitnessPal (deal closed Dec 2025, announced Mar 2, 2026). (</w:t>
+      </w:r>
+      <w:hyperlink r:id="rHl95">
+        <w:r>
+          <w:rPr>
+            <w:rStyle w:val="Hyperlink"/>
+          </w:rPr>
+          <w:t xml:space="preserve">TechCrunch</w:t>
+        </w:r>
+      </w:hyperlink>
+      <w:r>
+        <w:t xml:space="preserve">; </w:t>
+      </w:r>
+      <w:hyperlink r:id="rHl96">
+        <w:r>
+          <w:rPr>
+            <w:rStyle w:val="Hyperlink"/>
+          </w:rPr>
+          <w:t xml:space="preserve">GlobeNewswire</w:t>
+        </w:r>
+      </w:hyperlink>
+      <w:r>
+        <w:t xml:space="preserve">)</w:t>
+      </w:r>
+    </w:p>
+    <w:p>
+      <w:r>
+        <w:t xml:space="preserve">Nothing like that trajectory was achievable in 2021, and the reason is specifically a model capability: </w:t>
+      </w:r>
+      <w:r>
+        <w:rPr>
+          <w:b/>
+        </w:rPr>
+        <w:t xml:space="preserve">estimating nutrition from a photograph.</w:t>
+      </w:r>
+      <w:r>
+        <w:t xml:space="preserve"> This is the one pillar of the claim that is genuinely new — and note that it's the *assessment* pillar, not the *agent ordering* pillar.</w:t>
+      </w:r>
+    </w:p>
+    <w:p>
+      <w:pPr>
+        <w:pStyle w:val="Heading2"/>
+      </w:pPr>
+      <w:r>
+        <w:t xml:space="preserve">1d. Benchmarks</w:t>
+      </w:r>
+    </w:p>
+    <w:p>
+      <w:r>
+        <w:t xml:space="preserve">Multimodal models reached ~88% food recognition accuracy under heavy occlusion and ~75% composition accuracy; 2025 peer-reviewed evaluations found ChatGPT and Claude match traditional self-reported dietary assessment accuracy </w:t>
+      </w:r>
+      <w:r>
+        <w:rPr>
+          <w:b/>
+        </w:rPr>
+        <w:t xml:space="preserve">without the user burden</w:t>
+      </w:r>
+      <w:r>
+        <w:t xml:space="preserve"> (</w:t>
+      </w:r>
+      <w:hyperlink r:id="rHl34">
+        <w:r>
+          <w:rPr>
+            <w:rStyle w:val="Hyperlink"/>
+          </w:rPr>
+          <w:t xml:space="preserve">PubMed</w:t>
+        </w:r>
+      </w:hyperlink>
+      <w:r>
+        <w:t xml:space="preserve">; </w:t>
+      </w:r>
+      <w:hyperlink r:id="rHl35">
+        <w:r>
+          <w:rPr>
+            <w:rStyle w:val="Hyperlink"/>
+          </w:rPr>
+          <w:t xml:space="preserve">PMC benchmark</w:t>
+        </w:r>
+      </w:hyperlink>
+      <w:r>
+        <w:t xml:space="preserve">). Web-agent benchmarks have also climbed steeply on paper — WebArena and OSWorld leaderboards now report scores in the 70–86% range versus 12–35% for 2024-era agents (</w:t>
+      </w:r>
+      <w:hyperlink r:id="rHl97">
+        <w:r>
+          <w:rPr>
+            <w:rStyle w:val="Hyperlink"/>
+          </w:rPr>
+          <w:t xml:space="preserve">Steel.dev leaderboards</w:t>
+        </w:r>
+      </w:hyperlink>
+      <w:r>
+        <w:t xml:space="preserve">) </w:t>
+      </w:r>
+      <w:r>
+        <w:rPr>
+          <w:rFonts w:ascii="Consolas" w:hAnsi="Consolas"/>
+        </w:rPr>
+        <w:t xml:space="preserve">[UNVERIFIED — third-party leaderboard aggregator, not the original benchmark authors]</w:t>
+      </w:r>
+      <w:r>
+        <w:t xml:space="preserve">.</w:t>
+      </w:r>
+    </w:p>
+    <w:p>
+      <w:pPr>
+        <w:pBdr>
+          <w:bottom w:val="single" w:sz="6" w:space="6" w:color="C9CCD1"/>
+        </w:pBdr>
+      </w:pPr>
+    </w:p>
+    <w:p>
+      <w:pPr>
+        <w:pStyle w:val="Heading1"/>
+      </w:pPr>
+      <w:r>
+        <w:t xml:space="preserve">Part 2 — Evidence AGAINST</w:t>
+      </w:r>
+    </w:p>
+    <w:p>
+      <w:pPr>
+        <w:pStyle w:val="Heading2"/>
+      </w:pPr>
+      <w:r>
+        <w:t xml:space="preserve">2a. The agentic checkout rail partially collapsed — in public, this year</w:t>
+      </w:r>
+    </w:p>
+    <w:p>
+      <w:r>
+        <w:rPr>
+          <w:b/>
+        </w:rPr>
+        <w:t xml:space="preserve">March 17, 2026: OpenAI scaled back Instant Checkout.</w:t>
+      </w:r>
+      <w:r>
+        <w:t xml:space="preserve"> Users are now redirected to partner apps (Instacart, Target, Expedia) to pay, rather than completing purchase in chat. Reported reasons: </w:t>
+      </w:r>
+      <w:r>
+        <w:rPr>
+          <w:b/>
+        </w:rPr>
+        <w:t xml:space="preserve">product data was frequently wrong</w:t>
+      </w:r>
+      <w:r>
+        <w:t xml:space="preserve">, merchant onboarding was far harder than expected, and OpenAI couldn't ship multi-item carts or loyalty connections. Out of Shopify's millions of merchants, </w:t>
+      </w:r>
+      <w:r>
+        <w:rPr>
+          <w:b/>
+        </w:rPr>
+        <w:t xml:space="preserve">roughly a dozen went live</w:t>
+      </w:r>
+      <w:r>
+        <w:t xml:space="preserve">. Users researched in ChatGPT but wouldn't pay there. The industry regrouped around "</w:t>
+      </w:r>
+      <w:r>
+        <w:rPr>
+          <w:b/>
+        </w:rPr>
+        <w:t xml:space="preserve">discover in AI, buy on your own site.</w:t>
+      </w:r>
+      <w:r>
+        <w:t xml:space="preserve">" (</w:t>
+      </w:r>
+      <w:hyperlink r:id="rHl98">
+        <w:r>
+          <w:rPr>
+            <w:rStyle w:val="Hyperlink"/>
+          </w:rPr>
+          <w:t xml:space="preserve">CNBC</w:t>
+        </w:r>
+      </w:hyperlink>
+      <w:r>
+        <w:t xml:space="preserve">, </w:t>
+      </w:r>
+      <w:hyperlink r:id="rHl99">
+        <w:r>
+          <w:rPr>
+            <w:rStyle w:val="Hyperlink"/>
+          </w:rPr>
+          <w:t xml:space="preserve">Modern Retail</w:t>
+        </w:r>
+      </w:hyperlink>
+      <w:r>
+        <w:t xml:space="preserve">, </w:t>
+      </w:r>
+      <w:hyperlink r:id="rHl100">
+        <w:r>
+          <w:rPr>
+            <w:rStyle w:val="Hyperlink"/>
+          </w:rPr>
+          <w:t xml:space="preserve">Forbes</w:t>
+        </w:r>
+      </w:hyperlink>
+      <w:r>
+        <w:t xml:space="preserve">)</w:t>
+      </w:r>
+    </w:p>
+    <w:p>
+      <w:r>
+        <w:t xml:space="preserve">This is the single most damaging fact for the claim. </w:t>
+      </w:r>
+      <w:r>
+        <w:rPr>
+          <w:b/>
+        </w:rPr>
+        <w:t xml:space="preserve">The specific capability the claim rests on — an agent completing the grocery order — is the part that has most visibly failed to hold up at scale in the past year.</w:t>
+      </w:r>
+      <w:r>
+        <w:t xml:space="preserve"> Multi-item carts, which is exactly what a week's groceries is, were named as a thing it could not do.</w:t>
+      </w:r>
+    </w:p>
+    <w:p>
+      <w:pPr>
+        <w:pStyle w:val="Heading2"/>
+      </w:pPr>
+      <w:r>
+        <w:t xml:space="preserve">2b. Agent reliability decays with repetition, and groceries are a repeated task</w:t>
+      </w:r>
+    </w:p>
+    <w:p>
+      <w:r>
+        <w:t xml:space="preserve">τ-bench measures multi-turn tool-use agents against realistic retail/airline tasks. Frontier function-calling agents scored ~61% on τ-retail single-attempt (pass^1), but </w:t>
+      </w:r>
+      <w:r>
+        <w:rPr>
+          <w:b/>
+        </w:rPr>
+        <w:t xml:space="preserve">pass^8 — succeeding on all 8 independent attempts at the same task — fell below 25%</w:t>
+      </w:r>
+      <w:r>
+        <w:t xml:space="preserve">. The benchmark's authors conclude agents "lack sufficient consistency and rule-following ability to reliably build real-world applications." (</w:t>
+      </w:r>
+      <w:hyperlink r:id="rHl101">
+        <w:r>
+          <w:rPr>
+            <w:rStyle w:val="Hyperlink"/>
+          </w:rPr>
+          <w:t xml:space="preserve">τ-bench paper</w:t>
+        </w:r>
+      </w:hyperlink>
+      <w:r>
+        <w:t xml:space="preserve">; </w:t>
+      </w:r>
+      <w:hyperlink r:id="rHl102">
+        <w:r>
+          <w:rPr>
+            <w:rStyle w:val="Hyperlink"/>
+          </w:rPr>
+          <w:t xml:space="preserve">Sierra</w:t>
+        </w:r>
+      </w:hyperlink>
+      <w:r>
+        <w:t xml:space="preserve">)</w:t>
+      </w:r>
+    </w:p>
+    <w:p>
+      <w:r>
+        <w:t xml:space="preserve">A meal-planning app is a </w:t>
+      </w:r>
+      <w:r>
+        <w:rPr>
+          <w:b/>
+        </w:rPr>
+        <w:t xml:space="preserve">weekly</w:t>
+      </w:r>
+      <w:r>
+        <w:t xml:space="preserve"> task. A 90%-per-attempt agent is right on all 8 of a two-month run only </w:t>
+      </w:r>
+      <w:r>
+        <w:rPr>
+          <w:b/>
+        </w:rPr>
+        <w:t xml:space="preserve">57%</w:t>
+      </w:r>
+      <w:r>
+        <w:t xml:space="preserve"> of the time. Groceries are exactly the domain where pass^k, not pass^1, is the number that matters.</w:t>
+      </w:r>
+    </w:p>
+    <w:p>
+      <w:pPr>
+        <w:pStyle w:val="Heading2"/>
+      </w:pPr>
+      <w:r>
+        <w:t xml:space="preserve">2c. Headline agent benchmark progress is contested</w:t>
+      </w:r>
+    </w:p>
+    <w:p>
+      <w:r>
+        <w:t xml:space="preserve">The Online-Mind2Web team titled their evaluation paper </w:t>
+      </w:r>
+      <w:r>
+        <w:rPr>
+          <w:b/>
+        </w:rPr>
+        <w:t xml:space="preserve">"An Illusion of Progress?"</w:t>
+      </w:r>
+      <w:r>
+        <w:t xml:space="preserve"> and showed that the same agents score dramatically differently depending on the automatic evaluator used — raising the question of how much of the reported gain is genuine capability versus evaluation artifact. (</w:t>
+      </w:r>
+      <w:hyperlink r:id="rHl103">
+        <w:r>
+          <w:rPr>
+            <w:rStyle w:val="Hyperlink"/>
+          </w:rPr>
+          <w:t xml:space="preserve">OSU-NLP-Group</w:t>
+        </w:r>
+      </w:hyperlink>
+      <w:r>
+        <w:t xml:space="preserve">)</w:t>
+      </w:r>
+    </w:p>
+    <w:p>
+      <w:pPr>
+        <w:pStyle w:val="Heading2"/>
+      </w:pPr>
+      <w:r>
+        <w:t xml:space="preserve">2d. The allergy pillar is where LLMs are actually dangerous</w:t>
+      </w:r>
+    </w:p>
+    <w:p>
+      <w:pPr>
+        <w:numPr>
+          <w:ilvl w:val="0"/>
+          <w:numId w:val="1"/>
+        </w:numPr>
+      </w:pPr>
+      <w:r>
+        <w:t xml:space="preserve">Across LLMs, </w:t>
+      </w:r>
+      <w:r>
+        <w:rPr>
+          <w:b/>
+        </w:rPr>
+        <w:t xml:space="preserve">problematic responses to patient-posed medical questions ranged 21.6% (Claude) to 43.2% (Llama), with unsafe responses 5% to 13%</w:t>
+      </w:r>
+      <w:r>
+        <w:t xml:space="preserve"> (</w:t>
+      </w:r>
+      <w:hyperlink r:id="rHl104">
+        <w:r>
+          <w:rPr>
+            <w:rStyle w:val="Hyperlink"/>
+          </w:rPr>
+          <w:t xml:space="preserve">npj Digital Medicine</w:t>
+        </w:r>
+      </w:hyperlink>
+      <w:r>
+        <w:t xml:space="preserve">)</w:t>
+      </w:r>
+    </w:p>
+    <w:p>
+      <w:pPr>
+        <w:numPr>
+          <w:ilvl w:val="0"/>
+          <w:numId w:val="1"/>
+        </w:numPr>
+      </w:pPr>
+      <w:r>
+        <w:t xml:space="preserve">A study of ChatGPT-generated allergy diets found it produced balanced diets but was </w:t>
+      </w:r>
+      <w:r>
+        <w:rPr>
+          <w:b/>
+        </w:rPr>
+        <w:t xml:space="preserve">unsafe for one allergen</w:t>
+      </w:r>
+      <w:r>
+        <w:t xml:space="preserve">, and </w:t>
+      </w:r>
+      <w:r>
+        <w:rPr>
+          <w:b/>
+        </w:rPr>
+        <w:t xml:space="preserve">over 60% of its cited sources were wrong or fabricated</w:t>
+      </w:r>
+      <w:r>
+        <w:t xml:space="preserve"> (</w:t>
+      </w:r>
+      <w:hyperlink r:id="rHl105">
+        <w:r>
+          <w:rPr>
+            <w:rStyle w:val="Hyperlink"/>
+          </w:rPr>
+          <w:t xml:space="preserve">J Acad Nutr Diet</w:t>
+        </w:r>
+      </w:hyperlink>
+      <w:r>
+        <w:t xml:space="preserve">)</w:t>
+      </w:r>
+    </w:p>
+    <w:p>
+      <w:pPr>
+        <w:numPr>
+          <w:ilvl w:val="0"/>
+          <w:numId w:val="1"/>
+        </w:numPr>
+      </w:pPr>
+      <w:r>
+        <w:t xml:space="preserve">A 120-question allergology evaluation found </w:t>
+      </w:r>
+      <w:r>
+        <w:rPr>
+          <w:b/>
+        </w:rPr>
+        <w:t xml:space="preserve">six critical errors</w:t>
+      </w:r>
+      <w:r>
+        <w:t xml:space="preserve">, including a </w:t>
+      </w:r>
+      <w:r>
+        <w:rPr>
+          <w:b/>
+        </w:rPr>
+        <w:t xml:space="preserve">pediatric food-allergen error with potentially life-threatening risk</w:t>
+      </w:r>
+      <w:r>
+        <w:t xml:space="preserve"> (</w:t>
+      </w:r>
+      <w:hyperlink r:id="rHl106">
+        <w:r>
+          <w:rPr>
+            <w:rStyle w:val="Hyperlink"/>
+          </w:rPr>
+          <w:t xml:space="preserve">JACI In Practice</w:t>
+        </w:r>
+      </w:hyperlink>
+      <w:r>
+        <w:t xml:space="preserve">)</w:t>
+      </w:r>
+    </w:p>
+    <w:p>
+      <w:r>
+        <w:t xml:space="preserve">The claim asserts an AI agent can do allergy exclusion. The literature says a probabilistic model doing allergen exclusion without a deterministic check is a safety hazard. </w:t>
+      </w:r>
+      <w:r>
+        <w:rPr>
+          <w:b/>
+        </w:rPr>
+        <w:t xml:space="preserve">Allergen exclusion should be a database rule the AI is not allowed to override</w:t>
+      </w:r>
+      <w:r>
+        <w:t xml:space="preserve"> — which is an argument that this pillar should *not* be AI at all.</w:t>
+      </w:r>
+    </w:p>
+    <w:p>
+      <w:pPr>
+        <w:pStyle w:val="Heading2"/>
+      </w:pPr>
+      <w:r>
+        <w:t xml:space="preserve">2e. The physical last mile is unchanged</w:t>
+      </w:r>
+    </w:p>
+    <w:p>
+      <w:r>
+        <w:t xml:space="preserve">Instacart sits at </w:t>
+      </w:r>
+      <w:r>
+        <w:rPr>
+          <w:b/>
+        </w:rPr>
+        <w:t xml:space="preserve">1.2★ across 12,279 Trustpilot reviews</w:t>
+      </w:r>
+      <w:r>
+        <w:t xml:space="preserve"> for substitutions, missing items and refused refunds (Section 2). No model improvement fixes a shopper picking the wrong item. An agent that orders perfectly still delivers the category's worst-rated experience.</w:t>
+      </w:r>
+    </w:p>
+    <w:p>
+      <w:pPr>
+        <w:pBdr>
+          <w:bottom w:val="single" w:sz="6" w:space="6" w:color="C9CCD1"/>
+        </w:pBdr>
+      </w:pPr>
+    </w:p>
+    <w:p>
+      <w:pPr>
+        <w:pStyle w:val="Heading1"/>
+      </w:pPr>
+      <w:r>
+        <w:t xml:space="preserve">Part 3 — Counterargument 1, argued at full strength</w:t>
+      </w:r>
+    </w:p>
+    <w:p>
+      <w:pPr>
+        <w:pStyle w:val="Heading2"/>
+      </w:pPr>
+      <w:r>
+        <w:rPr>
+          <w:b/>
+        </w:rPr>
+        <w:t xml:space="preserve">"This was already possible five years ago."</w:t>
+      </w:r>
+    </w:p>
+    <w:p>
+      <w:r>
+        <w:t xml:space="preserve">Not just five. </w:t>
+      </w:r>
+      <w:r>
+        <w:rPr>
+          <w:b/>
+        </w:rPr>
+        <w:t xml:space="preserve">Ten.</w:t>
+      </w:r>
+      <w:r>
+        <w:t xml:space="preserve"> Take the claim's four pillars in turn:</w:t>
+      </w:r>
+    </w:p>
+    <w:p>
+      <w:r>
+        <w:rPr>
+          <w:b/>
+        </w:rPr>
+        <w:t xml:space="preserve">Grocery ordering from a locally selected store, triggered by a meal plan:</w:t>
+      </w:r>
+    </w:p>
+    <w:p>
+      <w:pPr>
+        <w:numPr>
+          <w:ilvl w:val="0"/>
+          <w:numId w:val="1"/>
+        </w:numPr>
+      </w:pPr>
+      <w:r>
+        <w:rPr>
+          <w:b/>
+        </w:rPr>
+        <w:t xml:space="preserve">October 2015</w:t>
+      </w:r>
+      <w:r>
+        <w:t xml:space="preserve"> — Instacart + Allrecipes: click a recipe, ingredients go to your cart (</w:t>
+      </w:r>
+      <w:hyperlink r:id="rHl107">
+        <w:r>
+          <w:rPr>
+            <w:rStyle w:val="Hyperlink"/>
+          </w:rPr>
+          <w:t xml:space="preserve">TechCrunch</w:t>
+        </w:r>
+      </w:hyperlink>
+      <w:r>
+        <w:t xml:space="preserve">)</w:t>
+      </w:r>
+    </w:p>
+    <w:p>
+      <w:pPr>
+        <w:numPr>
+          <w:ilvl w:val="0"/>
+          <w:numId w:val="1"/>
+        </w:numPr>
+      </w:pPr>
+      <w:r>
+        <w:rPr>
+          <w:b/>
+        </w:rPr>
+        <w:t xml:space="preserve">September 2016</w:t>
+      </w:r>
+      <w:r>
+        <w:t xml:space="preserve"> — </w:t>
+      </w:r>
+      <w:r>
+        <w:rPr>
+          <w:b/>
+        </w:rPr>
+        <w:t xml:space="preserve">Eat This Much</w:t>
+      </w:r>
+      <w:r>
+        <w:t xml:space="preserve"> shipped one-click export of an auto-generated meal plan's grocery list to Instacart, delivered in as little as an hour (</w:t>
+      </w:r>
+      <w:hyperlink r:id="rHl108">
+        <w:r>
+          <w:rPr>
+            <w:rStyle w:val="Hyperlink"/>
+          </w:rPr>
+          <w:t xml:space="preserve">Utter Buzz</w:t>
+        </w:r>
+      </w:hyperlink>
+      <w:r>
+        <w:t xml:space="preserve">)</w:t>
+      </w:r>
+    </w:p>
+    <w:p>
+      <w:pPr>
+        <w:numPr>
+          <w:ilvl w:val="0"/>
+          <w:numId w:val="1"/>
+        </w:numPr>
+      </w:pPr>
+      <w:r>
+        <w:rPr>
+          <w:b/>
+        </w:rPr>
+        <w:t xml:space="preserve">December 2016</w:t>
+      </w:r>
+      <w:r>
+        <w:t xml:space="preserve"> — eMeals + Instacart (</w:t>
+      </w:r>
+      <w:hyperlink r:id="rHl109">
+        <w:r>
+          <w:rPr>
+            <w:rStyle w:val="Hyperlink"/>
+          </w:rPr>
+          <w:t xml:space="preserve">PRWeb</w:t>
+        </w:r>
+      </w:hyperlink>
+      <w:r>
+        <w:t xml:space="preserve">)</w:t>
+      </w:r>
+    </w:p>
+    <w:p>
+      <w:pPr>
+        <w:numPr>
+          <w:ilvl w:val="0"/>
+          <w:numId w:val="1"/>
+        </w:numPr>
+      </w:pPr>
+      <w:r>
+        <w:rPr>
+          <w:b/>
+        </w:rPr>
+        <w:t xml:space="preserve">March 2019</w:t>
+      </w:r>
+      <w:r>
+        <w:t xml:space="preserve"> — Chicory cut recipe-to-retailer-cart to </w:t>
+      </w:r>
+      <w:r>
+        <w:rPr>
+          <w:b/>
+        </w:rPr>
+        <w:t xml:space="preserve">two clicks across 60+ retailers</w:t>
+      </w:r>
+      <w:r>
+        <w:t xml:space="preserve"> (</w:t>
+      </w:r>
+      <w:hyperlink r:id="rHl110">
+        <w:r>
+          <w:rPr>
+            <w:rStyle w:val="Hyperlink"/>
+          </w:rPr>
+          <w:t xml:space="preserve">PRNewswire</w:t>
+        </w:r>
+      </w:hyperlink>
+      <w:r>
+        <w:t xml:space="preserve">)</w:t>
+      </w:r>
+    </w:p>
+    <w:p>
+      <w:r>
+        <w:rPr>
+          <w:b/>
+        </w:rPr>
+        <w:t xml:space="preserve">Diet and nutrient assessment:</w:t>
+      </w:r>
+      <w:r>
+        <w:t xml:space="preserve"> USDA FoodData Central has been public for years; Mifflin-St Jeor has been the standard BMR equation since 1990; Cronometer has tracked ~84 micronutrients for over a decade. None of this needed a model.</w:t>
+      </w:r>
+    </w:p>
+    <w:p>
+      <w:r>
+        <w:rPr>
+          <w:b/>
+        </w:rPr>
+        <w:t xml:space="preserve">Allergy exclusion and preferences:</w:t>
+      </w:r>
+      <w:r>
+        <w:t xml:space="preserve"> Mealime shipped </w:t>
+      </w:r>
+      <w:r>
+        <w:rPr>
+          <w:b/>
+        </w:rPr>
+        <w:t xml:space="preserve">200+ personalization options</w:t>
+      </w:r>
+      <w:r>
+        <w:t xml:space="preserve"> including allergens and disliked ingredients — as rules, pre-LLM (</w:t>
+      </w:r>
+      <w:hyperlink r:id="rHl111">
+        <w:r>
+          <w:rPr>
+            <w:rStyle w:val="Hyperlink"/>
+          </w:rPr>
+          <w:t xml:space="preserve">mealime.com</w:t>
+        </w:r>
+      </w:hyperlink>
+      <w:r>
+        <w:t xml:space="preserve">).</w:t>
+      </w:r>
+    </w:p>
+    <w:p>
+      <w:r>
+        <w:rPr>
+          <w:b/>
+        </w:rPr>
+        <w:t xml:space="preserve">Recipe selection to macro targets:</w:t>
+      </w:r>
+      <w:r>
+        <w:t xml:space="preserve"> Eat This Much has auto-generated plans to macro targets since 2013.</w:t>
+      </w:r>
+    </w:p>
+    <w:p>
+      <w:r>
+        <w:rPr>
+          <w:b/>
+        </w:rPr>
+        <w:t xml:space="preserve">And the bundle exists today, sold by the incumbent:</w:t>
+      </w:r>
+      <w:r>
+        <w:t xml:space="preserve"> MyFitnessPal's </w:t>
+      </w:r>
+      <w:r>
+        <w:rPr>
+          <w:b/>
+        </w:rPr>
+        <w:t xml:space="preserve">Premium+</w:t>
+      </w:r>
+      <w:r>
+        <w:t xml:space="preserve"> advertises "personalized meal plans, integrated grocery delivery" with automatic grocery lists — reportedly Instacart, Walmart+ and Amazon Fresh — at the same $19.99/month this project proposes (</w:t>
+      </w:r>
+      <w:hyperlink r:id="rHl21">
+        <w:r>
+          <w:rPr>
+            <w:rStyle w:val="Hyperlink"/>
+          </w:rPr>
+          <w:t xml:space="preserve">App Store listing</w:t>
+        </w:r>
+      </w:hyperlink>
+      <w:r>
+        <w:t xml:space="preserve">). They also bought the meal-planning app </w:t>
+      </w:r>
+      <w:r>
+        <w:rPr>
+          <w:b/>
+        </w:rPr>
+        <w:t xml:space="preserve">Intent</w:t>
+      </w:r>
+      <w:r>
+        <w:t xml:space="preserve"> (2025), integrated with </w:t>
+      </w:r>
+      <w:r>
+        <w:rPr>
+          <w:b/>
+        </w:rPr>
+        <w:t xml:space="preserve">ChatGPT Health</w:t>
+      </w:r>
+      <w:r>
+        <w:t xml:space="preserve"> (Jan 2026), and bought </w:t>
+      </w:r>
+      <w:r>
+        <w:rPr>
+          <w:b/>
+        </w:rPr>
+        <w:t xml:space="preserve">Cal AI</w:t>
+      </w:r>
+      <w:r>
+        <w:t xml:space="preserve"> (Dec 2025). </w:t>
+      </w:r>
+      <w:r>
+        <w:rPr>
+          <w:rFonts w:ascii="Consolas" w:hAnsi="Consolas"/>
+        </w:rPr>
+        <w:t xml:space="preserve">[Retailer names and tier boundaries are from secondary sources — MyFitnessPal's own support page returned 403]</w:t>
+      </w:r>
+    </w:p>
+    <w:p>
+      <w:r>
+        <w:rPr>
+          <w:b/>
+        </w:rPr>
+        <w:t xml:space="preserve">The strong form of this argument:</w:t>
+      </w:r>
+      <w:r>
+        <w:t xml:space="preserve"> every function in the claim has shipped before, several of them a decade ago, and the current market leader ships all of them together right now. "AI agent" is not the enabling condition — it's a new UI on a pipeline that has existed since 2016. The reason these products didn't win wasn't missing technology; it's that </w:t>
+      </w:r>
+      <w:r>
+        <w:rPr>
+          <w:b/>
+        </w:rPr>
+        <w:t xml:space="preserve">users abandon meal plans</w:t>
+      </w:r>
+      <w:r>
+        <w:t xml:space="preserve"> (Section 1: tracking consistency 68% → 21% by week 12), which no model fixes.</w:t>
+      </w:r>
+    </w:p>
+    <w:p>
+      <w:r>
+        <w:rPr>
+          <w:b/>
+        </w:rPr>
+        <w:t xml:space="preserve">Where this argument is weakest:</w:t>
+      </w:r>
+      <w:r>
+        <w:t xml:space="preserve"> it conflates *a button that exports a list* with *a system that reasons over unstructured constraints*. 2016 Eat This Much could export a list; it could not take "I'm on Zepbound, I hate mushrooms, my partner is vegetarian, keep it under $120, and I have 20 minutes a night" as input. Every pre-LLM system required the user to translate their life into a form. That translation step is where people quit.</w:t>
+      </w:r>
+    </w:p>
+    <w:p>
+      <w:pPr>
+        <w:pBdr>
+          <w:bottom w:val="single" w:sz="6" w:space="6" w:color="C9CCD1"/>
+        </w:pBdr>
+      </w:pPr>
+    </w:p>
+    <w:p>
+      <w:pPr>
+        <w:pStyle w:val="Heading1"/>
+      </w:pPr>
+      <w:r>
+        <w:t xml:space="preserve">Part 4 — Counterargument 2, argued at full strength</w:t>
+      </w:r>
+    </w:p>
+    <w:p>
+      <w:pPr>
+        <w:pStyle w:val="Heading2"/>
+      </w:pPr>
+      <w:r>
+        <w:rPr>
+          <w:b/>
+        </w:rPr>
+        <w:t xml:space="preserve">"This still is not possible."</w:t>
+      </w:r>
+    </w:p>
+    <w:p>
+      <w:r>
+        <w:rPr>
+          <w:b/>
+        </w:rPr>
+        <w:t xml:space="preserve">1. The checkout leg just failed in public.</w:t>
+      </w:r>
+      <w:r>
+        <w:t xml:space="preserve"> OpenAI pulled back Instant Checkout in March 2026 over wrong product data and an inability to handle </w:t>
+      </w:r>
+      <w:r>
+        <w:rPr>
+          <w:b/>
+        </w:rPr>
+        <w:t xml:space="preserve">multi-item carts</w:t>
+      </w:r>
+      <w:r>
+        <w:t xml:space="preserve"> — the defining property of a grocery order. A dozen live merchants out of millions. The industry's own conclusion was "buy on your own site." You would be building on a rail its own creator is retreating from.</w:t>
+      </w:r>
+    </w:p>
+    <w:p>
+      <w:r>
+        <w:rPr>
+          <w:b/>
+        </w:rPr>
+        <w:t xml:space="preserve">2. Reliability math doesn't clear the bar.</w:t>
+      </w:r>
+      <w:r>
+        <w:t xml:space="preserve"> A weekly grocery order with 25–40 line items, substitutions, sizes and units is a long-horizon task. τ-bench shows pass^8 collapsing below 25% where pass^1 is 61%. For a task users repeat weekly, the operative failure rate is compounded, not per-attempt. One wrong order — a $90 cart of the wrong things, or an allergen in the basket — ends the subscription.</w:t>
+      </w:r>
+    </w:p>
+    <w:p>
+      <w:r>
+        <w:rPr>
+          <w:b/>
+        </w:rPr>
+        <w:t xml:space="preserve">3. The safety-critical pillar can't be delegated to the model.</w:t>
+      </w:r>
+      <w:r>
+        <w:t xml:space="preserve"> 5–13% unsafe response rates, a documented life-threatening pediatric allergen error, and fabricated sources in 60% of citations. For allergy exclusion you need a deterministic guarantee, and an LLM is the wrong instrument. Any honest build ships rules for exclusion and uses AI only for suggestion — at which point "the AI agent compiles the features" is no longer the description of the product.</w:t>
+      </w:r>
+    </w:p>
+    <w:p>
+      <w:r>
+        <w:rPr>
+          <w:b/>
+        </w:rPr>
+        <w:t xml:space="preserve">4. Nutrition estimation is not accurate enough to anchor a plan.</w:t>
+      </w:r>
+      <w:r>
+        <w:t xml:space="preserve"> The same 2025 research cited in favor concludes these models </w:t>
+      </w:r>
+      <w:r>
+        <w:rPr>
+          <w:b/>
+        </w:rPr>
+        <w:t xml:space="preserve">systematically underestimate large portions</w:t>
+      </w:r>
+      <w:r>
+        <w:t xml:space="preserve"> and vary widely on macros, making them unsuitable where quantification matters (</w:t>
+      </w:r>
+      <w:hyperlink r:id="rHl34">
+        <w:r>
+          <w:rPr>
+            <w:rStyle w:val="Hyperlink"/>
+          </w:rPr>
+          <w:t xml:space="preserve">PubMed</w:t>
+        </w:r>
+      </w:hyperlink>
+      <w:r>
+        <w:t xml:space="preserve">).</w:t>
+      </w:r>
+    </w:p>
+    <w:p>
+      <w:r>
+        <w:rPr>
+          <w:b/>
+        </w:rPr>
+        <w:t xml:space="preserve">5. Access is granted, not guaranteed.</w:t>
+      </w:r>
+      <w:r>
+        <w:t xml:space="preserve"> Amazon sued Perplexity and won an injunction before losing it on appeal; Amazon is still fighting, and has said it prefers negotiated partnerships. Retailer catalogs are behind terms of service that can change. An agent-scraping strategy is a legal dependency, not an architecture.</w:t>
+      </w:r>
+    </w:p>
+    <w:p>
+      <w:r>
+        <w:rPr>
+          <w:b/>
+        </w:rPr>
+        <w:t xml:space="preserve">6. The physical layer fails regardless.</w:t>
+      </w:r>
+      <w:r>
+        <w:t xml:space="preserve"> Instacart's 1.2★ substitution problem is a human-and-logistics failure that no agent improves.</w:t>
+      </w:r>
+    </w:p>
+    <w:p>
+      <w:r>
+        <w:rPr>
+          <w:b/>
+        </w:rPr>
+        <w:t xml:space="preserve">Where this argument is weakest:</w:t>
+      </w:r>
+      <w:r>
+        <w:t xml:space="preserve"> it judges the *general-purpose autonomous* agent, not the *narrow, structured* integration. Nothing here says a nutrition app can't call the Instacart Developer Platform's documented cart API with a validated product list. That path doesn't require an agent to browse a website at all — it requires an API call. Counterargument 2 defeats "an autonomous agent shops for you"; it does not defeat "an app builds a validated cart through a partner API."</w:t>
+      </w:r>
+    </w:p>
+    <w:p>
+      <w:pPr>
+        <w:pBdr>
+          <w:bottom w:val="single" w:sz="6" w:space="6" w:color="C9CCD1"/>
+        </w:pBdr>
+      </w:pPr>
+    </w:p>
+    <w:p>
+      <w:pPr>
+        <w:pStyle w:val="Heading1"/>
+      </w:pPr>
+      <w:r>
+        <w:t xml:space="preserve">Part 5 — What survives</w:t>
+      </w:r>
+    </w:p>
+    <w:p>
+      <w:r>
+        <w:t xml:space="preserve">The original claim fails on two counts: the pillars aren't new (Part 3), and the agentic-execution premise is weaker now than it was six months ago (Part 4).</w:t>
+      </w:r>
+    </w:p>
+    <w:p>
+      <w:r>
+        <w:rPr>
+          <w:b/>
+        </w:rPr>
+        <w:t xml:space="preserve">Here is the version that survives all the evidence above:</w:t>
+      </w:r>
+    </w:p>
+    <w:p>
+      <w:pPr>
+        <w:ind w:left="360"/>
+        <w:pBdr>
+          <w:left w:val="single" w:sz="18" w:space="8" w:color="9AA0A6"/>
+        </w:pBdr>
+      </w:pPr>
+      <w:r>
+        <w:t xml:space="preserve">Not newly *possible* — newly </w:t>
+      </w:r>
+      <w:r>
+        <w:rPr>
+          <w:b/>
+        </w:rPr>
+        <w:t xml:space="preserve">cheap, personal and low-friction</w:t>
+      </w:r>
+      <w:r>
+        <w:t xml:space="preserve">. Four things changed between 2021 and 2026: (1) nutrition can be captured from a </w:t>
+      </w:r>
+      <w:r>
+        <w:rPr>
+          <w:b/>
+        </w:rPr>
+        <w:t xml:space="preserve">photo</w:t>
+      </w:r>
+      <w:r>
+        <w:t xml:space="preserve"> instead of a search box, which removed the logging burden that killed adherence — proven commercially by Cal AI's $40M in 18 months; (2) a user's constraints can be expressed in </w:t>
+      </w:r>
+      <w:r>
+        <w:rPr>
+          <w:b/>
+        </w:rPr>
+        <w:t xml:space="preserve">plain language</w:t>
+      </w:r>
+      <w:r>
+        <w:t xml:space="preserve"> rather than forms and toggles; (3) grocery carts became </w:t>
+      </w:r>
+      <w:r>
+        <w:rPr>
+          <w:b/>
+        </w:rPr>
+        <w:t xml:space="preserve">documented APIs</w:t>
+      </w:r>
+      <w:r>
+        <w:t xml:space="preserve"> (Instacart Developer Platform, March 2024) rather than integrations you had to negotiate; and (4) </w:t>
+      </w:r>
+      <w:r>
+        <w:rPr>
+          <w:b/>
+        </w:rPr>
+        <w:t xml:space="preserve">25% of consumers already use AI to build grocery lists</w:t>
+      </w:r>
+      <w:r>
+        <w:t xml:space="preserve">, so the behavior no longer needs to be taught. What has *not* changed is that the ordering step must be a validated API call with human confirmation, and that allergen exclusion must be deterministic — not agentic.</w:t>
+      </w:r>
+    </w:p>
+    <w:p>
+      <w:r>
+        <w:t xml:space="preserve">That framing is defensible in front of someone who has read the same research. The original is not.</w:t>
+      </w:r>
+    </w:p>
+    <w:p>
+      <w:pPr>
+        <w:pStyle w:val="Heading2"/>
+      </w:pPr>
+      <w:r>
+        <w:t xml:space="preserve">Four tests that would falsify this — run them before building</w:t>
+      </w:r>
+    </w:p>
+    <w:p>
+      <w:r>
+        <w:t xml:space="preserve">1. </w:t>
+      </w:r>
+      <w:r>
+        <w:rPr>
+          <w:b/>
+        </w:rPr>
+        <w:t xml:space="preserve">Cart-accuracy test.</w:t>
+      </w:r>
+      <w:r>
+        <w:t xml:space="preserve"> Take 20 real meal plans, have the system build carts, and count line-item errors (wrong size, wrong product, missed substitution). If accuracy is below ~95%, the claimed automation isn't there. This is precisely where OpenAI's Instant Checkout failed.</w:t>
+      </w:r>
+    </w:p>
+    <w:p>
+      <w:r>
+        <w:t xml:space="preserve">2. </w:t>
+      </w:r>
+      <w:r>
+        <w:rPr>
+          <w:b/>
+        </w:rPr>
+        <w:t xml:space="preserve">Allergen red-team.</w:t>
+      </w:r>
+      <w:r>
+        <w:t xml:space="preserve"> 100 plans for users with an uncommon allergy (cilantro, alpha-gal, low-histamine). Any single leak is a product-defining failure, and the literature predicts leaks.</w:t>
+      </w:r>
+    </w:p>
+    <w:p>
+      <w:r>
+        <w:t xml:space="preserve">3. </w:t>
+      </w:r>
+      <w:r>
+        <w:rPr>
+          <w:b/>
+        </w:rPr>
+        <w:t xml:space="preserve">pass^k test, not pass^1.</w:t>
+      </w:r>
+      <w:r>
+        <w:t xml:space="preserve"> Run the same weekly order 8 times. Report pass^8. That number, not a demo, is the product.</w:t>
+      </w:r>
+    </w:p>
+    <w:p>
+      <w:r>
+        <w:t xml:space="preserve">4. </w:t>
+      </w:r>
+      <w:r>
+        <w:rPr>
+          <w:b/>
+        </w:rPr>
+        <w:t xml:space="preserve">Differentiation test.</w:t>
+      </w:r>
+      <w:r>
+        <w:t xml:space="preserve"> Have five people run the same week through MyFitnessPal Premium+ ($19.99, already shipping the same bundle) and through a ChatGPT + Instacart app conversation (free). If neither is meaningfully worse, the market gap is positioning, not capability.</w:t>
+      </w:r>
+    </w:p>
+    <w:p>
+      <w:pPr>
+        <w:pBdr>
+          <w:bottom w:val="single" w:sz="6" w:space="6" w:color="C9CCD1"/>
+        </w:pBdr>
+      </w:pPr>
+    </w:p>
+    <w:p>
+      <w:pPr>
+        <w:pStyle w:val="Heading1"/>
+      </w:pPr>
+      <w:r>
+        <w:t xml:space="preserve">Flags</w:t>
+      </w:r>
+    </w:p>
+    <w:tbl>
+      <w:tblPr>
+        <w:tblW w:w="10080" w:type="dxa"/>
+        <w:tblBorders>
+          <w:top w:val="single" w:sz="4" w:space="0" w:color="C9CCD1"/>
+          <w:left w:val="single" w:sz="4" w:space="0" w:color="C9CCD1"/>
+          <w:bottom w:val="single" w:sz="4" w:space="0" w:color="C9CCD1"/>
+          <w:right w:val="single" w:sz="4" w:space="0" w:color="C9CCD1"/>
+          <w:insideH w:val="single" w:sz="4" w:space="0" w:color="C9CCD1"/>
+          <w:insideV w:val="single" w:sz="4" w:space="0" w:color="C9CCD1"/>
+        </w:tblBorders>
+        <w:tblLayout w:type="fixed"/>
+      </w:tblPr>
+      <w:tblGrid>
+        <w:gridCol w:w="5040"/>
+        <w:gridCol w:w="5040"/>
+      </w:tblGrid>
+      <w:tr>
+        <w:trPr>
+          <w:tblHeader/>
+        </w:trPr>
+        <w:tc>
+          <w:tcPr>
+            <w:tcW w:w="5040" w:type="dxa"/>
+            <w:shd w:val="clear" w:color="auto" w:fill="EFF1F3"/>
+          </w:tcPr>
+          <w:p>
+            <w:pPr>
+              <w:spacing w:before="40" w:after="40"/>
+            </w:pPr>
+            <w:r>
+              <w:rPr>
+                <w:b/>
+                <w:sz w:val="18"/>
+              </w:rPr>
+              <w:t xml:space="preserve">Item</w:t>
+            </w:r>
+          </w:p>
+        </w:tc>
+        <w:tc>
+          <w:tcPr>
+            <w:tcW w:w="5040" w:type="dxa"/>
+            <w:shd w:val="clear" w:color="auto" w:fill="EFF1F3"/>
+          </w:tcPr>
+          <w:p>
+            <w:pPr>
+              <w:spacing w:before="40" w:after="40"/>
+            </w:pPr>
+            <w:r>
+              <w:rPr>
+                <w:b/>
+                <w:sz w:val="18"/>
+              </w:rPr>
+              <w:t xml:space="preserve">Status</w:t>
+            </w:r>
+          </w:p>
+        </w:tc>
+      </w:tr>
+      <w:tr>
+        <w:tc>
+          <w:tcPr>
+            <w:tcW w:w="5040" w:type="dxa"/>
+          </w:tcPr>
+          <w:p>
+            <w:pPr>
+              <w:spacing w:before="40" w:after="40"/>
+            </w:pPr>
+            <w:r>
+              <w:rPr>
+                <w:sz w:val="18"/>
+              </w:rPr>
+              <w:t xml:space="preserve">WebArena / OSWorld scores (74–86%)</w:t>
+            </w:r>
+          </w:p>
+        </w:tc>
+        <w:tc>
+          <w:tcPr>
+            <w:tcW w:w="5040" w:type="dxa"/>
+          </w:tcPr>
+          <w:p>
+            <w:pPr>
+              <w:spacing w:before="40" w:after="40"/>
+            </w:pPr>
+            <w:r>
+              <w:rPr>
+                <w:rFonts w:ascii="Consolas" w:hAnsi="Consolas"/>
+                <w:sz w:val="18"/>
+              </w:rPr>
+              <w:t xml:space="preserve">[UNVERIFIED]</w:t>
+            </w:r>
+            <w:r>
+              <w:rPr>
+                <w:sz w:val="18"/>
+              </w:rPr>
+              <w:t xml:space="preserve"> — third-party leaderboard aggregator; original benchmark authors publish lower and non-comparable figures. Treat direction, not level.</w:t>
+            </w:r>
+          </w:p>
+        </w:tc>
+      </w:tr>
+      <w:tr>
+        <w:tc>
+          <w:tcPr>
+            <w:tcW w:w="5040" w:type="dxa"/>
+          </w:tcPr>
+          <w:p>
+            <w:pPr>
+              <w:spacing w:before="40" w:after="40"/>
+            </w:pPr>
+            <w:r>
+              <w:rPr>
+                <w:sz w:val="18"/>
+              </w:rPr>
+              <w:t xml:space="preserve">MyFitnessPal Premium+ retailer list &amp; tier boundary</w:t>
+            </w:r>
+          </w:p>
+        </w:tc>
+        <w:tc>
+          <w:tcPr>
+            <w:tcW w:w="5040" w:type="dxa"/>
+          </w:tcPr>
+          <w:p>
+            <w:pPr>
+              <w:spacing w:before="40" w:after="40"/>
+            </w:pPr>
+            <w:r>
+              <w:rPr>
+                <w:rFonts w:ascii="Consolas" w:hAnsi="Consolas"/>
+                <w:sz w:val="18"/>
+              </w:rPr>
+              <w:t xml:space="preserve">[UNVERIFIED]</w:t>
+            </w:r>
+            <w:r>
+              <w:rPr>
+                <w:sz w:val="18"/>
+              </w:rPr>
+              <w:t xml:space="preserve"> — MyFitnessPal's own support page returns 403; Apple's listing confirms "integrated grocery delivery" and names Premium Plus, but not the retailers. </w:t>
+            </w:r>
+            <w:r>
+              <w:rPr>
+                <w:b/>
+                <w:sz w:val="18"/>
+              </w:rPr>
+              <w:t xml:space="preserve">This also corrects Section 3, which recorded Premium+ as unverified — Apple's listing names it.</w:t>
+            </w:r>
+          </w:p>
+        </w:tc>
+      </w:tr>
+      <w:tr>
+        <w:tc>
+          <w:tcPr>
+            <w:tcW w:w="5040" w:type="dxa"/>
+          </w:tcPr>
+          <w:p>
+            <w:pPr>
+              <w:spacing w:before="40" w:after="40"/>
+            </w:pPr>
+            <w:r>
+              <w:rPr>
+                <w:sz w:val="18"/>
+              </w:rPr>
+              <w:t xml:space="preserve">Walmart "ended" its Instant Checkout partnership</w:t>
+            </w:r>
+          </w:p>
+        </w:tc>
+        <w:tc>
+          <w:tcPr>
+            <w:tcW w:w="5040" w:type="dxa"/>
+          </w:tcPr>
+          <w:p>
+            <w:pPr>
+              <w:spacing w:before="40" w:after="40"/>
+            </w:pPr>
+            <w:r>
+              <w:rPr>
+                <w:rFonts w:ascii="Consolas" w:hAnsi="Consolas"/>
+                <w:sz w:val="18"/>
+              </w:rPr>
+              <w:t xml:space="preserve">[UNVERIFIED]</w:t>
+            </w:r>
+            <w:r>
+              <w:rPr>
+                <w:sz w:val="18"/>
+              </w:rPr>
+              <w:t xml:space="preserve"> — one secondary outlet says ended; primary coverage describes OpenAI scaling the feature back while Walmart moved to a Sparky app inside ChatGPT. Treat as "restructured," not "terminated."</w:t>
+            </w:r>
+          </w:p>
+        </w:tc>
+      </w:tr>
+      <w:tr>
+        <w:tc>
+          <w:tcPr>
+            <w:tcW w:w="5040" w:type="dxa"/>
+          </w:tcPr>
+          <w:p>
+            <w:pPr>
+              <w:spacing w:before="40" w:after="40"/>
+            </w:pPr>
+            <w:r>
+              <w:rPr>
+                <w:sz w:val="18"/>
+              </w:rPr>
+              <w:t xml:space="preserve">Sparky's +60% QoQ and +40% basket figures</w:t>
+            </w:r>
+          </w:p>
+        </w:tc>
+        <w:tc>
+          <w:tcPr>
+            <w:tcW w:w="5040" w:type="dxa"/>
+          </w:tcPr>
+          <w:p>
+            <w:pPr>
+              <w:spacing w:before="40" w:after="40"/>
+            </w:pPr>
+            <w:r>
+              <w:rPr>
+                <w:sz w:val="18"/>
+              </w:rPr>
+              <w:t xml:space="preserve">⚠️ Company-reported via analyst coverage, not an SEC filing.</w:t>
+            </w:r>
+          </w:p>
+        </w:tc>
+      </w:tr>
+      <w:tr>
+        <w:tc>
+          <w:tcPr>
+            <w:tcW w:w="5040" w:type="dxa"/>
+          </w:tcPr>
+          <w:p>
+            <w:pPr>
+              <w:spacing w:before="40" w:after="40"/>
+            </w:pPr>
+            <w:r>
+              <w:rPr>
+                <w:sz w:val="18"/>
+              </w:rPr>
+              <w:t xml:space="preserve">MorganMyers Food Pulse (25% grocery-list figure)</w:t>
+            </w:r>
+          </w:p>
+        </w:tc>
+        <w:tc>
+          <w:tcPr>
+            <w:tcW w:w="5040" w:type="dxa"/>
+          </w:tcPr>
+          <w:p>
+            <w:pPr>
+              <w:spacing w:before="40" w:after="40"/>
+            </w:pPr>
+            <w:r>
+              <w:rPr>
+                <w:sz w:val="18"/>
+              </w:rPr>
+              <w:t xml:space="preserve">⚠️ n=366, ±5% margin — small sample, marketing-industry survey.</w:t>
+            </w:r>
+          </w:p>
+        </w:tc>
+      </w:tr>
+      <w:tr>
+        <w:tc>
+          <w:tcPr>
+            <w:tcW w:w="5040" w:type="dxa"/>
+          </w:tcPr>
+          <w:p>
+            <w:pPr>
+              <w:spacing w:before="40" w:after="40"/>
+            </w:pPr>
+            <w:r>
+              <w:rPr>
+                <w:sz w:val="18"/>
+              </w:rPr>
+              <w:t xml:space="preserve">Adobe AI-traffic figures</w:t>
+            </w:r>
+          </w:p>
+        </w:tc>
+        <w:tc>
+          <w:tcPr>
+            <w:tcW w:w="5040" w:type="dxa"/>
+          </w:tcPr>
+          <w:p>
+            <w:pPr>
+              <w:spacing w:before="40" w:after="40"/>
+            </w:pPr>
+            <w:r>
+              <w:rPr>
+                <w:sz w:val="18"/>
+              </w:rPr>
+              <w:t xml:space="preserve">⚠️ Vendor analytics on its own customer base, not a census of retail.</w:t>
+            </w:r>
+          </w:p>
+        </w:tc>
+      </w:tr>
+      <w:tr>
+        <w:tc>
+          <w:tcPr>
+            <w:tcW w:w="5040" w:type="dxa"/>
+          </w:tcPr>
+          <w:p>
+            <w:pPr>
+              <w:spacing w:before="40" w:after="40"/>
+            </w:pPr>
+            <w:r>
+              <w:rPr>
+                <w:sz w:val="18"/>
+              </w:rPr>
+              <w:t xml:space="preserve">Reddit / G2</w:t>
+            </w:r>
+          </w:p>
+        </w:tc>
+        <w:tc>
+          <w:tcPr>
+            <w:tcW w:w="5040" w:type="dxa"/>
+          </w:tcPr>
+          <w:p>
+            <w:pPr>
+              <w:spacing w:before="40" w:after="40"/>
+            </w:pPr>
+            <w:r>
+              <w:rPr>
+                <w:sz w:val="18"/>
+              </w:rPr>
+              <w:t xml:space="preserve">❌ Still blocked; no community sentiment on agentic grocery ordering is included.</w:t>
+            </w:r>
+          </w:p>
+        </w:tc>
+      </w:tr>
+      <w:tr>
+        <w:tc>
+          <w:tcPr>
+            <w:tcW w:w="5040" w:type="dxa"/>
+          </w:tcPr>
+          <w:p>
+            <w:pPr>
+              <w:spacing w:before="40" w:after="40"/>
+            </w:pPr>
+            <w:r>
+              <w:rPr>
+                <w:sz w:val="18"/>
+              </w:rPr>
+              <w:t xml:space="preserve">τ-bench figures</w:t>
+            </w:r>
+          </w:p>
+        </w:tc>
+        <w:tc>
+          <w:tcPr>
+            <w:tcW w:w="5040" w:type="dxa"/>
+          </w:tcPr>
+          <w:p>
+            <w:pPr>
+              <w:spacing w:before="40" w:after="40"/>
+            </w:pPr>
+            <w:r>
+              <w:rPr>
+                <w:sz w:val="18"/>
+              </w:rPr>
+              <w:t xml:space="preserve">⚠️ Retail/airline customer-service domains, not grocery. Directionally applicable, not a grocery measurement.</w:t>
             </w:r>
           </w:p>
         </w:tc>

</xml_diff>